<commit_message>
add 20260320 Internship Report
</commit_message>
<xml_diff>
--- a/周子用-實習報告.docx
+++ b/周子用-實習報告.docx
@@ -1610,7 +1610,13 @@
               <w:ind w:left="360"/>
             </w:pPr>
             <w:r>
-              <w:t xml:space="preserve">Task Assignment to learn DDD, </w:t>
+              <w:t>Task Assignment to learn D</w:t>
+            </w:r>
+            <w:r>
+              <w:t>omain Driven Design</w:t>
+            </w:r>
+            <w:r>
+              <w:t xml:space="preserve">, </w:t>
             </w:r>
             <w:r>
               <w:t>GitHub</w:t>
@@ -1821,10 +1827,7 @@
               <w:ind w:left="360"/>
             </w:pPr>
             <w:r>
-              <w:t xml:space="preserve">Join the In-class session course, learning the </w:t>
-            </w:r>
-            <w:r>
-              <w:t xml:space="preserve">GitHub Implementation and ABP Framework </w:t>
+              <w:t xml:space="preserve">Join the In-class session course, learning the GitHub Implementation and ABP Framework </w:t>
             </w:r>
           </w:p>
           <w:p>
@@ -1899,6 +1902,493 @@
             </w:r>
             <w:r>
               <w:t>20</w:t>
+            </w:r>
+          </w:p>
+        </w:tc>
+        <w:tc>
+          <w:tcPr>
+            <w:tcW w:w="0" w:type="auto"/>
+            <w:vAlign w:val="center"/>
+          </w:tcPr>
+          <w:p>
+            <w:pPr>
+              <w:jc w:val="center"/>
+            </w:pPr>
+            <w:r>
+              <w:rPr>
+                <w:rFonts w:hint="eastAsia"/>
+              </w:rPr>
+              <w:t>(</w:t>
+            </w:r>
+            <w:r>
+              <w:rPr>
+                <w:rFonts w:hint="eastAsia"/>
+              </w:rPr>
+              <w:t>五</w:t>
+            </w:r>
+            <w:r>
+              <w:rPr>
+                <w:rFonts w:hint="eastAsia"/>
+              </w:rPr>
+              <w:t>)</w:t>
+            </w:r>
+          </w:p>
+        </w:tc>
+        <w:tc>
+          <w:tcPr>
+            <w:tcW w:w="0" w:type="auto"/>
+          </w:tcPr>
+          <w:p>
+            <w:pPr>
+              <w:pStyle w:val="ListParagraph"/>
+              <w:numPr>
+                <w:ilvl w:val="0"/>
+                <w:numId w:val="1"/>
+              </w:numPr>
+              <w:ind w:left="360"/>
+            </w:pPr>
+            <w:r>
+              <w:t>Continue to self-l</w:t>
+            </w:r>
+            <w:r>
+              <w:rPr>
+                <w:rFonts w:hint="eastAsia"/>
+              </w:rPr>
+              <w:t>ea</w:t>
+            </w:r>
+            <w:r>
+              <w:t>rn Data Seeding Implementation with ABP Framewor</w:t>
+            </w:r>
+            <w:r>
+              <w:t>k, adding some feature to seed data from imported csv file from the UI</w:t>
+            </w:r>
+            <w:r>
+              <w:t>.</w:t>
+            </w:r>
+          </w:p>
+          <w:p>
+            <w:pPr>
+              <w:pStyle w:val="ListParagraph"/>
+              <w:numPr>
+                <w:ilvl w:val="0"/>
+                <w:numId w:val="1"/>
+              </w:numPr>
+              <w:ind w:left="360"/>
+            </w:pPr>
+            <w:r>
+              <w:t>Learn GitHub Pull Request and D</w:t>
+            </w:r>
+            <w:r>
+              <w:t>omain Driven Design</w:t>
+            </w:r>
+            <w:r>
+              <w:t>.</w:t>
+            </w:r>
+          </w:p>
+        </w:tc>
+      </w:tr>
+      <w:tr>
+        <w:tc>
+          <w:tcPr>
+            <w:tcW w:w="0" w:type="auto"/>
+            <w:vMerge w:val="restart"/>
+            <w:vAlign w:val="center"/>
+          </w:tcPr>
+          <w:p>
+            <w:pPr>
+              <w:jc w:val="center"/>
+            </w:pPr>
+            <w:r>
+              <w:rPr>
+                <w:rFonts w:hint="eastAsia"/>
+              </w:rPr>
+              <w:t>四</w:t>
+            </w:r>
+          </w:p>
+        </w:tc>
+        <w:tc>
+          <w:tcPr>
+            <w:tcW w:w="0" w:type="auto"/>
+            <w:vAlign w:val="center"/>
+          </w:tcPr>
+          <w:p>
+            <w:pPr>
+              <w:jc w:val="center"/>
+            </w:pPr>
+            <w:r>
+              <w:t>2026</w:t>
+            </w:r>
+            <w:r>
+              <w:rPr>
+                <w:rFonts w:hint="eastAsia"/>
+              </w:rPr>
+              <w:t>/</w:t>
+            </w:r>
+            <w:r>
+              <w:t>03</w:t>
+            </w:r>
+            <w:r>
+              <w:rPr>
+                <w:rFonts w:hint="eastAsia"/>
+              </w:rPr>
+              <w:t>/</w:t>
+            </w:r>
+            <w:r>
+              <w:t>23</w:t>
+            </w:r>
+          </w:p>
+        </w:tc>
+        <w:tc>
+          <w:tcPr>
+            <w:tcW w:w="0" w:type="auto"/>
+            <w:vAlign w:val="center"/>
+          </w:tcPr>
+          <w:p>
+            <w:pPr>
+              <w:jc w:val="center"/>
+            </w:pPr>
+            <w:r>
+              <w:t>(</w:t>
+            </w:r>
+            <w:r>
+              <w:rPr>
+                <w:rFonts w:hint="eastAsia"/>
+              </w:rPr>
+              <w:t>一</w:t>
+            </w:r>
+            <w:r>
+              <w:t>)</w:t>
+            </w:r>
+          </w:p>
+        </w:tc>
+        <w:tc>
+          <w:tcPr>
+            <w:tcW w:w="0" w:type="auto"/>
+          </w:tcPr>
+          <w:p>
+            <w:pPr>
+              <w:pStyle w:val="ListParagraph"/>
+              <w:numPr>
+                <w:ilvl w:val="0"/>
+                <w:numId w:val="1"/>
+              </w:numPr>
+              <w:ind w:left="360"/>
+            </w:pPr>
+          </w:p>
+        </w:tc>
+      </w:tr>
+      <w:tr>
+        <w:tc>
+          <w:tcPr>
+            <w:tcW w:w="0" w:type="auto"/>
+            <w:vMerge/>
+            <w:vAlign w:val="center"/>
+          </w:tcPr>
+          <w:p>
+            <w:pPr>
+              <w:jc w:val="center"/>
+            </w:pPr>
+          </w:p>
+        </w:tc>
+        <w:tc>
+          <w:tcPr>
+            <w:tcW w:w="0" w:type="auto"/>
+            <w:vAlign w:val="center"/>
+          </w:tcPr>
+          <w:p>
+            <w:pPr>
+              <w:jc w:val="center"/>
+            </w:pPr>
+            <w:r>
+              <w:t>2026</w:t>
+            </w:r>
+            <w:r>
+              <w:rPr>
+                <w:rFonts w:hint="eastAsia"/>
+              </w:rPr>
+              <w:t>/</w:t>
+            </w:r>
+            <w:r>
+              <w:t>03</w:t>
+            </w:r>
+            <w:r>
+              <w:rPr>
+                <w:rFonts w:hint="eastAsia"/>
+              </w:rPr>
+              <w:t>/</w:t>
+            </w:r>
+            <w:r>
+              <w:t>24</w:t>
+            </w:r>
+          </w:p>
+        </w:tc>
+        <w:tc>
+          <w:tcPr>
+            <w:tcW w:w="0" w:type="auto"/>
+            <w:vAlign w:val="center"/>
+          </w:tcPr>
+          <w:p>
+            <w:pPr>
+              <w:jc w:val="center"/>
+            </w:pPr>
+            <w:r>
+              <w:rPr>
+                <w:rFonts w:hint="eastAsia"/>
+              </w:rPr>
+              <w:t>(</w:t>
+            </w:r>
+            <w:r>
+              <w:rPr>
+                <w:rFonts w:hint="eastAsia"/>
+              </w:rPr>
+              <w:t>二</w:t>
+            </w:r>
+            <w:r>
+              <w:rPr>
+                <w:rFonts w:hint="eastAsia"/>
+              </w:rPr>
+              <w:t>)</w:t>
+            </w:r>
+          </w:p>
+        </w:tc>
+        <w:tc>
+          <w:tcPr>
+            <w:tcW w:w="0" w:type="auto"/>
+          </w:tcPr>
+          <w:p>
+            <w:pPr>
+              <w:pStyle w:val="ListParagraph"/>
+              <w:numPr>
+                <w:ilvl w:val="0"/>
+                <w:numId w:val="1"/>
+              </w:numPr>
+              <w:ind w:left="360"/>
+            </w:pPr>
+          </w:p>
+        </w:tc>
+      </w:tr>
+      <w:tr>
+        <w:tc>
+          <w:tcPr>
+            <w:tcW w:w="0" w:type="auto"/>
+            <w:vMerge/>
+            <w:vAlign w:val="center"/>
+          </w:tcPr>
+          <w:p>
+            <w:pPr>
+              <w:jc w:val="center"/>
+            </w:pPr>
+          </w:p>
+        </w:tc>
+        <w:tc>
+          <w:tcPr>
+            <w:tcW w:w="0" w:type="auto"/>
+            <w:vAlign w:val="center"/>
+          </w:tcPr>
+          <w:p>
+            <w:pPr>
+              <w:jc w:val="center"/>
+            </w:pPr>
+            <w:r>
+              <w:t>2026</w:t>
+            </w:r>
+            <w:r>
+              <w:rPr>
+                <w:rFonts w:hint="eastAsia"/>
+              </w:rPr>
+              <w:t>/</w:t>
+            </w:r>
+            <w:r>
+              <w:t>03</w:t>
+            </w:r>
+            <w:r>
+              <w:rPr>
+                <w:rFonts w:hint="eastAsia"/>
+              </w:rPr>
+              <w:t>/</w:t>
+            </w:r>
+            <w:r>
+              <w:t>25</w:t>
+            </w:r>
+          </w:p>
+        </w:tc>
+        <w:tc>
+          <w:tcPr>
+            <w:tcW w:w="0" w:type="auto"/>
+            <w:vAlign w:val="center"/>
+          </w:tcPr>
+          <w:p>
+            <w:pPr>
+              <w:jc w:val="center"/>
+            </w:pPr>
+            <w:r>
+              <w:rPr>
+                <w:rFonts w:hint="eastAsia"/>
+              </w:rPr>
+              <w:t>(</w:t>
+            </w:r>
+            <w:r>
+              <w:rPr>
+                <w:rFonts w:hint="eastAsia"/>
+              </w:rPr>
+              <w:t>三</w:t>
+            </w:r>
+            <w:r>
+              <w:rPr>
+                <w:rFonts w:hint="eastAsia"/>
+              </w:rPr>
+              <w:t>)</w:t>
+            </w:r>
+          </w:p>
+        </w:tc>
+        <w:tc>
+          <w:tcPr>
+            <w:tcW w:w="0" w:type="auto"/>
+          </w:tcPr>
+          <w:p>
+            <w:pPr>
+              <w:pStyle w:val="ListParagraph"/>
+              <w:numPr>
+                <w:ilvl w:val="0"/>
+                <w:numId w:val="1"/>
+              </w:numPr>
+              <w:ind w:left="360"/>
+            </w:pPr>
+          </w:p>
+        </w:tc>
+      </w:tr>
+      <w:tr>
+        <w:tc>
+          <w:tcPr>
+            <w:tcW w:w="0" w:type="auto"/>
+            <w:vMerge/>
+            <w:vAlign w:val="center"/>
+          </w:tcPr>
+          <w:p>
+            <w:pPr>
+              <w:jc w:val="center"/>
+            </w:pPr>
+          </w:p>
+        </w:tc>
+        <w:tc>
+          <w:tcPr>
+            <w:tcW w:w="0" w:type="auto"/>
+            <w:vAlign w:val="center"/>
+          </w:tcPr>
+          <w:p>
+            <w:pPr>
+              <w:jc w:val="center"/>
+            </w:pPr>
+            <w:r>
+              <w:t>2026</w:t>
+            </w:r>
+            <w:r>
+              <w:rPr>
+                <w:rFonts w:hint="eastAsia"/>
+              </w:rPr>
+              <w:t>/</w:t>
+            </w:r>
+            <w:r>
+              <w:t>03</w:t>
+            </w:r>
+            <w:r>
+              <w:rPr>
+                <w:rFonts w:hint="eastAsia"/>
+              </w:rPr>
+              <w:t>/</w:t>
+            </w:r>
+            <w:r>
+              <w:t>26</w:t>
+            </w:r>
+          </w:p>
+        </w:tc>
+        <w:tc>
+          <w:tcPr>
+            <w:tcW w:w="0" w:type="auto"/>
+            <w:vAlign w:val="center"/>
+          </w:tcPr>
+          <w:p>
+            <w:pPr>
+              <w:jc w:val="center"/>
+            </w:pPr>
+            <w:r>
+              <w:rPr>
+                <w:rFonts w:hint="eastAsia"/>
+              </w:rPr>
+              <w:t>(</w:t>
+            </w:r>
+            <w:r>
+              <w:rPr>
+                <w:rFonts w:hint="eastAsia"/>
+              </w:rPr>
+              <w:t>四</w:t>
+            </w:r>
+            <w:r>
+              <w:rPr>
+                <w:rFonts w:hint="eastAsia"/>
+              </w:rPr>
+              <w:t>)</w:t>
+            </w:r>
+          </w:p>
+        </w:tc>
+        <w:tc>
+          <w:tcPr>
+            <w:tcW w:w="0" w:type="auto"/>
+          </w:tcPr>
+          <w:p>
+            <w:pPr>
+              <w:pStyle w:val="ListParagraph"/>
+              <w:numPr>
+                <w:ilvl w:val="0"/>
+                <w:numId w:val="1"/>
+              </w:numPr>
+              <w:ind w:left="360"/>
+            </w:pPr>
+          </w:p>
+        </w:tc>
+      </w:tr>
+      <w:tr>
+        <w:tc>
+          <w:tcPr>
+            <w:tcW w:w="0" w:type="auto"/>
+            <w:vMerge/>
+            <w:vAlign w:val="center"/>
+          </w:tcPr>
+          <w:p>
+            <w:pPr>
+              <w:jc w:val="center"/>
+            </w:pPr>
+          </w:p>
+        </w:tc>
+        <w:tc>
+          <w:tcPr>
+            <w:tcW w:w="0" w:type="auto"/>
+            <w:vAlign w:val="center"/>
+          </w:tcPr>
+          <w:p>
+            <w:pPr>
+              <w:jc w:val="center"/>
+            </w:pPr>
+            <w:r>
+              <w:t>2026</w:t>
+            </w:r>
+            <w:r>
+              <w:rPr>
+                <w:rFonts w:hint="eastAsia"/>
+              </w:rPr>
+              <w:t>/</w:t>
+            </w:r>
+            <w:r>
+              <w:t>03</w:t>
+            </w:r>
+            <w:r>
+              <w:rPr>
+                <w:rFonts w:hint="eastAsia"/>
+              </w:rPr>
+              <w:t>/</w:t>
+            </w:r>
+            <w:r>
+              <w:t>27</w:t>
             </w:r>
           </w:p>
         </w:tc>

</xml_diff>

<commit_message>
add 20260323-20260324 Internship Report
</commit_message>
<xml_diff>
--- a/周子用-實習報告.docx
+++ b/周子用-實習報告.docx
@@ -5,34 +5,47 @@
     <w:p>
       <w:pPr>
         <w:jc w:val="center"/>
+        <w:rPr>
+          <w:lang w:eastAsia="zh-TW"/>
+        </w:rPr>
       </w:pPr>
       <w:r>
         <w:rPr>
           <w:rFonts w:hint="eastAsia"/>
+          <w:lang w:eastAsia="zh-TW"/>
         </w:rPr>
         <w:t>豐碩資訊有限公司</w:t>
       </w:r>
       <w:r>
+        <w:rPr>
+          <w:lang w:eastAsia="zh-TW"/>
+        </w:rPr>
         <w:br/>
       </w:r>
       <w:r>
         <w:rPr>
           <w:rFonts w:hint="eastAsia"/>
+          <w:lang w:eastAsia="zh-TW"/>
         </w:rPr>
         <w:t>周子用</w:t>
       </w:r>
       <w:r>
         <w:rPr>
           <w:rFonts w:hint="eastAsia"/>
+          <w:lang w:eastAsia="zh-TW"/>
         </w:rPr>
         <w:t xml:space="preserve"> </w:t>
       </w:r>
       <w:r>
+        <w:rPr>
+          <w:lang w:eastAsia="zh-TW"/>
+        </w:rPr>
         <w:t xml:space="preserve">- </w:t>
       </w:r>
       <w:r>
         <w:rPr>
           <w:rFonts w:hint="eastAsia"/>
+          <w:lang w:eastAsia="zh-TW"/>
         </w:rPr>
         <w:t>實習報告</w:t>
       </w:r>
@@ -123,12 +136,14 @@
             <w:pPr>
               <w:jc w:val="center"/>
             </w:pPr>
+            <w:proofErr w:type="gramStart"/>
             <w:r>
               <w:rPr>
                 <w:rFonts w:hint="eastAsia"/>
               </w:rPr>
               <w:t>一</w:t>
             </w:r>
+            <w:proofErr w:type="gramEnd"/>
           </w:p>
         </w:tc>
         <w:tc>
@@ -200,7 +215,13 @@
               <w:ind w:left="360"/>
             </w:pPr>
             <w:r>
-              <w:t xml:space="preserve">Online meeting </w:t>
+              <w:t>Online meeting</w:t>
+            </w:r>
+            <w:r>
+              <w:rPr>
+                <w:rFonts w:hint="eastAsia"/>
+              </w:rPr>
+              <w:t>.</w:t>
             </w:r>
           </w:p>
           <w:p>
@@ -215,6 +236,9 @@
             <w:r>
               <w:t>Already install Git and Source tree</w:t>
             </w:r>
+            <w:r>
+              <w:t>.</w:t>
+            </w:r>
           </w:p>
           <w:p>
             <w:pPr>
@@ -226,7 +250,7 @@
               <w:ind w:left="360"/>
             </w:pPr>
             <w:r>
-              <w:t xml:space="preserve">Learn basic C# </w:t>
+              <w:t>Learn basic C#</w:t>
             </w:r>
           </w:p>
           <w:p>
@@ -241,6 +265,9 @@
             <w:r>
               <w:t>Structure</w:t>
             </w:r>
+            <w:r>
+              <w:t>.</w:t>
+            </w:r>
           </w:p>
           <w:p>
             <w:pPr>
@@ -254,6 +281,9 @@
             <w:r>
               <w:t>Namespace</w:t>
             </w:r>
+            <w:r>
+              <w:t>.</w:t>
+            </w:r>
           </w:p>
           <w:p>
             <w:pPr>
@@ -267,6 +297,9 @@
             <w:r>
               <w:t>Classes</w:t>
             </w:r>
+            <w:r>
+              <w:t>.</w:t>
+            </w:r>
           </w:p>
           <w:p>
             <w:pPr>
@@ -280,6 +313,9 @@
             <w:r>
               <w:t>Interface</w:t>
             </w:r>
+            <w:r>
+              <w:t>.</w:t>
+            </w:r>
           </w:p>
           <w:p>
             <w:pPr>
@@ -292,6 +328,9 @@
             </w:pPr>
             <w:r>
               <w:t>OOP</w:t>
+            </w:r>
+            <w:r>
+              <w:t>.</w:t>
             </w:r>
           </w:p>
         </w:tc>
@@ -390,6 +429,9 @@
             <w:r>
               <w:t>tall Visual Studio and Creating Simple Web Application Project</w:t>
             </w:r>
+            <w:r>
+              <w:t>.</w:t>
+            </w:r>
           </w:p>
           <w:p>
             <w:pPr>
@@ -416,6 +458,9 @@
             <w:r>
               <w:t>Pattern</w:t>
             </w:r>
+            <w:r>
+              <w:t>.</w:t>
+            </w:r>
           </w:p>
           <w:p>
             <w:pPr>
@@ -429,6 +474,9 @@
             <w:r>
               <w:t>Nullable</w:t>
             </w:r>
+            <w:r>
+              <w:t>.</w:t>
+            </w:r>
           </w:p>
           <w:p>
             <w:pPr>
@@ -442,6 +490,9 @@
             <w:r>
               <w:t>Iterators</w:t>
             </w:r>
+            <w:r>
+              <w:t>.</w:t>
+            </w:r>
           </w:p>
           <w:p>
             <w:pPr>
@@ -454,6 +505,9 @@
             </w:pPr>
             <w:r>
               <w:t>Tutorials</w:t>
+            </w:r>
+            <w:r>
+              <w:t>.</w:t>
             </w:r>
           </w:p>
         </w:tc>
@@ -556,6 +610,9 @@
             <w:r>
               <w:t>Asynchronous Programming (Async-Await)</w:t>
             </w:r>
+            <w:r>
+              <w:t>.</w:t>
+            </w:r>
           </w:p>
           <w:p>
             <w:pPr>
@@ -568,6 +625,9 @@
             </w:pPr>
             <w:r>
               <w:t>MVC</w:t>
+            </w:r>
+            <w:r>
+              <w:t>.</w:t>
             </w:r>
           </w:p>
           <w:p/>
@@ -671,6 +731,9 @@
             <w:r>
               <w:t>Object Relational Mapping and the simple implementation</w:t>
             </w:r>
+            <w:r>
+              <w:t>.</w:t>
+            </w:r>
           </w:p>
           <w:p>
             <w:pPr>
@@ -683,6 +746,9 @@
             </w:pPr>
             <w:r>
               <w:t>SQL Queries</w:t>
+            </w:r>
+            <w:r>
+              <w:t>.</w:t>
             </w:r>
           </w:p>
           <w:p/>
@@ -792,6 +858,7 @@
               </w:rPr>
               <w:t>（</w:t>
             </w:r>
+            <w:proofErr w:type="spellStart"/>
             <w:r>
               <w:rPr>
                 <w:rFonts w:hint="eastAsia"/>
@@ -799,13 +866,31 @@
               <w:t>T</w:t>
             </w:r>
             <w:r>
-              <w:t>oDo Application, BookStore Application</w:t>
+              <w:t>oDo</w:t>
+            </w:r>
+            <w:proofErr w:type="spellEnd"/>
+            <w:r>
+              <w:t xml:space="preserve"> Application, </w:t>
+            </w:r>
+            <w:proofErr w:type="spellStart"/>
+            <w:r>
+              <w:t>BookStore</w:t>
+            </w:r>
+            <w:proofErr w:type="spellEnd"/>
+            <w:r>
+              <w:t xml:space="preserve"> Application</w:t>
             </w:r>
             <w:r>
               <w:rPr>
                 <w:rFonts w:hint="eastAsia"/>
               </w:rPr>
               <w:t>）</w:t>
+            </w:r>
+            <w:r>
+              <w:rPr>
+                <w:rFonts w:hint="eastAsia"/>
+              </w:rPr>
+              <w:t>.</w:t>
             </w:r>
           </w:p>
         </w:tc>
@@ -900,6 +985,9 @@
             <w:r>
               <w:t>Online Meeting</w:t>
             </w:r>
+            <w:r>
+              <w:t>.</w:t>
+            </w:r>
           </w:p>
           <w:p>
             <w:pPr>
@@ -912,6 +1000,9 @@
             </w:pPr>
             <w:r>
               <w:t>Learn 2 Project Documents</w:t>
+            </w:r>
+            <w:r>
+              <w:t>.</w:t>
             </w:r>
           </w:p>
         </w:tc>
@@ -1006,6 +1097,9 @@
             <w:r>
               <w:t>Online Meeting</w:t>
             </w:r>
+            <w:r>
+              <w:t>.</w:t>
+            </w:r>
           </w:p>
           <w:p>
             <w:pPr>
@@ -1018,6 +1112,9 @@
             </w:pPr>
             <w:r>
               <w:t>Continue to learn 2 Project Documents</w:t>
+            </w:r>
+            <w:r>
+              <w:t>.</w:t>
             </w:r>
           </w:p>
         </w:tc>
@@ -1112,6 +1209,9 @@
             <w:r>
               <w:t>Company Visit</w:t>
             </w:r>
+            <w:r>
+              <w:t>.</w:t>
+            </w:r>
           </w:p>
           <w:p>
             <w:pPr>
@@ -1124,6 +1224,9 @@
             </w:pPr>
             <w:r>
               <w:t>Discuss about Task and Job Contents</w:t>
+            </w:r>
+            <w:r>
+              <w:t>.</w:t>
             </w:r>
           </w:p>
         </w:tc>
@@ -1231,6 +1334,9 @@
             <w:r>
               <w:t>Meeting</w:t>
             </w:r>
+            <w:r>
+              <w:t>.</w:t>
+            </w:r>
           </w:p>
           <w:p>
             <w:pPr>
@@ -1346,6 +1452,9 @@
             <w:r>
               <w:t>Meeting</w:t>
             </w:r>
+            <w:r>
+              <w:t>.</w:t>
+            </w:r>
           </w:p>
           <w:p>
             <w:pPr>
@@ -1453,6 +1562,9 @@
             <w:r>
               <w:t>Meeting</w:t>
             </w:r>
+            <w:r>
+              <w:t>.</w:t>
+            </w:r>
           </w:p>
           <w:p>
             <w:pPr>
@@ -1585,6 +1697,9 @@
             <w:r>
               <w:t>Meeting</w:t>
             </w:r>
+            <w:r>
+              <w:t>.</w:t>
+            </w:r>
           </w:p>
           <w:p>
             <w:pPr>
@@ -1735,6 +1850,9 @@
             <w:r>
               <w:t>rn Data Seeding Implementation with ABP Framework</w:t>
             </w:r>
+            <w:r>
+              <w:t>.</w:t>
+            </w:r>
           </w:p>
         </w:tc>
       </w:tr>
@@ -1827,7 +1945,10 @@
               <w:ind w:left="360"/>
             </w:pPr>
             <w:r>
-              <w:t xml:space="preserve">Join the In-class session course, learning the GitHub Implementation and ABP Framework </w:t>
+              <w:t>Join the In-class session course, learning the GitHub Implementation and ABP Framework</w:t>
+            </w:r>
+            <w:r>
+              <w:t>.</w:t>
             </w:r>
           </w:p>
           <w:p>
@@ -1856,6 +1977,9 @@
             </w:r>
             <w:r>
               <w:t>rn Data Seeding Implementation with ABP Framework</w:t>
+            </w:r>
+            <w:r>
+              <w:t>.</w:t>
             </w:r>
           </w:p>
         </w:tc>
@@ -1960,7 +2084,29 @@
               <w:t>rn Data Seeding Implementation with ABP Framewor</w:t>
             </w:r>
             <w:r>
-              <w:t>k, adding some feature to seed data from imported csv file from the UI</w:t>
+              <w:t>k</w:t>
+            </w:r>
+          </w:p>
+          <w:p>
+            <w:pPr>
+              <w:pStyle w:val="ListParagraph"/>
+              <w:numPr>
+                <w:ilvl w:val="0"/>
+                <w:numId w:val="2"/>
+              </w:numPr>
+              <w:ind w:left="1080"/>
+            </w:pPr>
+            <w:r>
+              <w:t>A</w:t>
+            </w:r>
+            <w:r>
+              <w:t xml:space="preserve">dding some feature to seed data from imported </w:t>
+            </w:r>
+            <w:r>
+              <w:t>CSV</w:t>
+            </w:r>
+            <w:r>
+              <w:t xml:space="preserve"> file from the UI</w:t>
             </w:r>
             <w:r>
               <w:t>.</w:t>
@@ -2072,8 +2218,75 @@
                 <w:ilvl w:val="0"/>
                 <w:numId w:val="1"/>
               </w:numPr>
+              <w:spacing w:after="160" w:line="259" w:lineRule="auto"/>
               <w:ind w:left="360"/>
             </w:pPr>
+            <w:r>
+              <w:t>Continue to self-l</w:t>
+            </w:r>
+            <w:r>
+              <w:rPr>
+                <w:rFonts w:hint="eastAsia"/>
+              </w:rPr>
+              <w:t>ea</w:t>
+            </w:r>
+            <w:r>
+              <w:t>rn Data Seeding Implementation with ABP Framework, adding some feature to seed data from imported csv file from the UI.</w:t>
+            </w:r>
+          </w:p>
+          <w:p>
+            <w:pPr>
+              <w:pStyle w:val="ListParagraph"/>
+              <w:numPr>
+                <w:ilvl w:val="0"/>
+                <w:numId w:val="2"/>
+              </w:numPr>
+              <w:spacing w:after="160" w:line="259" w:lineRule="auto"/>
+              <w:ind w:left="1080"/>
+            </w:pPr>
+            <w:r>
+              <w:t xml:space="preserve">Adding some feature to </w:t>
+            </w:r>
+            <w:r>
+              <w:t>export</w:t>
+            </w:r>
+            <w:r>
+              <w:t xml:space="preserve"> </w:t>
+            </w:r>
+            <w:r>
+              <w:t>CSV</w:t>
+            </w:r>
+            <w:r>
+              <w:t xml:space="preserve"> file from the UI.</w:t>
+            </w:r>
+          </w:p>
+          <w:p>
+            <w:pPr>
+              <w:pStyle w:val="ListParagraph"/>
+              <w:numPr>
+                <w:ilvl w:val="0"/>
+                <w:numId w:val="2"/>
+              </w:numPr>
+              <w:spacing w:after="160" w:line="259" w:lineRule="auto"/>
+              <w:ind w:left="1080"/>
+            </w:pPr>
+            <w:r>
+              <w:t>Add some Pull Request.</w:t>
+            </w:r>
+          </w:p>
+          <w:p>
+            <w:pPr>
+              <w:pStyle w:val="ListParagraph"/>
+              <w:numPr>
+                <w:ilvl w:val="0"/>
+                <w:numId w:val="2"/>
+              </w:numPr>
+              <w:spacing w:after="160" w:line="259" w:lineRule="auto"/>
+              <w:ind w:left="1080"/>
+            </w:pPr>
+            <w:r>
+              <w:t>Bugs fix.</w:t>
+            </w:r>
           </w:p>
         </w:tc>
       </w:tr>
@@ -2162,8 +2375,123 @@
                 <w:ilvl w:val="0"/>
                 <w:numId w:val="1"/>
               </w:numPr>
+              <w:spacing w:after="160" w:line="259" w:lineRule="auto"/>
               <w:ind w:left="360"/>
             </w:pPr>
+            <w:r>
+              <w:t>Continue to self-l</w:t>
+            </w:r>
+            <w:r>
+              <w:rPr>
+                <w:rFonts w:hint="eastAsia"/>
+              </w:rPr>
+              <w:t>ea</w:t>
+            </w:r>
+            <w:r>
+              <w:t xml:space="preserve">rn Data Seeding Implementation with ABP Framework, adding some feature to seed data from imported </w:t>
+            </w:r>
+            <w:r>
+              <w:t>CSV</w:t>
+            </w:r>
+            <w:r>
+              <w:t xml:space="preserve"> file from the UI.</w:t>
+            </w:r>
+          </w:p>
+          <w:p>
+            <w:pPr>
+              <w:pStyle w:val="ListParagraph"/>
+              <w:numPr>
+                <w:ilvl w:val="0"/>
+                <w:numId w:val="2"/>
+              </w:numPr>
+              <w:spacing w:after="160" w:line="259" w:lineRule="auto"/>
+              <w:ind w:left="1080"/>
+            </w:pPr>
+            <w:r>
+              <w:t xml:space="preserve">Adding some feature </w:t>
+            </w:r>
+            <w:r>
+              <w:t>to see list of data which has been deleted (</w:t>
+            </w:r>
+            <w:r>
+              <w:rPr>
+                <w:rFonts w:hint="eastAsia"/>
+              </w:rPr>
+              <w:t>soft</w:t>
+            </w:r>
+            <w:r>
+              <w:t>-deletes)</w:t>
+            </w:r>
+            <w:r>
+              <w:t>.</w:t>
+            </w:r>
+          </w:p>
+          <w:p>
+            <w:pPr>
+              <w:pStyle w:val="ListParagraph"/>
+              <w:numPr>
+                <w:ilvl w:val="0"/>
+                <w:numId w:val="2"/>
+              </w:numPr>
+              <w:spacing w:after="160" w:line="259" w:lineRule="auto"/>
+              <w:ind w:left="1080"/>
+            </w:pPr>
+            <w:r>
+              <w:t>Bugs fix.</w:t>
+            </w:r>
+          </w:p>
+          <w:p>
+            <w:pPr>
+              <w:pStyle w:val="ListParagraph"/>
+              <w:numPr>
+                <w:ilvl w:val="0"/>
+                <w:numId w:val="2"/>
+              </w:numPr>
+              <w:spacing w:after="160" w:line="259" w:lineRule="auto"/>
+              <w:ind w:left="1080"/>
+            </w:pPr>
+            <w:r>
+              <w:t>Merge Branch</w:t>
+            </w:r>
+            <w:r>
+              <w:t>.</w:t>
+            </w:r>
+          </w:p>
+          <w:p>
+            <w:pPr>
+              <w:pStyle w:val="ListParagraph"/>
+              <w:numPr>
+                <w:ilvl w:val="0"/>
+                <w:numId w:val="1"/>
+              </w:numPr>
+              <w:ind w:left="360"/>
+            </w:pPr>
+            <w:r>
+              <w:t xml:space="preserve">Learn to make </w:t>
+            </w:r>
+            <w:r>
+              <w:t xml:space="preserve">Mock </w:t>
+            </w:r>
+            <w:r>
+              <w:t>JSON API</w:t>
+            </w:r>
+            <w:r>
+              <w:t xml:space="preserve">, how to use </w:t>
+            </w:r>
+            <w:proofErr w:type="spellStart"/>
+            <w:r>
+              <w:t>Stimulsoft</w:t>
+            </w:r>
+            <w:proofErr w:type="spellEnd"/>
+            <w:r>
+              <w:t xml:space="preserve"> </w:t>
+            </w:r>
+            <w:r>
+              <w:t xml:space="preserve">Report </w:t>
+            </w:r>
+            <w:r>
+              <w:t>Designer.</w:t>
+            </w:r>
           </w:p>
         </w:tc>
       </w:tr>
@@ -2400,6 +2728,483 @@
           <w:p>
             <w:pPr>
               <w:jc w:val="center"/>
+            </w:pPr>
+            <w:r>
+              <w:rPr>
+                <w:rFonts w:hint="eastAsia"/>
+              </w:rPr>
+              <w:t>(</w:t>
+            </w:r>
+            <w:r>
+              <w:rPr>
+                <w:rFonts w:hint="eastAsia"/>
+              </w:rPr>
+              <w:t>五</w:t>
+            </w:r>
+            <w:r>
+              <w:rPr>
+                <w:rFonts w:hint="eastAsia"/>
+              </w:rPr>
+              <w:t>)</w:t>
+            </w:r>
+          </w:p>
+        </w:tc>
+        <w:tc>
+          <w:tcPr>
+            <w:tcW w:w="0" w:type="auto"/>
+          </w:tcPr>
+          <w:p>
+            <w:pPr>
+              <w:pStyle w:val="ListParagraph"/>
+              <w:numPr>
+                <w:ilvl w:val="0"/>
+                <w:numId w:val="1"/>
+              </w:numPr>
+              <w:ind w:left="360"/>
+            </w:pPr>
+          </w:p>
+        </w:tc>
+      </w:tr>
+      <w:tr>
+        <w:tc>
+          <w:tcPr>
+            <w:tcW w:w="0" w:type="auto"/>
+            <w:vMerge w:val="restart"/>
+            <w:vAlign w:val="center"/>
+          </w:tcPr>
+          <w:p>
+            <w:pPr>
+              <w:jc w:val="center"/>
+              <w:rPr>
+                <w:rFonts w:hint="eastAsia"/>
+              </w:rPr>
+            </w:pPr>
+            <w:r>
+              <w:rPr>
+                <w:rFonts w:hint="eastAsia"/>
+              </w:rPr>
+              <w:t>伍</w:t>
+            </w:r>
+          </w:p>
+        </w:tc>
+        <w:tc>
+          <w:tcPr>
+            <w:tcW w:w="0" w:type="auto"/>
+            <w:vAlign w:val="center"/>
+          </w:tcPr>
+          <w:p>
+            <w:pPr>
+              <w:jc w:val="center"/>
+            </w:pPr>
+            <w:r>
+              <w:t>2026</w:t>
+            </w:r>
+            <w:r>
+              <w:rPr>
+                <w:rFonts w:hint="eastAsia"/>
+              </w:rPr>
+              <w:t>/</w:t>
+            </w:r>
+            <w:r>
+              <w:t>03</w:t>
+            </w:r>
+            <w:r>
+              <w:rPr>
+                <w:rFonts w:hint="eastAsia"/>
+              </w:rPr>
+              <w:t>/</w:t>
+            </w:r>
+            <w:r>
+              <w:t>30</w:t>
+            </w:r>
+          </w:p>
+        </w:tc>
+        <w:tc>
+          <w:tcPr>
+            <w:tcW w:w="0" w:type="auto"/>
+            <w:vAlign w:val="center"/>
+          </w:tcPr>
+          <w:p>
+            <w:pPr>
+              <w:jc w:val="center"/>
+              <w:rPr>
+                <w:rFonts w:hint="eastAsia"/>
+              </w:rPr>
+            </w:pPr>
+            <w:r>
+              <w:t>(</w:t>
+            </w:r>
+            <w:r>
+              <w:rPr>
+                <w:rFonts w:hint="eastAsia"/>
+              </w:rPr>
+              <w:t>一</w:t>
+            </w:r>
+            <w:r>
+              <w:t>)</w:t>
+            </w:r>
+          </w:p>
+        </w:tc>
+        <w:tc>
+          <w:tcPr>
+            <w:tcW w:w="0" w:type="auto"/>
+          </w:tcPr>
+          <w:p>
+            <w:pPr>
+              <w:pStyle w:val="ListParagraph"/>
+              <w:numPr>
+                <w:ilvl w:val="0"/>
+                <w:numId w:val="1"/>
+              </w:numPr>
+              <w:ind w:left="360"/>
+            </w:pPr>
+          </w:p>
+        </w:tc>
+      </w:tr>
+      <w:tr>
+        <w:tc>
+          <w:tcPr>
+            <w:tcW w:w="0" w:type="auto"/>
+            <w:vMerge/>
+            <w:vAlign w:val="center"/>
+          </w:tcPr>
+          <w:p>
+            <w:pPr>
+              <w:jc w:val="center"/>
+            </w:pPr>
+          </w:p>
+        </w:tc>
+        <w:tc>
+          <w:tcPr>
+            <w:tcW w:w="0" w:type="auto"/>
+            <w:vAlign w:val="center"/>
+          </w:tcPr>
+          <w:p>
+            <w:pPr>
+              <w:jc w:val="center"/>
+            </w:pPr>
+            <w:r>
+              <w:t>2026</w:t>
+            </w:r>
+            <w:r>
+              <w:rPr>
+                <w:rFonts w:hint="eastAsia"/>
+              </w:rPr>
+              <w:t>/</w:t>
+            </w:r>
+            <w:r>
+              <w:t>03</w:t>
+            </w:r>
+            <w:r>
+              <w:rPr>
+                <w:rFonts w:hint="eastAsia"/>
+              </w:rPr>
+              <w:t>/</w:t>
+            </w:r>
+            <w:r>
+              <w:t>31</w:t>
+            </w:r>
+          </w:p>
+        </w:tc>
+        <w:tc>
+          <w:tcPr>
+            <w:tcW w:w="0" w:type="auto"/>
+            <w:vAlign w:val="center"/>
+          </w:tcPr>
+          <w:p>
+            <w:pPr>
+              <w:jc w:val="center"/>
+              <w:rPr>
+                <w:rFonts w:hint="eastAsia"/>
+              </w:rPr>
+            </w:pPr>
+            <w:r>
+              <w:rPr>
+                <w:rFonts w:hint="eastAsia"/>
+              </w:rPr>
+              <w:t>(</w:t>
+            </w:r>
+            <w:r>
+              <w:rPr>
+                <w:rFonts w:hint="eastAsia"/>
+              </w:rPr>
+              <w:t>二</w:t>
+            </w:r>
+            <w:r>
+              <w:rPr>
+                <w:rFonts w:hint="eastAsia"/>
+              </w:rPr>
+              <w:t>)</w:t>
+            </w:r>
+          </w:p>
+        </w:tc>
+        <w:tc>
+          <w:tcPr>
+            <w:tcW w:w="0" w:type="auto"/>
+          </w:tcPr>
+          <w:p>
+            <w:pPr>
+              <w:pStyle w:val="ListParagraph"/>
+              <w:numPr>
+                <w:ilvl w:val="0"/>
+                <w:numId w:val="1"/>
+              </w:numPr>
+              <w:ind w:left="360"/>
+            </w:pPr>
+          </w:p>
+        </w:tc>
+      </w:tr>
+      <w:tr>
+        <w:tc>
+          <w:tcPr>
+            <w:tcW w:w="0" w:type="auto"/>
+            <w:vMerge/>
+            <w:vAlign w:val="center"/>
+          </w:tcPr>
+          <w:p>
+            <w:pPr>
+              <w:jc w:val="center"/>
+            </w:pPr>
+          </w:p>
+        </w:tc>
+        <w:tc>
+          <w:tcPr>
+            <w:tcW w:w="0" w:type="auto"/>
+            <w:vAlign w:val="center"/>
+          </w:tcPr>
+          <w:p>
+            <w:pPr>
+              <w:jc w:val="center"/>
+            </w:pPr>
+            <w:r>
+              <w:t>2026</w:t>
+            </w:r>
+            <w:r>
+              <w:rPr>
+                <w:rFonts w:hint="eastAsia"/>
+              </w:rPr>
+              <w:t>/</w:t>
+            </w:r>
+            <w:r>
+              <w:t>0</w:t>
+            </w:r>
+            <w:r>
+              <w:t>4</w:t>
+            </w:r>
+            <w:r>
+              <w:rPr>
+                <w:rFonts w:hint="eastAsia"/>
+              </w:rPr>
+              <w:t>/</w:t>
+            </w:r>
+            <w:r>
+              <w:t>01</w:t>
+            </w:r>
+          </w:p>
+        </w:tc>
+        <w:tc>
+          <w:tcPr>
+            <w:tcW w:w="0" w:type="auto"/>
+            <w:vAlign w:val="center"/>
+          </w:tcPr>
+          <w:p>
+            <w:pPr>
+              <w:jc w:val="center"/>
+              <w:rPr>
+                <w:rFonts w:hint="eastAsia"/>
+              </w:rPr>
+            </w:pPr>
+            <w:r>
+              <w:rPr>
+                <w:rFonts w:hint="eastAsia"/>
+              </w:rPr>
+              <w:t>(</w:t>
+            </w:r>
+            <w:r>
+              <w:rPr>
+                <w:rFonts w:hint="eastAsia"/>
+              </w:rPr>
+              <w:t>三</w:t>
+            </w:r>
+            <w:r>
+              <w:rPr>
+                <w:rFonts w:hint="eastAsia"/>
+              </w:rPr>
+              <w:t>)</w:t>
+            </w:r>
+          </w:p>
+        </w:tc>
+        <w:tc>
+          <w:tcPr>
+            <w:tcW w:w="0" w:type="auto"/>
+          </w:tcPr>
+          <w:p>
+            <w:pPr>
+              <w:pStyle w:val="ListParagraph"/>
+              <w:numPr>
+                <w:ilvl w:val="0"/>
+                <w:numId w:val="1"/>
+              </w:numPr>
+              <w:ind w:left="360"/>
+            </w:pPr>
+          </w:p>
+        </w:tc>
+      </w:tr>
+      <w:tr>
+        <w:tc>
+          <w:tcPr>
+            <w:tcW w:w="0" w:type="auto"/>
+            <w:vMerge/>
+            <w:vAlign w:val="center"/>
+          </w:tcPr>
+          <w:p>
+            <w:pPr>
+              <w:jc w:val="center"/>
+            </w:pPr>
+          </w:p>
+        </w:tc>
+        <w:tc>
+          <w:tcPr>
+            <w:tcW w:w="0" w:type="auto"/>
+            <w:vAlign w:val="center"/>
+          </w:tcPr>
+          <w:p>
+            <w:pPr>
+              <w:jc w:val="center"/>
+            </w:pPr>
+            <w:r>
+              <w:t>2026</w:t>
+            </w:r>
+            <w:r>
+              <w:rPr>
+                <w:rFonts w:hint="eastAsia"/>
+              </w:rPr>
+              <w:t>/</w:t>
+            </w:r>
+            <w:r>
+              <w:t>04</w:t>
+            </w:r>
+            <w:r>
+              <w:rPr>
+                <w:rFonts w:hint="eastAsia"/>
+              </w:rPr>
+              <w:t>/</w:t>
+            </w:r>
+            <w:r>
+              <w:t>0</w:t>
+            </w:r>
+            <w:r>
+              <w:t>2</w:t>
+            </w:r>
+          </w:p>
+        </w:tc>
+        <w:tc>
+          <w:tcPr>
+            <w:tcW w:w="0" w:type="auto"/>
+            <w:vAlign w:val="center"/>
+          </w:tcPr>
+          <w:p>
+            <w:pPr>
+              <w:jc w:val="center"/>
+              <w:rPr>
+                <w:rFonts w:hint="eastAsia"/>
+              </w:rPr>
+            </w:pPr>
+            <w:r>
+              <w:rPr>
+                <w:rFonts w:hint="eastAsia"/>
+              </w:rPr>
+              <w:t>(</w:t>
+            </w:r>
+            <w:r>
+              <w:rPr>
+                <w:rFonts w:hint="eastAsia"/>
+              </w:rPr>
+              <w:t>四</w:t>
+            </w:r>
+            <w:r>
+              <w:rPr>
+                <w:rFonts w:hint="eastAsia"/>
+              </w:rPr>
+              <w:t>)</w:t>
+            </w:r>
+          </w:p>
+        </w:tc>
+        <w:tc>
+          <w:tcPr>
+            <w:tcW w:w="0" w:type="auto"/>
+          </w:tcPr>
+          <w:p>
+            <w:pPr>
+              <w:pStyle w:val="ListParagraph"/>
+              <w:numPr>
+                <w:ilvl w:val="0"/>
+                <w:numId w:val="1"/>
+              </w:numPr>
+              <w:ind w:left="360"/>
+            </w:pPr>
+          </w:p>
+        </w:tc>
+      </w:tr>
+      <w:tr>
+        <w:tc>
+          <w:tcPr>
+            <w:tcW w:w="0" w:type="auto"/>
+            <w:vMerge/>
+            <w:vAlign w:val="center"/>
+          </w:tcPr>
+          <w:p>
+            <w:pPr>
+              <w:jc w:val="center"/>
+            </w:pPr>
+          </w:p>
+        </w:tc>
+        <w:tc>
+          <w:tcPr>
+            <w:tcW w:w="0" w:type="auto"/>
+            <w:vAlign w:val="center"/>
+          </w:tcPr>
+          <w:p>
+            <w:pPr>
+              <w:jc w:val="center"/>
+            </w:pPr>
+            <w:r>
+              <w:t>2026</w:t>
+            </w:r>
+            <w:r>
+              <w:rPr>
+                <w:rFonts w:hint="eastAsia"/>
+              </w:rPr>
+              <w:t>/</w:t>
+            </w:r>
+            <w:r>
+              <w:t>04</w:t>
+            </w:r>
+            <w:r>
+              <w:rPr>
+                <w:rFonts w:hint="eastAsia"/>
+              </w:rPr>
+              <w:t>/</w:t>
+            </w:r>
+            <w:r>
+              <w:t>0</w:t>
+            </w:r>
+            <w:r>
+              <w:t>3</w:t>
+            </w:r>
+          </w:p>
+        </w:tc>
+        <w:tc>
+          <w:tcPr>
+            <w:tcW w:w="0" w:type="auto"/>
+            <w:vAlign w:val="center"/>
+          </w:tcPr>
+          <w:p>
+            <w:pPr>
+              <w:jc w:val="center"/>
+              <w:rPr>
+                <w:rFonts w:hint="eastAsia"/>
+              </w:rPr>
             </w:pPr>
             <w:r>
               <w:rPr>
@@ -2746,6 +3551,119 @@
     </w:lvl>
   </w:abstractNum>
   <w:abstractNum w:abstractNumId="2" w15:restartNumberingAfterBreak="0">
+    <w:nsid w:val="312E7DE6"/>
+    <w:multiLevelType w:val="hybridMultilevel"/>
+    <w:tmpl w:val="86BECD6C"/>
+    <w:lvl w:ilvl="0" w:tplc="04090001">
+      <w:start w:val="1"/>
+      <w:numFmt w:val="bullet"/>
+      <w:lvlText w:val=""/>
+      <w:lvlJc w:val="left"/>
+      <w:pPr>
+        <w:ind w:left="1080" w:hanging="360"/>
+      </w:pPr>
+      <w:rPr>
+        <w:rFonts w:ascii="Symbol" w:hAnsi="Symbol" w:hint="default"/>
+      </w:rPr>
+    </w:lvl>
+    <w:lvl w:ilvl="1" w:tplc="04090003" w:tentative="1">
+      <w:start w:val="1"/>
+      <w:numFmt w:val="bullet"/>
+      <w:lvlText w:val="o"/>
+      <w:lvlJc w:val="left"/>
+      <w:pPr>
+        <w:ind w:left="1800" w:hanging="360"/>
+      </w:pPr>
+      <w:rPr>
+        <w:rFonts w:ascii="Courier New" w:hAnsi="Courier New" w:cs="Courier New" w:hint="default"/>
+      </w:rPr>
+    </w:lvl>
+    <w:lvl w:ilvl="2" w:tplc="04090005" w:tentative="1">
+      <w:start w:val="1"/>
+      <w:numFmt w:val="bullet"/>
+      <w:lvlText w:val=""/>
+      <w:lvlJc w:val="left"/>
+      <w:pPr>
+        <w:ind w:left="2520" w:hanging="360"/>
+      </w:pPr>
+      <w:rPr>
+        <w:rFonts w:ascii="Wingdings" w:hAnsi="Wingdings" w:hint="default"/>
+      </w:rPr>
+    </w:lvl>
+    <w:lvl w:ilvl="3" w:tplc="04090001" w:tentative="1">
+      <w:start w:val="1"/>
+      <w:numFmt w:val="bullet"/>
+      <w:lvlText w:val=""/>
+      <w:lvlJc w:val="left"/>
+      <w:pPr>
+        <w:ind w:left="3240" w:hanging="360"/>
+      </w:pPr>
+      <w:rPr>
+        <w:rFonts w:ascii="Symbol" w:hAnsi="Symbol" w:hint="default"/>
+      </w:rPr>
+    </w:lvl>
+    <w:lvl w:ilvl="4" w:tplc="04090003" w:tentative="1">
+      <w:start w:val="1"/>
+      <w:numFmt w:val="bullet"/>
+      <w:lvlText w:val="o"/>
+      <w:lvlJc w:val="left"/>
+      <w:pPr>
+        <w:ind w:left="3960" w:hanging="360"/>
+      </w:pPr>
+      <w:rPr>
+        <w:rFonts w:ascii="Courier New" w:hAnsi="Courier New" w:cs="Courier New" w:hint="default"/>
+      </w:rPr>
+    </w:lvl>
+    <w:lvl w:ilvl="5" w:tplc="04090005" w:tentative="1">
+      <w:start w:val="1"/>
+      <w:numFmt w:val="bullet"/>
+      <w:lvlText w:val=""/>
+      <w:lvlJc w:val="left"/>
+      <w:pPr>
+        <w:ind w:left="4680" w:hanging="360"/>
+      </w:pPr>
+      <w:rPr>
+        <w:rFonts w:ascii="Wingdings" w:hAnsi="Wingdings" w:hint="default"/>
+      </w:rPr>
+    </w:lvl>
+    <w:lvl w:ilvl="6" w:tplc="04090001" w:tentative="1">
+      <w:start w:val="1"/>
+      <w:numFmt w:val="bullet"/>
+      <w:lvlText w:val=""/>
+      <w:lvlJc w:val="left"/>
+      <w:pPr>
+        <w:ind w:left="5400" w:hanging="360"/>
+      </w:pPr>
+      <w:rPr>
+        <w:rFonts w:ascii="Symbol" w:hAnsi="Symbol" w:hint="default"/>
+      </w:rPr>
+    </w:lvl>
+    <w:lvl w:ilvl="7" w:tplc="04090003" w:tentative="1">
+      <w:start w:val="1"/>
+      <w:numFmt w:val="bullet"/>
+      <w:lvlText w:val="o"/>
+      <w:lvlJc w:val="left"/>
+      <w:pPr>
+        <w:ind w:left="6120" w:hanging="360"/>
+      </w:pPr>
+      <w:rPr>
+        <w:rFonts w:ascii="Courier New" w:hAnsi="Courier New" w:cs="Courier New" w:hint="default"/>
+      </w:rPr>
+    </w:lvl>
+    <w:lvl w:ilvl="8" w:tplc="04090005" w:tentative="1">
+      <w:start w:val="1"/>
+      <w:numFmt w:val="bullet"/>
+      <w:lvlText w:val=""/>
+      <w:lvlJc w:val="left"/>
+      <w:pPr>
+        <w:ind w:left="6840" w:hanging="360"/>
+      </w:pPr>
+      <w:rPr>
+        <w:rFonts w:ascii="Wingdings" w:hAnsi="Wingdings" w:hint="default"/>
+      </w:rPr>
+    </w:lvl>
+  </w:abstractNum>
+  <w:abstractNum w:abstractNumId="3" w15:restartNumberingAfterBreak="0">
     <w:nsid w:val="499650C7"/>
     <w:multiLevelType w:val="hybridMultilevel"/>
     <w:tmpl w:val="65FE25CA"/>
@@ -2858,7 +3776,7 @@
       </w:rPr>
     </w:lvl>
   </w:abstractNum>
-  <w:abstractNum w:abstractNumId="3" w15:restartNumberingAfterBreak="0">
+  <w:abstractNum w:abstractNumId="4" w15:restartNumberingAfterBreak="0">
     <w:nsid w:val="5A71584A"/>
     <w:multiLevelType w:val="hybridMultilevel"/>
     <w:tmpl w:val="D3561D68"/>
@@ -2975,13 +3893,16 @@
     <w:abstractNumId w:val="0"/>
   </w:num>
   <w:num w:numId="2">
-    <w:abstractNumId w:val="2"/>
+    <w:abstractNumId w:val="3"/>
   </w:num>
   <w:num w:numId="3">
     <w:abstractNumId w:val="1"/>
   </w:num>
   <w:num w:numId="4">
-    <w:abstractNumId w:val="3"/>
+    <w:abstractNumId w:val="4"/>
+  </w:num>
+  <w:num w:numId="5">
+    <w:abstractNumId w:val="2"/>
   </w:num>
 </w:numbering>
 </file>
@@ -3891,4 +4812,16 @@
     </a:ext>
   </a:extLst>
 </a:theme>
+</file>
+
+<file path=customXml/item1.xml><?xml version="1.0" encoding="utf-8"?>
+<b:Sources xmlns:b="http://schemas.openxmlformats.org/officeDocument/2006/bibliography" xmlns="http://schemas.openxmlformats.org/officeDocument/2006/bibliography" SelectedStyle="\APASixthEditionOfficeOnline.xsl" StyleName="APA" Version="6"/>
+</file>
+
+<file path=customXml/itemProps1.xml><?xml version="1.0" encoding="utf-8"?>
+<ds:datastoreItem xmlns:ds="http://schemas.openxmlformats.org/officeDocument/2006/customXml" ds:itemID="{B0F0A9FC-709C-44E3-B335-FB176817B2D7}">
+  <ds:schemaRefs>
+    <ds:schemaRef ds:uri="http://schemas.openxmlformats.org/officeDocument/2006/bibliography"/>
+  </ds:schemaRefs>
+</ds:datastoreItem>
 </file>
</xml_diff>

<commit_message>
add 20260325-20260326 Internship Report
</commit_message>
<xml_diff>
--- a/周子用-實習報告.docx
+++ b/周子用-實習報告.docx
@@ -136,14 +136,12 @@
             <w:pPr>
               <w:jc w:val="center"/>
             </w:pPr>
-            <w:proofErr w:type="gramStart"/>
             <w:r>
               <w:rPr>
                 <w:rFonts w:hint="eastAsia"/>
               </w:rPr>
               <w:t>一</w:t>
             </w:r>
-            <w:proofErr w:type="gramEnd"/>
           </w:p>
         </w:tc>
         <w:tc>
@@ -858,7 +856,6 @@
               </w:rPr>
               <w:t>（</w:t>
             </w:r>
-            <w:proofErr w:type="spellStart"/>
             <w:r>
               <w:rPr>
                 <w:rFonts w:hint="eastAsia"/>
@@ -866,19 +863,7 @@
               <w:t>T</w:t>
             </w:r>
             <w:r>
-              <w:t>oDo</w:t>
-            </w:r>
-            <w:proofErr w:type="spellEnd"/>
-            <w:r>
-              <w:t xml:space="preserve"> Application, </w:t>
-            </w:r>
-            <w:proofErr w:type="spellStart"/>
-            <w:r>
-              <w:t>BookStore</w:t>
-            </w:r>
-            <w:proofErr w:type="spellEnd"/>
-            <w:r>
-              <w:t xml:space="preserve"> Application</w:t>
+              <w:t>oDo Application, BookStore Application</w:t>
             </w:r>
             <w:r>
               <w:rPr>
@@ -2476,15 +2461,7 @@
               <w:t>JSON API</w:t>
             </w:r>
             <w:r>
-              <w:t xml:space="preserve">, how to use </w:t>
-            </w:r>
-            <w:proofErr w:type="spellStart"/>
-            <w:r>
-              <w:t>Stimulsoft</w:t>
-            </w:r>
-            <w:proofErr w:type="spellEnd"/>
-            <w:r>
-              <w:t xml:space="preserve"> </w:t>
+              <w:t xml:space="preserve">, how to use Stimulsoft </w:t>
             </w:r>
             <w:r>
               <w:t xml:space="preserve">Report </w:t>
@@ -2582,6 +2559,47 @@
               </w:numPr>
               <w:ind w:left="360"/>
             </w:pPr>
+            <w:r>
+              <w:t>Using Stimulsoft Report Designer to generate 2 reports.</w:t>
+            </w:r>
+          </w:p>
+          <w:p>
+            <w:pPr>
+              <w:pStyle w:val="ListParagraph"/>
+              <w:numPr>
+                <w:ilvl w:val="0"/>
+                <w:numId w:val="1"/>
+              </w:numPr>
+              <w:ind w:left="360"/>
+            </w:pPr>
+            <w:r>
+              <w:t>O</w:t>
+            </w:r>
+            <w:r>
+              <w:rPr>
+                <w:rFonts w:hint="eastAsia"/>
+              </w:rPr>
+              <w:t>nl</w:t>
+            </w:r>
+            <w:r>
+              <w:t>ine Meeting</w:t>
+            </w:r>
+            <w:r>
+              <w:t>.</w:t>
+            </w:r>
+          </w:p>
+          <w:p>
+            <w:pPr>
+              <w:pStyle w:val="ListParagraph"/>
+              <w:numPr>
+                <w:ilvl w:val="0"/>
+                <w:numId w:val="1"/>
+              </w:numPr>
+              <w:ind w:left="360"/>
+            </w:pPr>
+            <w:r>
+              <w:t>Summary the online meeting and create powerpoint.</w:t>
+            </w:r>
           </w:p>
         </w:tc>
       </w:tr>
@@ -2672,6 +2690,24 @@
               </w:numPr>
               <w:ind w:left="360"/>
             </w:pPr>
+            <w:r>
+              <w:t>Using Stimulsoft Report Designer to generate 8 reports</w:t>
+            </w:r>
+            <w:r>
+              <w:t xml:space="preserve"> </w:t>
+            </w:r>
+            <w:r>
+              <w:rPr>
+                <w:rFonts w:hint="eastAsia"/>
+              </w:rPr>
+              <w:t>a</w:t>
+            </w:r>
+            <w:r>
+              <w:t>nd push it into GitHub repository</w:t>
+            </w:r>
+            <w:r>
+              <w:t>.</w:t>
+            </w:r>
           </w:p>
         </w:tc>
       </w:tr>
@@ -2775,9 +2811,6 @@
           <w:p>
             <w:pPr>
               <w:jc w:val="center"/>
-              <w:rPr>
-                <w:rFonts w:hint="eastAsia"/>
-              </w:rPr>
             </w:pPr>
             <w:r>
               <w:rPr>
@@ -2827,9 +2860,6 @@
           <w:p>
             <w:pPr>
               <w:jc w:val="center"/>
-              <w:rPr>
-                <w:rFonts w:hint="eastAsia"/>
-              </w:rPr>
             </w:pPr>
             <w:r>
               <w:t>(</w:t>
@@ -2914,9 +2944,6 @@
           <w:p>
             <w:pPr>
               <w:jc w:val="center"/>
-              <w:rPr>
-                <w:rFonts w:hint="eastAsia"/>
-              </w:rPr>
             </w:pPr>
             <w:r>
               <w:rPr>
@@ -2986,10 +3013,7 @@
               <w:t>/</w:t>
             </w:r>
             <w:r>
-              <w:t>0</w:t>
-            </w:r>
-            <w:r>
-              <w:t>4</w:t>
+              <w:t>04</w:t>
             </w:r>
             <w:r>
               <w:rPr>
@@ -3010,9 +3034,6 @@
           <w:p>
             <w:pPr>
               <w:jc w:val="center"/>
-              <w:rPr>
-                <w:rFonts w:hint="eastAsia"/>
-              </w:rPr>
             </w:pPr>
             <w:r>
               <w:rPr>
@@ -3091,24 +3112,18 @@
               <w:t>/</w:t>
             </w:r>
             <w:r>
-              <w:t>0</w:t>
-            </w:r>
-            <w:r>
-              <w:t>2</w:t>
-            </w:r>
-          </w:p>
-        </w:tc>
-        <w:tc>
-          <w:tcPr>
-            <w:tcW w:w="0" w:type="auto"/>
-            <w:vAlign w:val="center"/>
-          </w:tcPr>
-          <w:p>
-            <w:pPr>
-              <w:jc w:val="center"/>
-              <w:rPr>
-                <w:rFonts w:hint="eastAsia"/>
-              </w:rPr>
+              <w:t>02</w:t>
+            </w:r>
+          </w:p>
+        </w:tc>
+        <w:tc>
+          <w:tcPr>
+            <w:tcW w:w="0" w:type="auto"/>
+            <w:vAlign w:val="center"/>
+          </w:tcPr>
+          <w:p>
+            <w:pPr>
+              <w:jc w:val="center"/>
             </w:pPr>
             <w:r>
               <w:rPr>
@@ -3187,24 +3202,18 @@
               <w:t>/</w:t>
             </w:r>
             <w:r>
-              <w:t>0</w:t>
-            </w:r>
-            <w:r>
-              <w:t>3</w:t>
-            </w:r>
-          </w:p>
-        </w:tc>
-        <w:tc>
-          <w:tcPr>
-            <w:tcW w:w="0" w:type="auto"/>
-            <w:vAlign w:val="center"/>
-          </w:tcPr>
-          <w:p>
-            <w:pPr>
-              <w:jc w:val="center"/>
-              <w:rPr>
-                <w:rFonts w:hint="eastAsia"/>
-              </w:rPr>
+              <w:t>03</w:t>
+            </w:r>
+          </w:p>
+        </w:tc>
+        <w:tc>
+          <w:tcPr>
+            <w:tcW w:w="0" w:type="auto"/>
+            <w:vAlign w:val="center"/>
+          </w:tcPr>
+          <w:p>
+            <w:pPr>
+              <w:jc w:val="center"/>
             </w:pPr>
             <w:r>
               <w:rPr>

</xml_diff>

<commit_message>
add 20260330 Internship Report
</commit_message>
<xml_diff>
--- a/周子用-實習報告.docx
+++ b/周子用-實習報告.docx
@@ -628,7 +628,6 @@
               <w:t>.</w:t>
             </w:r>
           </w:p>
-          <w:p/>
         </w:tc>
       </w:tr>
       <w:tr>
@@ -749,7 +748,6 @@
               <w:t>.</w:t>
             </w:r>
           </w:p>
-          <w:p/>
         </w:tc>
       </w:tr>
       <w:tr>
@@ -1471,109 +1469,109 @@
               <w:rPr>
                 <w:rFonts w:hint="eastAsia"/>
               </w:rPr>
+              <w:t>三</w:t>
+            </w:r>
+          </w:p>
+        </w:tc>
+        <w:tc>
+          <w:tcPr>
+            <w:tcW w:w="0" w:type="auto"/>
+            <w:vAlign w:val="center"/>
+          </w:tcPr>
+          <w:p>
+            <w:pPr>
+              <w:jc w:val="center"/>
+            </w:pPr>
+            <w:r>
+              <w:t>2026</w:t>
+            </w:r>
+            <w:r>
+              <w:rPr>
+                <w:rFonts w:hint="eastAsia"/>
+              </w:rPr>
+              <w:t>/</w:t>
+            </w:r>
+            <w:r>
+              <w:t>03</w:t>
+            </w:r>
+            <w:r>
+              <w:rPr>
+                <w:rFonts w:hint="eastAsia"/>
+              </w:rPr>
+              <w:t>/</w:t>
+            </w:r>
+            <w:r>
+              <w:t>16</w:t>
+            </w:r>
+          </w:p>
+        </w:tc>
+        <w:tc>
+          <w:tcPr>
+            <w:tcW w:w="0" w:type="auto"/>
+            <w:vAlign w:val="center"/>
+          </w:tcPr>
+          <w:p>
+            <w:pPr>
+              <w:jc w:val="center"/>
+            </w:pPr>
+            <w:r>
+              <w:t>(</w:t>
+            </w:r>
+            <w:r>
+              <w:rPr>
+                <w:rFonts w:hint="eastAsia"/>
+              </w:rPr>
+              <w:t>一</w:t>
+            </w:r>
+            <w:r>
+              <w:t>)</w:t>
+            </w:r>
+          </w:p>
+        </w:tc>
+        <w:tc>
+          <w:tcPr>
+            <w:tcW w:w="0" w:type="auto"/>
+          </w:tcPr>
+          <w:p>
+            <w:pPr>
+              <w:pStyle w:val="ListParagraph"/>
+              <w:numPr>
+                <w:ilvl w:val="0"/>
+                <w:numId w:val="1"/>
+              </w:numPr>
+              <w:ind w:left="360"/>
+            </w:pPr>
+            <w:r>
+              <w:t>Meeting</w:t>
+            </w:r>
+            <w:r>
+              <w:t>.</w:t>
+            </w:r>
+          </w:p>
+          <w:p>
+            <w:pPr>
+              <w:pStyle w:val="ListParagraph"/>
+              <w:numPr>
+                <w:ilvl w:val="0"/>
+                <w:numId w:val="1"/>
+              </w:numPr>
+              <w:ind w:left="360"/>
+            </w:pPr>
+            <w:r>
+              <w:t>Trying to understand the meeting and create the power point report about the meeting and the daily task.</w:t>
+            </w:r>
+          </w:p>
+          <w:p>
+            <w:pPr>
+              <w:pStyle w:val="ListParagraph"/>
+              <w:numPr>
+                <w:ilvl w:val="0"/>
+                <w:numId w:val="1"/>
+              </w:numPr>
+              <w:ind w:left="360"/>
+            </w:pPr>
+            <w:r>
               <w:lastRenderedPageBreak/>
-              <w:t>三</w:t>
-            </w:r>
-          </w:p>
-        </w:tc>
-        <w:tc>
-          <w:tcPr>
-            <w:tcW w:w="0" w:type="auto"/>
-            <w:vAlign w:val="center"/>
-          </w:tcPr>
-          <w:p>
-            <w:pPr>
-              <w:jc w:val="center"/>
-            </w:pPr>
-            <w:r>
-              <w:t>2026</w:t>
-            </w:r>
-            <w:r>
-              <w:rPr>
-                <w:rFonts w:hint="eastAsia"/>
-              </w:rPr>
-              <w:t>/</w:t>
-            </w:r>
-            <w:r>
-              <w:t>03</w:t>
-            </w:r>
-            <w:r>
-              <w:rPr>
-                <w:rFonts w:hint="eastAsia"/>
-              </w:rPr>
-              <w:t>/</w:t>
-            </w:r>
-            <w:r>
-              <w:t>16</w:t>
-            </w:r>
-          </w:p>
-        </w:tc>
-        <w:tc>
-          <w:tcPr>
-            <w:tcW w:w="0" w:type="auto"/>
-            <w:vAlign w:val="center"/>
-          </w:tcPr>
-          <w:p>
-            <w:pPr>
-              <w:jc w:val="center"/>
-            </w:pPr>
-            <w:r>
-              <w:t>(</w:t>
-            </w:r>
-            <w:r>
-              <w:rPr>
-                <w:rFonts w:hint="eastAsia"/>
-              </w:rPr>
-              <w:t>一</w:t>
-            </w:r>
-            <w:r>
-              <w:t>)</w:t>
-            </w:r>
-          </w:p>
-        </w:tc>
-        <w:tc>
-          <w:tcPr>
-            <w:tcW w:w="0" w:type="auto"/>
-          </w:tcPr>
-          <w:p>
-            <w:pPr>
-              <w:pStyle w:val="ListParagraph"/>
-              <w:numPr>
-                <w:ilvl w:val="0"/>
-                <w:numId w:val="1"/>
-              </w:numPr>
-              <w:ind w:left="360"/>
-            </w:pPr>
-            <w:r>
-              <w:t>Meeting</w:t>
-            </w:r>
-            <w:r>
-              <w:t>.</w:t>
-            </w:r>
-          </w:p>
-          <w:p>
-            <w:pPr>
-              <w:pStyle w:val="ListParagraph"/>
-              <w:numPr>
-                <w:ilvl w:val="0"/>
-                <w:numId w:val="1"/>
-              </w:numPr>
-              <w:ind w:left="360"/>
-            </w:pPr>
-            <w:r>
-              <w:t>Trying to understand the meeting and create the power point report about the meeting and the daily task.</w:t>
-            </w:r>
-          </w:p>
-          <w:p>
-            <w:pPr>
-              <w:pStyle w:val="ListParagraph"/>
-              <w:numPr>
-                <w:ilvl w:val="0"/>
-                <w:numId w:val="1"/>
-              </w:numPr>
-              <w:ind w:left="360"/>
-            </w:pPr>
-            <w:r>
               <w:t>Create a power point about planning the data seeding with using company data.</w:t>
             </w:r>
           </w:p>
@@ -2266,11 +2264,208 @@
                 <w:ilvl w:val="0"/>
                 <w:numId w:val="2"/>
               </w:numPr>
+              <w:spacing w:line="259" w:lineRule="auto"/>
+              <w:ind w:left="1080"/>
+            </w:pPr>
+            <w:r>
+              <w:t>Bugs fix.</w:t>
+            </w:r>
+          </w:p>
+        </w:tc>
+      </w:tr>
+      <w:tr>
+        <w:tc>
+          <w:tcPr>
+            <w:tcW w:w="0" w:type="auto"/>
+            <w:vMerge/>
+            <w:vAlign w:val="center"/>
+          </w:tcPr>
+          <w:p>
+            <w:pPr>
+              <w:jc w:val="center"/>
+            </w:pPr>
+          </w:p>
+        </w:tc>
+        <w:tc>
+          <w:tcPr>
+            <w:tcW w:w="0" w:type="auto"/>
+            <w:vAlign w:val="center"/>
+          </w:tcPr>
+          <w:p>
+            <w:pPr>
+              <w:jc w:val="center"/>
+            </w:pPr>
+            <w:r>
+              <w:t>2026</w:t>
+            </w:r>
+            <w:r>
+              <w:rPr>
+                <w:rFonts w:hint="eastAsia"/>
+              </w:rPr>
+              <w:t>/</w:t>
+            </w:r>
+            <w:r>
+              <w:t>03</w:t>
+            </w:r>
+            <w:r>
+              <w:rPr>
+                <w:rFonts w:hint="eastAsia"/>
+              </w:rPr>
+              <w:t>/</w:t>
+            </w:r>
+            <w:r>
+              <w:t>24</w:t>
+            </w:r>
+          </w:p>
+        </w:tc>
+        <w:tc>
+          <w:tcPr>
+            <w:tcW w:w="0" w:type="auto"/>
+            <w:vAlign w:val="center"/>
+          </w:tcPr>
+          <w:p>
+            <w:pPr>
+              <w:jc w:val="center"/>
+            </w:pPr>
+            <w:r>
+              <w:rPr>
+                <w:rFonts w:hint="eastAsia"/>
+              </w:rPr>
+              <w:t>(</w:t>
+            </w:r>
+            <w:r>
+              <w:rPr>
+                <w:rFonts w:hint="eastAsia"/>
+              </w:rPr>
+              <w:t>二</w:t>
+            </w:r>
+            <w:r>
+              <w:rPr>
+                <w:rFonts w:hint="eastAsia"/>
+              </w:rPr>
+              <w:t>)</w:t>
+            </w:r>
+          </w:p>
+        </w:tc>
+        <w:tc>
+          <w:tcPr>
+            <w:tcW w:w="0" w:type="auto"/>
+          </w:tcPr>
+          <w:p>
+            <w:pPr>
+              <w:pStyle w:val="ListParagraph"/>
+              <w:numPr>
+                <w:ilvl w:val="0"/>
+                <w:numId w:val="1"/>
+              </w:numPr>
+              <w:spacing w:after="160" w:line="259" w:lineRule="auto"/>
+              <w:ind w:left="360"/>
+            </w:pPr>
+            <w:r>
+              <w:t>Continue to self-l</w:t>
+            </w:r>
+            <w:r>
+              <w:rPr>
+                <w:rFonts w:hint="eastAsia"/>
+              </w:rPr>
+              <w:t>ea</w:t>
+            </w:r>
+            <w:r>
+              <w:t xml:space="preserve">rn Data Seeding Implementation with ABP Framework, adding some feature to seed data from imported </w:t>
+            </w:r>
+            <w:r>
+              <w:t>CSV</w:t>
+            </w:r>
+            <w:r>
+              <w:t xml:space="preserve"> file from the UI.</w:t>
+            </w:r>
+          </w:p>
+          <w:p>
+            <w:pPr>
+              <w:pStyle w:val="ListParagraph"/>
+              <w:numPr>
+                <w:ilvl w:val="0"/>
+                <w:numId w:val="2"/>
+              </w:numPr>
               <w:spacing w:after="160" w:line="259" w:lineRule="auto"/>
               <w:ind w:left="1080"/>
             </w:pPr>
             <w:r>
+              <w:t xml:space="preserve">Adding some feature </w:t>
+            </w:r>
+            <w:r>
+              <w:t>to see list of data which has been deleted (</w:t>
+            </w:r>
+            <w:r>
+              <w:rPr>
+                <w:rFonts w:hint="eastAsia"/>
+              </w:rPr>
+              <w:t>soft</w:t>
+            </w:r>
+            <w:r>
+              <w:t>-deletes)</w:t>
+            </w:r>
+            <w:r>
+              <w:t>.</w:t>
+            </w:r>
+          </w:p>
+          <w:p>
+            <w:pPr>
+              <w:pStyle w:val="ListParagraph"/>
+              <w:numPr>
+                <w:ilvl w:val="0"/>
+                <w:numId w:val="2"/>
+              </w:numPr>
+              <w:spacing w:after="160" w:line="259" w:lineRule="auto"/>
+              <w:ind w:left="1080"/>
+            </w:pPr>
+            <w:r>
               <w:t>Bugs fix.</w:t>
+            </w:r>
+          </w:p>
+          <w:p>
+            <w:pPr>
+              <w:pStyle w:val="ListParagraph"/>
+              <w:numPr>
+                <w:ilvl w:val="0"/>
+                <w:numId w:val="2"/>
+              </w:numPr>
+              <w:spacing w:after="160" w:line="259" w:lineRule="auto"/>
+              <w:ind w:left="1080"/>
+            </w:pPr>
+            <w:r>
+              <w:t>Merge Branch</w:t>
+            </w:r>
+            <w:r>
+              <w:t>.</w:t>
+            </w:r>
+          </w:p>
+          <w:p>
+            <w:pPr>
+              <w:pStyle w:val="ListParagraph"/>
+              <w:numPr>
+                <w:ilvl w:val="0"/>
+                <w:numId w:val="1"/>
+              </w:numPr>
+              <w:ind w:left="360"/>
+            </w:pPr>
+            <w:r>
+              <w:t xml:space="preserve">Learn to make </w:t>
+            </w:r>
+            <w:r>
+              <w:t xml:space="preserve">Mock </w:t>
+            </w:r>
+            <w:r>
+              <w:t>JSON API</w:t>
+            </w:r>
+            <w:r>
+              <w:t xml:space="preserve">, how to use Stimulsoft </w:t>
+            </w:r>
+            <w:r>
+              <w:t xml:space="preserve">Report </w:t>
+            </w:r>
+            <w:r>
+              <w:t>Designer.</w:t>
             </w:r>
           </w:p>
         </w:tc>
@@ -2316,7 +2511,7 @@
               <w:t>/</w:t>
             </w:r>
             <w:r>
-              <w:t>24</w:t>
+              <w:t>25</w:t>
             </w:r>
           </w:p>
         </w:tc>
@@ -2339,7 +2534,7 @@
               <w:rPr>
                 <w:rFonts w:hint="eastAsia"/>
               </w:rPr>
-              <w:t>二</w:t>
+              <w:t>三</w:t>
             </w:r>
             <w:r>
               <w:rPr>
@@ -2360,52 +2555,32 @@
                 <w:ilvl w:val="0"/>
                 <w:numId w:val="1"/>
               </w:numPr>
-              <w:spacing w:after="160" w:line="259" w:lineRule="auto"/>
               <w:ind w:left="360"/>
             </w:pPr>
             <w:r>
-              <w:t>Continue to self-l</w:t>
-            </w:r>
-            <w:r>
-              <w:rPr>
-                <w:rFonts w:hint="eastAsia"/>
-              </w:rPr>
-              <w:t>ea</w:t>
-            </w:r>
-            <w:r>
-              <w:t xml:space="preserve">rn Data Seeding Implementation with ABP Framework, adding some feature to seed data from imported </w:t>
-            </w:r>
-            <w:r>
-              <w:t>CSV</w:t>
-            </w:r>
-            <w:r>
-              <w:t xml:space="preserve"> file from the UI.</w:t>
-            </w:r>
-          </w:p>
-          <w:p>
-            <w:pPr>
-              <w:pStyle w:val="ListParagraph"/>
-              <w:numPr>
-                <w:ilvl w:val="0"/>
-                <w:numId w:val="2"/>
-              </w:numPr>
-              <w:spacing w:after="160" w:line="259" w:lineRule="auto"/>
-              <w:ind w:left="1080"/>
-            </w:pPr>
-            <w:r>
-              <w:t xml:space="preserve">Adding some feature </w:t>
-            </w:r>
-            <w:r>
-              <w:t>to see list of data which has been deleted (</w:t>
-            </w:r>
-            <w:r>
-              <w:rPr>
-                <w:rFonts w:hint="eastAsia"/>
-              </w:rPr>
-              <w:t>soft</w:t>
-            </w:r>
-            <w:r>
-              <w:t>-deletes)</w:t>
+              <w:t>Using Stimulsoft Report Designer to generate 2 reports.</w:t>
+            </w:r>
+          </w:p>
+          <w:p>
+            <w:pPr>
+              <w:pStyle w:val="ListParagraph"/>
+              <w:numPr>
+                <w:ilvl w:val="0"/>
+                <w:numId w:val="1"/>
+              </w:numPr>
+              <w:ind w:left="360"/>
+            </w:pPr>
+            <w:r>
+              <w:t>O</w:t>
+            </w:r>
+            <w:r>
+              <w:rPr>
+                <w:rFonts w:hint="eastAsia"/>
+              </w:rPr>
+              <w:t>nl</w:t>
+            </w:r>
+            <w:r>
+              <w:t>ine Meeting</w:t>
             </w:r>
             <w:r>
               <w:t>.</w:t>
@@ -2416,58 +2591,12 @@
               <w:pStyle w:val="ListParagraph"/>
               <w:numPr>
                 <w:ilvl w:val="0"/>
-                <w:numId w:val="2"/>
-              </w:numPr>
-              <w:spacing w:after="160" w:line="259" w:lineRule="auto"/>
-              <w:ind w:left="1080"/>
-            </w:pPr>
-            <w:r>
-              <w:t>Bugs fix.</w:t>
-            </w:r>
-          </w:p>
-          <w:p>
-            <w:pPr>
-              <w:pStyle w:val="ListParagraph"/>
-              <w:numPr>
-                <w:ilvl w:val="0"/>
-                <w:numId w:val="2"/>
-              </w:numPr>
-              <w:spacing w:after="160" w:line="259" w:lineRule="auto"/>
-              <w:ind w:left="1080"/>
-            </w:pPr>
-            <w:r>
-              <w:t>Merge Branch</w:t>
-            </w:r>
-            <w:r>
-              <w:t>.</w:t>
-            </w:r>
-          </w:p>
-          <w:p>
-            <w:pPr>
-              <w:pStyle w:val="ListParagraph"/>
-              <w:numPr>
-                <w:ilvl w:val="0"/>
                 <w:numId w:val="1"/>
               </w:numPr>
               <w:ind w:left="360"/>
             </w:pPr>
             <w:r>
-              <w:t xml:space="preserve">Learn to make </w:t>
-            </w:r>
-            <w:r>
-              <w:t xml:space="preserve">Mock </w:t>
-            </w:r>
-            <w:r>
-              <w:t>JSON API</w:t>
-            </w:r>
-            <w:r>
-              <w:t xml:space="preserve">, how to use Stimulsoft </w:t>
-            </w:r>
-            <w:r>
-              <w:t xml:space="preserve">Report </w:t>
-            </w:r>
-            <w:r>
-              <w:t>Designer.</w:t>
+              <w:t>Summary the online meeting and create powerpoint.</w:t>
             </w:r>
           </w:p>
         </w:tc>
@@ -2513,7 +2642,7 @@
               <w:t>/</w:t>
             </w:r>
             <w:r>
-              <w:t>25</w:t>
+              <w:t>26</w:t>
             </w:r>
           </w:p>
         </w:tc>
@@ -2536,7 +2665,7 @@
               <w:rPr>
                 <w:rFonts w:hint="eastAsia"/>
               </w:rPr>
-              <w:t>三</w:t>
+              <w:t>四</w:t>
             </w:r>
             <w:r>
               <w:rPr>
@@ -2560,45 +2689,22 @@
               <w:ind w:left="360"/>
             </w:pPr>
             <w:r>
-              <w:t>Using Stimulsoft Report Designer to generate 2 reports.</w:t>
-            </w:r>
-          </w:p>
-          <w:p>
-            <w:pPr>
-              <w:pStyle w:val="ListParagraph"/>
-              <w:numPr>
-                <w:ilvl w:val="0"/>
-                <w:numId w:val="1"/>
-              </w:numPr>
-              <w:ind w:left="360"/>
-            </w:pPr>
-            <w:r>
-              <w:t>O</w:t>
-            </w:r>
-            <w:r>
-              <w:rPr>
-                <w:rFonts w:hint="eastAsia"/>
-              </w:rPr>
-              <w:t>nl</w:t>
-            </w:r>
-            <w:r>
-              <w:t>ine Meeting</w:t>
+              <w:t>Using Stimulsoft Report Designer to generate 8 reports</w:t>
+            </w:r>
+            <w:r>
+              <w:t xml:space="preserve"> </w:t>
+            </w:r>
+            <w:r>
+              <w:rPr>
+                <w:rFonts w:hint="eastAsia"/>
+              </w:rPr>
+              <w:t>a</w:t>
+            </w:r>
+            <w:r>
+              <w:t>nd push it into GitHub repository</w:t>
             </w:r>
             <w:r>
               <w:t>.</w:t>
-            </w:r>
-          </w:p>
-          <w:p>
-            <w:pPr>
-              <w:pStyle w:val="ListParagraph"/>
-              <w:numPr>
-                <w:ilvl w:val="0"/>
-                <w:numId w:val="1"/>
-              </w:numPr>
-              <w:ind w:left="360"/>
-            </w:pPr>
-            <w:r>
-              <w:t>Summary the online meeting and create powerpoint.</w:t>
             </w:r>
           </w:p>
         </w:tc>
@@ -2644,7 +2750,7 @@
               <w:t>/</w:t>
             </w:r>
             <w:r>
-              <w:t>26</w:t>
+              <w:t>27</w:t>
             </w:r>
           </w:p>
         </w:tc>
@@ -2667,7 +2773,7 @@
               <w:rPr>
                 <w:rFonts w:hint="eastAsia"/>
               </w:rPr>
-              <w:t>四</w:t>
+              <w:t>五</w:t>
             </w:r>
             <w:r>
               <w:rPr>
@@ -2691,22 +2797,35 @@
               <w:ind w:left="360"/>
             </w:pPr>
             <w:r>
-              <w:t>Using Stimulsoft Report Designer to generate 8 reports</w:t>
+              <w:t>List the finished generate reports</w:t>
+            </w:r>
+            <w:r>
+              <w:t>.</w:t>
+            </w:r>
+          </w:p>
+          <w:p>
+            <w:pPr>
+              <w:pStyle w:val="ListParagraph"/>
+              <w:numPr>
+                <w:ilvl w:val="0"/>
+                <w:numId w:val="1"/>
+              </w:numPr>
+              <w:ind w:left="360"/>
+            </w:pPr>
+            <w:r>
+              <w:t xml:space="preserve">Learn to implement </w:t>
+            </w:r>
+            <w:r>
+              <w:t xml:space="preserve">coded </w:t>
+            </w:r>
+            <w:r>
+              <w:t>generate reports in PDF format</w:t>
+            </w:r>
+            <w:r>
+              <w:t>.</w:t>
             </w:r>
             <w:r>
               <w:t xml:space="preserve"> </w:t>
-            </w:r>
-            <w:r>
-              <w:rPr>
-                <w:rFonts w:hint="eastAsia"/>
-              </w:rPr>
-              <w:t>a</w:t>
-            </w:r>
-            <w:r>
-              <w:t>nd push it into GitHub repository</w:t>
-            </w:r>
-            <w:r>
-              <w:t>.</w:t>
             </w:r>
           </w:p>
         </w:tc>
@@ -2715,13 +2834,19 @@
         <w:tc>
           <w:tcPr>
             <w:tcW w:w="0" w:type="auto"/>
-            <w:vMerge/>
-            <w:vAlign w:val="center"/>
-          </w:tcPr>
-          <w:p>
-            <w:pPr>
-              <w:jc w:val="center"/>
-            </w:pPr>
+            <w:vMerge w:val="restart"/>
+            <w:vAlign w:val="center"/>
+          </w:tcPr>
+          <w:p>
+            <w:pPr>
+              <w:jc w:val="center"/>
+            </w:pPr>
+            <w:r>
+              <w:rPr>
+                <w:rFonts w:hint="eastAsia"/>
+              </w:rPr>
+              <w:t>伍</w:t>
+            </w:r>
           </w:p>
         </w:tc>
         <w:tc>
@@ -2752,35 +2877,29 @@
               <w:t>/</w:t>
             </w:r>
             <w:r>
-              <w:t>27</w:t>
-            </w:r>
-          </w:p>
-        </w:tc>
-        <w:tc>
-          <w:tcPr>
-            <w:tcW w:w="0" w:type="auto"/>
-            <w:vAlign w:val="center"/>
-          </w:tcPr>
-          <w:p>
-            <w:pPr>
-              <w:jc w:val="center"/>
-            </w:pPr>
-            <w:r>
-              <w:rPr>
-                <w:rFonts w:hint="eastAsia"/>
-              </w:rPr>
+              <w:t>30</w:t>
+            </w:r>
+          </w:p>
+        </w:tc>
+        <w:tc>
+          <w:tcPr>
+            <w:tcW w:w="0" w:type="auto"/>
+            <w:vAlign w:val="center"/>
+          </w:tcPr>
+          <w:p>
+            <w:pPr>
+              <w:jc w:val="center"/>
+            </w:pPr>
+            <w:r>
               <w:t>(</w:t>
             </w:r>
             <w:r>
               <w:rPr>
                 <w:rFonts w:hint="eastAsia"/>
               </w:rPr>
-              <w:t>五</w:t>
-            </w:r>
-            <w:r>
-              <w:rPr>
-                <w:rFonts w:hint="eastAsia"/>
-              </w:rPr>
+              <w:t>一</w:t>
+            </w:r>
+            <w:r>
               <w:t>)</w:t>
             </w:r>
           </w:p>
@@ -2799,10 +2918,10 @@
               <w:ind w:left="360"/>
             </w:pPr>
             <w:r>
-              <w:t>List the finished generate reports</w:t>
-            </w:r>
-            <w:r>
-              <w:t>.</w:t>
+              <w:t>Clone and l</w:t>
+            </w:r>
+            <w:r>
+              <w:t>earn the coding style of a project that has been developed by the company, and get familiar with some parts of the project features.</w:t>
             </w:r>
           </w:p>
           <w:p>
@@ -2815,111 +2934,8 @@
               <w:ind w:left="360"/>
             </w:pPr>
             <w:r>
-              <w:t xml:space="preserve">Learn to implement </w:t>
-            </w:r>
-            <w:r>
-              <w:t xml:space="preserve">coded </w:t>
-            </w:r>
-            <w:r>
-              <w:t>generate reports in PDF format</w:t>
-            </w:r>
-            <w:r>
-              <w:t>.</w:t>
-            </w:r>
-            <w:r>
-              <w:t xml:space="preserve"> </w:t>
-            </w:r>
-          </w:p>
-        </w:tc>
-      </w:tr>
-      <w:tr>
-        <w:tc>
-          <w:tcPr>
-            <w:tcW w:w="0" w:type="auto"/>
-            <w:vMerge w:val="restart"/>
-            <w:vAlign w:val="center"/>
-          </w:tcPr>
-          <w:p>
-            <w:pPr>
-              <w:jc w:val="center"/>
-            </w:pPr>
-            <w:r>
-              <w:rPr>
-                <w:rFonts w:hint="eastAsia"/>
-              </w:rPr>
-              <w:lastRenderedPageBreak/>
-              <w:t>伍</w:t>
-            </w:r>
-          </w:p>
-        </w:tc>
-        <w:tc>
-          <w:tcPr>
-            <w:tcW w:w="0" w:type="auto"/>
-            <w:vAlign w:val="center"/>
-          </w:tcPr>
-          <w:p>
-            <w:pPr>
-              <w:jc w:val="center"/>
-            </w:pPr>
-            <w:r>
-              <w:t>2026</w:t>
-            </w:r>
-            <w:r>
-              <w:rPr>
-                <w:rFonts w:hint="eastAsia"/>
-              </w:rPr>
-              <w:t>/</w:t>
-            </w:r>
-            <w:r>
-              <w:t>03</w:t>
-            </w:r>
-            <w:r>
-              <w:rPr>
-                <w:rFonts w:hint="eastAsia"/>
-              </w:rPr>
-              <w:t>/</w:t>
-            </w:r>
-            <w:r>
-              <w:t>30</w:t>
-            </w:r>
-          </w:p>
-        </w:tc>
-        <w:tc>
-          <w:tcPr>
-            <w:tcW w:w="0" w:type="auto"/>
-            <w:vAlign w:val="center"/>
-          </w:tcPr>
-          <w:p>
-            <w:pPr>
-              <w:jc w:val="center"/>
-            </w:pPr>
-            <w:r>
-              <w:t>(</w:t>
-            </w:r>
-            <w:r>
-              <w:rPr>
-                <w:rFonts w:hint="eastAsia"/>
-              </w:rPr>
-              <w:t>一</w:t>
-            </w:r>
-            <w:r>
-              <w:t>)</w:t>
-            </w:r>
-          </w:p>
-        </w:tc>
-        <w:tc>
-          <w:tcPr>
-            <w:tcW w:w="0" w:type="auto"/>
-          </w:tcPr>
-          <w:p>
-            <w:pPr>
-              <w:pStyle w:val="ListParagraph"/>
-              <w:numPr>
-                <w:ilvl w:val="0"/>
-                <w:numId w:val="1"/>
-              </w:numPr>
-              <w:ind w:left="360"/>
-            </w:pPr>
+              <w:t>Generate 2 reports with Stimulsoft Report Designer.</w:t>
+            </w:r>
           </w:p>
         </w:tc>
       </w:tr>

</xml_diff>

<commit_message>
add 20260401-20260402 Internship Report
</commit_message>
<xml_diff>
--- a/周子用-實習報告.docx
+++ b/周子用-實習報告.docx
@@ -6,45 +6,53 @@
       <w:pPr>
         <w:jc w:val="center"/>
         <w:rPr>
+          <w:rFonts w:cs="Times New Roman"/>
+          <w:b/>
+          <w:bCs/>
           <w:lang w:eastAsia="zh-TW"/>
         </w:rPr>
       </w:pPr>
       <w:r>
         <w:rPr>
-          <w:rFonts w:hint="eastAsia"/>
+          <w:rFonts w:cs="Times New Roman"/>
+          <w:b/>
+          <w:bCs/>
           <w:lang w:eastAsia="zh-TW"/>
         </w:rPr>
         <w:t>豐碩資訊有限公司</w:t>
       </w:r>
       <w:r>
         <w:rPr>
+          <w:rFonts w:cs="Times New Roman"/>
+          <w:b/>
+          <w:bCs/>
           <w:lang w:eastAsia="zh-TW"/>
         </w:rPr>
         <w:br/>
       </w:r>
       <w:r>
         <w:rPr>
-          <w:rFonts w:hint="eastAsia"/>
+          <w:rFonts w:cs="Times New Roman"/>
+          <w:b/>
+          <w:bCs/>
           <w:lang w:eastAsia="zh-TW"/>
         </w:rPr>
         <w:t>周子用</w:t>
       </w:r>
       <w:r>
         <w:rPr>
-          <w:rFonts w:hint="eastAsia"/>
+          <w:rFonts w:cs="Times New Roman"/>
+          <w:b/>
+          <w:bCs/>
           <w:lang w:eastAsia="zh-TW"/>
         </w:rPr>
-        <w:t xml:space="preserve"> </w:t>
+        <w:t xml:space="preserve"> - </w:t>
       </w:r>
       <w:r>
         <w:rPr>
-          <w:lang w:eastAsia="zh-TW"/>
-        </w:rPr>
-        <w:t xml:space="preserve">- </w:t>
-      </w:r>
-      <w:r>
-        <w:rPr>
-          <w:rFonts w:hint="eastAsia"/>
+          <w:rFonts w:cs="Times New Roman"/>
+          <w:b/>
+          <w:bCs/>
           <w:lang w:eastAsia="zh-TW"/>
         </w:rPr>
         <w:t>實習報告</w:t>
@@ -60,7 +68,7 @@
         <w:gridCol w:w="776"/>
         <w:gridCol w:w="1310"/>
         <w:gridCol w:w="616"/>
-        <w:gridCol w:w="6648"/>
+        <w:gridCol w:w="6314"/>
       </w:tblGrid>
       <w:tr>
         <w:tc>
@@ -846,13 +854,14 @@
               <w:ind w:left="1080"/>
             </w:pPr>
             <w:r>
-              <w:t xml:space="preserve">Trying to implement the tutorials </w:t>
-            </w:r>
-            <w:r>
-              <w:rPr>
-                <w:rFonts w:hint="eastAsia"/>
-              </w:rPr>
-              <w:t>（</w:t>
+              <w:t>Trying to implement the tutoria</w:t>
+            </w:r>
+            <w:r>
+              <w:t>ls.</w:t>
+            </w:r>
+            <w:r>
+              <w:br/>
+              <w:t>(</w:t>
             </w:r>
             <w:r>
               <w:rPr>
@@ -1571,20 +1580,20 @@
               <w:ind w:left="360"/>
             </w:pPr>
             <w:r>
+              <w:t>Create a power point about planning the data seeding with using company data.</w:t>
+            </w:r>
+          </w:p>
+          <w:p>
+            <w:pPr>
+              <w:pStyle w:val="ListParagraph"/>
+              <w:numPr>
+                <w:ilvl w:val="0"/>
+                <w:numId w:val="1"/>
+              </w:numPr>
+              <w:ind w:left="360"/>
+            </w:pPr>
+            <w:r>
               <w:lastRenderedPageBreak/>
-              <w:t>Create a power point about planning the data seeding with using company data.</w:t>
-            </w:r>
-          </w:p>
-          <w:p>
-            <w:pPr>
-              <w:pStyle w:val="ListParagraph"/>
-              <w:numPr>
-                <w:ilvl w:val="0"/>
-                <w:numId w:val="1"/>
-              </w:numPr>
-              <w:ind w:left="360"/>
-            </w:pPr>
-            <w:r>
               <w:t>Learn to implement the plan data into C# Console App.</w:t>
             </w:r>
           </w:p>
@@ -3119,6 +3128,9 @@
               </w:numPr>
               <w:ind w:left="360"/>
             </w:pPr>
+            <w:r>
+              <w:t>Continue to learn the project that has been developed by the company.</w:t>
+            </w:r>
           </w:p>
         </w:tc>
       </w:tr>
@@ -3209,6 +3221,9 @@
               </w:numPr>
               <w:ind w:left="360"/>
             </w:pPr>
+            <w:r>
+              <w:t>Continue to learn the project that has been developed by the company.</w:t>
+            </w:r>
           </w:p>
         </w:tc>
       </w:tr>
@@ -3265,6 +3280,486 @@
           <w:p>
             <w:pPr>
               <w:jc w:val="center"/>
+            </w:pPr>
+            <w:r>
+              <w:rPr>
+                <w:rFonts w:hint="eastAsia"/>
+              </w:rPr>
+              <w:t>(</w:t>
+            </w:r>
+            <w:r>
+              <w:rPr>
+                <w:rFonts w:hint="eastAsia"/>
+              </w:rPr>
+              <w:t>五</w:t>
+            </w:r>
+            <w:r>
+              <w:rPr>
+                <w:rFonts w:hint="eastAsia"/>
+              </w:rPr>
+              <w:t>)</w:t>
+            </w:r>
+          </w:p>
+        </w:tc>
+        <w:tc>
+          <w:tcPr>
+            <w:tcW w:w="0" w:type="auto"/>
+          </w:tcPr>
+          <w:p>
+            <w:pPr>
+              <w:pStyle w:val="ListParagraph"/>
+              <w:numPr>
+                <w:ilvl w:val="0"/>
+                <w:numId w:val="1"/>
+              </w:numPr>
+              <w:ind w:left="360"/>
+            </w:pPr>
+            <w:r>
+              <w:t>-</w:t>
+            </w:r>
+          </w:p>
+        </w:tc>
+      </w:tr>
+      <w:tr>
+        <w:tc>
+          <w:tcPr>
+            <w:tcW w:w="0" w:type="auto"/>
+            <w:vMerge w:val="restart"/>
+            <w:vAlign w:val="center"/>
+          </w:tcPr>
+          <w:p>
+            <w:pPr>
+              <w:jc w:val="center"/>
+            </w:pPr>
+            <w:r>
+              <w:rPr>
+                <w:rFonts w:hint="eastAsia"/>
+              </w:rPr>
+              <w:t>六</w:t>
+            </w:r>
+          </w:p>
+        </w:tc>
+        <w:tc>
+          <w:tcPr>
+            <w:tcW w:w="0" w:type="auto"/>
+            <w:vAlign w:val="center"/>
+          </w:tcPr>
+          <w:p>
+            <w:pPr>
+              <w:jc w:val="center"/>
+            </w:pPr>
+            <w:r>
+              <w:t>2026</w:t>
+            </w:r>
+            <w:r>
+              <w:rPr>
+                <w:rFonts w:hint="eastAsia"/>
+              </w:rPr>
+              <w:t>/</w:t>
+            </w:r>
+            <w:r>
+              <w:t>04</w:t>
+            </w:r>
+            <w:r>
+              <w:rPr>
+                <w:rFonts w:hint="eastAsia"/>
+              </w:rPr>
+              <w:t>/</w:t>
+            </w:r>
+            <w:r>
+              <w:t>0</w:t>
+            </w:r>
+            <w:r>
+              <w:t>6</w:t>
+            </w:r>
+          </w:p>
+        </w:tc>
+        <w:tc>
+          <w:tcPr>
+            <w:tcW w:w="0" w:type="auto"/>
+            <w:vAlign w:val="center"/>
+          </w:tcPr>
+          <w:p>
+            <w:pPr>
+              <w:jc w:val="center"/>
+              <w:rPr>
+                <w:rFonts w:hint="eastAsia"/>
+              </w:rPr>
+            </w:pPr>
+            <w:r>
+              <w:t>(</w:t>
+            </w:r>
+            <w:r>
+              <w:rPr>
+                <w:rFonts w:hint="eastAsia"/>
+              </w:rPr>
+              <w:t>一</w:t>
+            </w:r>
+            <w:r>
+              <w:t>)</w:t>
+            </w:r>
+          </w:p>
+        </w:tc>
+        <w:tc>
+          <w:tcPr>
+            <w:tcW w:w="0" w:type="auto"/>
+          </w:tcPr>
+          <w:p>
+            <w:pPr>
+              <w:pStyle w:val="ListParagraph"/>
+              <w:numPr>
+                <w:ilvl w:val="0"/>
+                <w:numId w:val="1"/>
+              </w:numPr>
+              <w:ind w:left="360"/>
+            </w:pPr>
+          </w:p>
+        </w:tc>
+      </w:tr>
+      <w:tr>
+        <w:tc>
+          <w:tcPr>
+            <w:tcW w:w="0" w:type="auto"/>
+            <w:vMerge/>
+            <w:vAlign w:val="center"/>
+          </w:tcPr>
+          <w:p>
+            <w:pPr>
+              <w:jc w:val="center"/>
+            </w:pPr>
+          </w:p>
+        </w:tc>
+        <w:tc>
+          <w:tcPr>
+            <w:tcW w:w="0" w:type="auto"/>
+            <w:vAlign w:val="center"/>
+          </w:tcPr>
+          <w:p>
+            <w:pPr>
+              <w:jc w:val="center"/>
+            </w:pPr>
+            <w:r>
+              <w:t>2026</w:t>
+            </w:r>
+            <w:r>
+              <w:rPr>
+                <w:rFonts w:hint="eastAsia"/>
+              </w:rPr>
+              <w:t>/</w:t>
+            </w:r>
+            <w:r>
+              <w:t>04</w:t>
+            </w:r>
+            <w:r>
+              <w:rPr>
+                <w:rFonts w:hint="eastAsia"/>
+              </w:rPr>
+              <w:t>/</w:t>
+            </w:r>
+            <w:r>
+              <w:t>0</w:t>
+            </w:r>
+            <w:r>
+              <w:t>7</w:t>
+            </w:r>
+          </w:p>
+        </w:tc>
+        <w:tc>
+          <w:tcPr>
+            <w:tcW w:w="0" w:type="auto"/>
+            <w:vAlign w:val="center"/>
+          </w:tcPr>
+          <w:p>
+            <w:pPr>
+              <w:jc w:val="center"/>
+              <w:rPr>
+                <w:rFonts w:hint="eastAsia"/>
+              </w:rPr>
+            </w:pPr>
+            <w:r>
+              <w:rPr>
+                <w:rFonts w:hint="eastAsia"/>
+              </w:rPr>
+              <w:t>(</w:t>
+            </w:r>
+            <w:r>
+              <w:rPr>
+                <w:rFonts w:hint="eastAsia"/>
+              </w:rPr>
+              <w:t>二</w:t>
+            </w:r>
+            <w:r>
+              <w:rPr>
+                <w:rFonts w:hint="eastAsia"/>
+              </w:rPr>
+              <w:t>)</w:t>
+            </w:r>
+          </w:p>
+        </w:tc>
+        <w:tc>
+          <w:tcPr>
+            <w:tcW w:w="0" w:type="auto"/>
+          </w:tcPr>
+          <w:p>
+            <w:pPr>
+              <w:pStyle w:val="ListParagraph"/>
+              <w:numPr>
+                <w:ilvl w:val="0"/>
+                <w:numId w:val="1"/>
+              </w:numPr>
+              <w:ind w:left="360"/>
+            </w:pPr>
+          </w:p>
+        </w:tc>
+      </w:tr>
+      <w:tr>
+        <w:tc>
+          <w:tcPr>
+            <w:tcW w:w="0" w:type="auto"/>
+            <w:vMerge/>
+            <w:vAlign w:val="center"/>
+          </w:tcPr>
+          <w:p>
+            <w:pPr>
+              <w:jc w:val="center"/>
+            </w:pPr>
+          </w:p>
+        </w:tc>
+        <w:tc>
+          <w:tcPr>
+            <w:tcW w:w="0" w:type="auto"/>
+            <w:vAlign w:val="center"/>
+          </w:tcPr>
+          <w:p>
+            <w:pPr>
+              <w:jc w:val="center"/>
+            </w:pPr>
+            <w:r>
+              <w:t>2026</w:t>
+            </w:r>
+            <w:r>
+              <w:rPr>
+                <w:rFonts w:hint="eastAsia"/>
+              </w:rPr>
+              <w:t>/</w:t>
+            </w:r>
+            <w:r>
+              <w:t>04</w:t>
+            </w:r>
+            <w:r>
+              <w:rPr>
+                <w:rFonts w:hint="eastAsia"/>
+              </w:rPr>
+              <w:t>/</w:t>
+            </w:r>
+            <w:r>
+              <w:t>0</w:t>
+            </w:r>
+            <w:r>
+              <w:t>8</w:t>
+            </w:r>
+          </w:p>
+        </w:tc>
+        <w:tc>
+          <w:tcPr>
+            <w:tcW w:w="0" w:type="auto"/>
+            <w:vAlign w:val="center"/>
+          </w:tcPr>
+          <w:p>
+            <w:pPr>
+              <w:jc w:val="center"/>
+              <w:rPr>
+                <w:rFonts w:hint="eastAsia"/>
+              </w:rPr>
+            </w:pPr>
+            <w:r>
+              <w:rPr>
+                <w:rFonts w:hint="eastAsia"/>
+              </w:rPr>
+              <w:t>(</w:t>
+            </w:r>
+            <w:r>
+              <w:rPr>
+                <w:rFonts w:hint="eastAsia"/>
+              </w:rPr>
+              <w:t>三</w:t>
+            </w:r>
+            <w:r>
+              <w:rPr>
+                <w:rFonts w:hint="eastAsia"/>
+              </w:rPr>
+              <w:t>)</w:t>
+            </w:r>
+          </w:p>
+        </w:tc>
+        <w:tc>
+          <w:tcPr>
+            <w:tcW w:w="0" w:type="auto"/>
+          </w:tcPr>
+          <w:p>
+            <w:pPr>
+              <w:pStyle w:val="ListParagraph"/>
+              <w:numPr>
+                <w:ilvl w:val="0"/>
+                <w:numId w:val="1"/>
+              </w:numPr>
+              <w:ind w:left="360"/>
+            </w:pPr>
+          </w:p>
+        </w:tc>
+      </w:tr>
+      <w:tr>
+        <w:tc>
+          <w:tcPr>
+            <w:tcW w:w="0" w:type="auto"/>
+            <w:vMerge/>
+            <w:vAlign w:val="center"/>
+          </w:tcPr>
+          <w:p>
+            <w:pPr>
+              <w:jc w:val="center"/>
+            </w:pPr>
+          </w:p>
+        </w:tc>
+        <w:tc>
+          <w:tcPr>
+            <w:tcW w:w="0" w:type="auto"/>
+            <w:vAlign w:val="center"/>
+          </w:tcPr>
+          <w:p>
+            <w:pPr>
+              <w:jc w:val="center"/>
+            </w:pPr>
+            <w:r>
+              <w:t>2026</w:t>
+            </w:r>
+            <w:r>
+              <w:rPr>
+                <w:rFonts w:hint="eastAsia"/>
+              </w:rPr>
+              <w:t>/</w:t>
+            </w:r>
+            <w:r>
+              <w:t>04</w:t>
+            </w:r>
+            <w:r>
+              <w:rPr>
+                <w:rFonts w:hint="eastAsia"/>
+              </w:rPr>
+              <w:t>/</w:t>
+            </w:r>
+            <w:r>
+              <w:t>0</w:t>
+            </w:r>
+            <w:r>
+              <w:t>9</w:t>
+            </w:r>
+          </w:p>
+        </w:tc>
+        <w:tc>
+          <w:tcPr>
+            <w:tcW w:w="0" w:type="auto"/>
+            <w:vAlign w:val="center"/>
+          </w:tcPr>
+          <w:p>
+            <w:pPr>
+              <w:jc w:val="center"/>
+              <w:rPr>
+                <w:rFonts w:hint="eastAsia"/>
+              </w:rPr>
+            </w:pPr>
+            <w:r>
+              <w:rPr>
+                <w:rFonts w:hint="eastAsia"/>
+              </w:rPr>
+              <w:t>(</w:t>
+            </w:r>
+            <w:r>
+              <w:rPr>
+                <w:rFonts w:hint="eastAsia"/>
+              </w:rPr>
+              <w:t>四</w:t>
+            </w:r>
+            <w:r>
+              <w:rPr>
+                <w:rFonts w:hint="eastAsia"/>
+              </w:rPr>
+              <w:t>)</w:t>
+            </w:r>
+          </w:p>
+        </w:tc>
+        <w:tc>
+          <w:tcPr>
+            <w:tcW w:w="0" w:type="auto"/>
+          </w:tcPr>
+          <w:p>
+            <w:pPr>
+              <w:pStyle w:val="ListParagraph"/>
+              <w:numPr>
+                <w:ilvl w:val="0"/>
+                <w:numId w:val="1"/>
+              </w:numPr>
+              <w:ind w:left="360"/>
+            </w:pPr>
+          </w:p>
+        </w:tc>
+      </w:tr>
+      <w:tr>
+        <w:tc>
+          <w:tcPr>
+            <w:tcW w:w="0" w:type="auto"/>
+            <w:vMerge/>
+            <w:vAlign w:val="center"/>
+          </w:tcPr>
+          <w:p>
+            <w:pPr>
+              <w:jc w:val="center"/>
+            </w:pPr>
+          </w:p>
+        </w:tc>
+        <w:tc>
+          <w:tcPr>
+            <w:tcW w:w="0" w:type="auto"/>
+            <w:vAlign w:val="center"/>
+          </w:tcPr>
+          <w:p>
+            <w:pPr>
+              <w:jc w:val="center"/>
+            </w:pPr>
+            <w:r>
+              <w:t>2026</w:t>
+            </w:r>
+            <w:r>
+              <w:rPr>
+                <w:rFonts w:hint="eastAsia"/>
+              </w:rPr>
+              <w:t>/</w:t>
+            </w:r>
+            <w:r>
+              <w:t>04</w:t>
+            </w:r>
+            <w:r>
+              <w:rPr>
+                <w:rFonts w:hint="eastAsia"/>
+              </w:rPr>
+              <w:t>/</w:t>
+            </w:r>
+            <w:r>
+              <w:t>10</w:t>
+            </w:r>
+          </w:p>
+        </w:tc>
+        <w:tc>
+          <w:tcPr>
+            <w:tcW w:w="0" w:type="auto"/>
+            <w:vAlign w:val="center"/>
+          </w:tcPr>
+          <w:p>
+            <w:pPr>
+              <w:jc w:val="center"/>
+              <w:rPr>
+                <w:rFonts w:hint="eastAsia"/>
+              </w:rPr>
             </w:pPr>
             <w:r>
               <w:rPr>
@@ -3323,7 +3818,7 @@
     <w:p/>
     <w:p/>
     <w:sectPr>
-      <w:pgSz w:w="12240" w:h="15840"/>
+      <w:pgSz w:w="11906" w:h="16838" w:code="9"/>
       <w:pgMar w:top="1440" w:right="1440" w:bottom="1440" w:left="1440" w:header="720" w:footer="720" w:gutter="0"/>
       <w:cols w:space="720"/>
       <w:docGrid w:linePitch="360"/>

</xml_diff>

<commit_message>
add 20260407-20260409 Internship Report
</commit_message>
<xml_diff>
--- a/周子用-實習報告.docx
+++ b/周子用-實習報告.docx
@@ -144,12 +144,14 @@
             <w:pPr>
               <w:jc w:val="center"/>
             </w:pPr>
+            <w:proofErr w:type="gramStart"/>
             <w:r>
               <w:rPr>
                 <w:rFonts w:hint="eastAsia"/>
               </w:rPr>
               <w:t>一</w:t>
             </w:r>
+            <w:proofErr w:type="gramEnd"/>
           </w:p>
         </w:tc>
         <w:tc>
@@ -863,6 +865,7 @@
               <w:br/>
               <w:t>(</w:t>
             </w:r>
+            <w:proofErr w:type="spellStart"/>
             <w:r>
               <w:rPr>
                 <w:rFonts w:hint="eastAsia"/>
@@ -870,7 +873,19 @@
               <w:t>T</w:t>
             </w:r>
             <w:r>
-              <w:t>oDo Application, BookStore Application</w:t>
+              <w:t>oDo</w:t>
+            </w:r>
+            <w:proofErr w:type="spellEnd"/>
+            <w:r>
+              <w:t xml:space="preserve"> Application, </w:t>
+            </w:r>
+            <w:proofErr w:type="spellStart"/>
+            <w:r>
+              <w:t>BookStore</w:t>
+            </w:r>
+            <w:proofErr w:type="spellEnd"/>
+            <w:r>
+              <w:t xml:space="preserve"> Application</w:t>
             </w:r>
             <w:r>
               <w:rPr>
@@ -2468,7 +2483,15 @@
               <w:t>JSON API</w:t>
             </w:r>
             <w:r>
-              <w:t xml:space="preserve">, how to use Stimulsoft </w:t>
+              <w:t xml:space="preserve">, how to use </w:t>
+            </w:r>
+            <w:proofErr w:type="spellStart"/>
+            <w:r>
+              <w:t>Stimulsoft</w:t>
+            </w:r>
+            <w:proofErr w:type="spellEnd"/>
+            <w:r>
+              <w:t xml:space="preserve"> </w:t>
             </w:r>
             <w:r>
               <w:t xml:space="preserve">Report </w:t>
@@ -2567,7 +2590,15 @@
               <w:ind w:left="360"/>
             </w:pPr>
             <w:r>
-              <w:t>Using Stimulsoft Report Designer to generate 2 reports.</w:t>
+              <w:t xml:space="preserve">Using </w:t>
+            </w:r>
+            <w:proofErr w:type="spellStart"/>
+            <w:r>
+              <w:t>Stimulsoft</w:t>
+            </w:r>
+            <w:proofErr w:type="spellEnd"/>
+            <w:r>
+              <w:t xml:space="preserve"> Report Designer to generate 2 reports.</w:t>
             </w:r>
           </w:p>
           <w:p>
@@ -2605,7 +2636,15 @@
               <w:ind w:left="360"/>
             </w:pPr>
             <w:r>
-              <w:t>Summary the online meeting and create powerpoint.</w:t>
+              <w:t xml:space="preserve">Summary the online meeting and create </w:t>
+            </w:r>
+            <w:proofErr w:type="spellStart"/>
+            <w:r>
+              <w:t>powerpoint</w:t>
+            </w:r>
+            <w:proofErr w:type="spellEnd"/>
+            <w:r>
+              <w:t>.</w:t>
             </w:r>
           </w:p>
         </w:tc>
@@ -2698,7 +2737,15 @@
               <w:ind w:left="360"/>
             </w:pPr>
             <w:r>
-              <w:t>Using Stimulsoft Report Designer to generate 8 reports</w:t>
+              <w:t xml:space="preserve">Using </w:t>
+            </w:r>
+            <w:proofErr w:type="spellStart"/>
+            <w:r>
+              <w:t>Stimulsoft</w:t>
+            </w:r>
+            <w:proofErr w:type="spellEnd"/>
+            <w:r>
+              <w:t xml:space="preserve"> Report Designer to generate 8 reports</w:t>
             </w:r>
             <w:r>
               <w:t xml:space="preserve"> </w:t>
@@ -2943,7 +2990,15 @@
               <w:ind w:left="360"/>
             </w:pPr>
             <w:r>
-              <w:t>Generate 2 reports with Stimulsoft Report Designer.</w:t>
+              <w:t xml:space="preserve">Generate 2 reports with </w:t>
+            </w:r>
+            <w:proofErr w:type="spellStart"/>
+            <w:r>
+              <w:t>Stimulsoft</w:t>
+            </w:r>
+            <w:proofErr w:type="spellEnd"/>
+            <w:r>
+              <w:t xml:space="preserve"> Report Designer.</w:t>
             </w:r>
           </w:p>
         </w:tc>
@@ -3367,24 +3422,18 @@
               <w:t>/</w:t>
             </w:r>
             <w:r>
-              <w:t>0</w:t>
-            </w:r>
-            <w:r>
-              <w:t>6</w:t>
-            </w:r>
-          </w:p>
-        </w:tc>
-        <w:tc>
-          <w:tcPr>
-            <w:tcW w:w="0" w:type="auto"/>
-            <w:vAlign w:val="center"/>
-          </w:tcPr>
-          <w:p>
-            <w:pPr>
-              <w:jc w:val="center"/>
-              <w:rPr>
-                <w:rFonts w:hint="eastAsia"/>
-              </w:rPr>
+              <w:t>06</w:t>
+            </w:r>
+          </w:p>
+        </w:tc>
+        <w:tc>
+          <w:tcPr>
+            <w:tcW w:w="0" w:type="auto"/>
+            <w:vAlign w:val="center"/>
+          </w:tcPr>
+          <w:p>
+            <w:pPr>
+              <w:jc w:val="center"/>
             </w:pPr>
             <w:r>
               <w:t>(</w:t>
@@ -3413,6 +3462,9 @@
               </w:numPr>
               <w:ind w:left="360"/>
             </w:pPr>
+            <w:r>
+              <w:t>-</w:t>
+            </w:r>
           </w:p>
         </w:tc>
       </w:tr>
@@ -3457,24 +3509,18 @@
               <w:t>/</w:t>
             </w:r>
             <w:r>
-              <w:t>0</w:t>
-            </w:r>
-            <w:r>
-              <w:t>7</w:t>
-            </w:r>
-          </w:p>
-        </w:tc>
-        <w:tc>
-          <w:tcPr>
-            <w:tcW w:w="0" w:type="auto"/>
-            <w:vAlign w:val="center"/>
-          </w:tcPr>
-          <w:p>
-            <w:pPr>
-              <w:jc w:val="center"/>
-              <w:rPr>
-                <w:rFonts w:hint="eastAsia"/>
-              </w:rPr>
+              <w:t>07</w:t>
+            </w:r>
+          </w:p>
+        </w:tc>
+        <w:tc>
+          <w:tcPr>
+            <w:tcW w:w="0" w:type="auto"/>
+            <w:vAlign w:val="center"/>
+          </w:tcPr>
+          <w:p>
+            <w:pPr>
+              <w:jc w:val="center"/>
             </w:pPr>
             <w:r>
               <w:rPr>
@@ -3509,6 +3555,9 @@
               </w:numPr>
               <w:ind w:left="360"/>
             </w:pPr>
+            <w:r>
+              <w:t>Continue to learn the project that has been developed by the company.</w:t>
+            </w:r>
           </w:p>
         </w:tc>
       </w:tr>
@@ -3553,24 +3602,18 @@
               <w:t>/</w:t>
             </w:r>
             <w:r>
-              <w:t>0</w:t>
-            </w:r>
-            <w:r>
-              <w:t>8</w:t>
-            </w:r>
-          </w:p>
-        </w:tc>
-        <w:tc>
-          <w:tcPr>
-            <w:tcW w:w="0" w:type="auto"/>
-            <w:vAlign w:val="center"/>
-          </w:tcPr>
-          <w:p>
-            <w:pPr>
-              <w:jc w:val="center"/>
-              <w:rPr>
-                <w:rFonts w:hint="eastAsia"/>
-              </w:rPr>
+              <w:t>08</w:t>
+            </w:r>
+          </w:p>
+        </w:tc>
+        <w:tc>
+          <w:tcPr>
+            <w:tcW w:w="0" w:type="auto"/>
+            <w:vAlign w:val="center"/>
+          </w:tcPr>
+          <w:p>
+            <w:pPr>
+              <w:jc w:val="center"/>
             </w:pPr>
             <w:r>
               <w:rPr>
@@ -3605,6 +3648,9 @@
               </w:numPr>
               <w:ind w:left="360"/>
             </w:pPr>
+            <w:r>
+              <w:t>Continue to learn the project that has been developed by the company.</w:t>
+            </w:r>
           </w:p>
         </w:tc>
       </w:tr>
@@ -3649,24 +3695,18 @@
               <w:t>/</w:t>
             </w:r>
             <w:r>
-              <w:t>0</w:t>
-            </w:r>
-            <w:r>
-              <w:t>9</w:t>
-            </w:r>
-          </w:p>
-        </w:tc>
-        <w:tc>
-          <w:tcPr>
-            <w:tcW w:w="0" w:type="auto"/>
-            <w:vAlign w:val="center"/>
-          </w:tcPr>
-          <w:p>
-            <w:pPr>
-              <w:jc w:val="center"/>
-              <w:rPr>
-                <w:rFonts w:hint="eastAsia"/>
-              </w:rPr>
+              <w:t>09</w:t>
+            </w:r>
+          </w:p>
+        </w:tc>
+        <w:tc>
+          <w:tcPr>
+            <w:tcW w:w="0" w:type="auto"/>
+            <w:vAlign w:val="center"/>
+          </w:tcPr>
+          <w:p>
+            <w:pPr>
+              <w:jc w:val="center"/>
             </w:pPr>
             <w:r>
               <w:rPr>
@@ -3699,8 +3739,39 @@
                 <w:ilvl w:val="0"/>
                 <w:numId w:val="1"/>
               </w:numPr>
+              <w:spacing w:after="160" w:line="259" w:lineRule="auto"/>
               <w:ind w:left="360"/>
             </w:pPr>
+            <w:r>
+              <w:t>Join the In-class session course, learning the GitHub</w:t>
+            </w:r>
+            <w:r>
+              <w:t xml:space="preserve"> </w:t>
+            </w:r>
+            <w:proofErr w:type="spellStart"/>
+            <w:r>
+              <w:t>PullRequest</w:t>
+            </w:r>
+            <w:proofErr w:type="spellEnd"/>
+            <w:r>
+              <w:t xml:space="preserve"> Implementation.</w:t>
+            </w:r>
+          </w:p>
+          <w:p>
+            <w:pPr>
+              <w:pStyle w:val="ListParagraph"/>
+              <w:numPr>
+                <w:ilvl w:val="0"/>
+                <w:numId w:val="1"/>
+              </w:numPr>
+              <w:ind w:left="360"/>
+            </w:pPr>
+            <w:r>
+              <w:t xml:space="preserve">Setup </w:t>
+            </w:r>
+            <w:r>
+              <w:t>the project that has been developed by the company.</w:t>
+            </w:r>
           </w:p>
         </w:tc>
       </w:tr>
@@ -3757,9 +3828,6 @@
           <w:p>
             <w:pPr>
               <w:jc w:val="center"/>
-              <w:rPr>
-                <w:rFonts w:hint="eastAsia"/>
-              </w:rPr>
             </w:pPr>
             <w:r>
               <w:rPr>

</xml_diff>

<commit_message>
add 20260410-20260414 Internship Report
</commit_message>
<xml_diff>
--- a/周子用-實習報告.docx
+++ b/周子用-實習報告.docx
@@ -144,14 +144,12 @@
             <w:pPr>
               <w:jc w:val="center"/>
             </w:pPr>
-            <w:proofErr w:type="gramStart"/>
             <w:r>
               <w:rPr>
                 <w:rFonts w:hint="eastAsia"/>
               </w:rPr>
               <w:t>一</w:t>
             </w:r>
-            <w:proofErr w:type="gramEnd"/>
           </w:p>
         </w:tc>
         <w:tc>
@@ -865,7 +863,6 @@
               <w:br/>
               <w:t>(</w:t>
             </w:r>
-            <w:proofErr w:type="spellStart"/>
             <w:r>
               <w:rPr>
                 <w:rFonts w:hint="eastAsia"/>
@@ -873,19 +870,7 @@
               <w:t>T</w:t>
             </w:r>
             <w:r>
-              <w:t>oDo</w:t>
-            </w:r>
-            <w:proofErr w:type="spellEnd"/>
-            <w:r>
-              <w:t xml:space="preserve"> Application, </w:t>
-            </w:r>
-            <w:proofErr w:type="spellStart"/>
-            <w:r>
-              <w:t>BookStore</w:t>
-            </w:r>
-            <w:proofErr w:type="spellEnd"/>
-            <w:r>
-              <w:t xml:space="preserve"> Application</w:t>
+              <w:t>oDo Application, BookStore Application</w:t>
             </w:r>
             <w:r>
               <w:rPr>
@@ -2483,15 +2468,7 @@
               <w:t>JSON API</w:t>
             </w:r>
             <w:r>
-              <w:t xml:space="preserve">, how to use </w:t>
-            </w:r>
-            <w:proofErr w:type="spellStart"/>
-            <w:r>
-              <w:t>Stimulsoft</w:t>
-            </w:r>
-            <w:proofErr w:type="spellEnd"/>
-            <w:r>
-              <w:t xml:space="preserve"> </w:t>
+              <w:t xml:space="preserve">, how to use Stimulsoft </w:t>
             </w:r>
             <w:r>
               <w:t xml:space="preserve">Report </w:t>
@@ -2590,15 +2567,7 @@
               <w:ind w:left="360"/>
             </w:pPr>
             <w:r>
-              <w:t xml:space="preserve">Using </w:t>
-            </w:r>
-            <w:proofErr w:type="spellStart"/>
-            <w:r>
-              <w:t>Stimulsoft</w:t>
-            </w:r>
-            <w:proofErr w:type="spellEnd"/>
-            <w:r>
-              <w:t xml:space="preserve"> Report Designer to generate 2 reports.</w:t>
+              <w:t>Using Stimulsoft Report Designer to generate 2 reports.</w:t>
             </w:r>
           </w:p>
           <w:p>
@@ -2636,15 +2605,7 @@
               <w:ind w:left="360"/>
             </w:pPr>
             <w:r>
-              <w:t xml:space="preserve">Summary the online meeting and create </w:t>
-            </w:r>
-            <w:proofErr w:type="spellStart"/>
-            <w:r>
-              <w:t>powerpoint</w:t>
-            </w:r>
-            <w:proofErr w:type="spellEnd"/>
-            <w:r>
-              <w:t>.</w:t>
+              <w:t>Summary the online meeting and create powerpoint.</w:t>
             </w:r>
           </w:p>
         </w:tc>
@@ -2737,15 +2698,7 @@
               <w:ind w:left="360"/>
             </w:pPr>
             <w:r>
-              <w:t xml:space="preserve">Using </w:t>
-            </w:r>
-            <w:proofErr w:type="spellStart"/>
-            <w:r>
-              <w:t>Stimulsoft</w:t>
-            </w:r>
-            <w:proofErr w:type="spellEnd"/>
-            <w:r>
-              <w:t xml:space="preserve"> Report Designer to generate 8 reports</w:t>
+              <w:t>Using Stimulsoft Report Designer to generate 8 reports</w:t>
             </w:r>
             <w:r>
               <w:t xml:space="preserve"> </w:t>
@@ -2990,15 +2943,7 @@
               <w:ind w:left="360"/>
             </w:pPr>
             <w:r>
-              <w:t xml:space="preserve">Generate 2 reports with </w:t>
-            </w:r>
-            <w:proofErr w:type="spellStart"/>
-            <w:r>
-              <w:t>Stimulsoft</w:t>
-            </w:r>
-            <w:proofErr w:type="spellEnd"/>
-            <w:r>
-              <w:t xml:space="preserve"> Report Designer.</w:t>
+              <w:t>Generate 2 reports with Stimulsoft Report Designer.</w:t>
             </w:r>
           </w:p>
         </w:tc>
@@ -3743,18 +3688,13 @@
               <w:ind w:left="360"/>
             </w:pPr>
             <w:r>
-              <w:t>Join the In-class session course, learning the GitHub</w:t>
+              <w:t>Join the In-class session course, learning the GitHub Pull</w:t>
             </w:r>
             <w:r>
               <w:t xml:space="preserve"> </w:t>
             </w:r>
-            <w:proofErr w:type="spellStart"/>
-            <w:r>
-              <w:t>PullRequest</w:t>
-            </w:r>
-            <w:proofErr w:type="spellEnd"/>
-            <w:r>
-              <w:t xml:space="preserve"> Implementation.</w:t>
+            <w:r>
+              <w:t>Request Implementation.</w:t>
             </w:r>
           </w:p>
           <w:p>
@@ -3817,6 +3757,503 @@
             </w:r>
             <w:r>
               <w:t>10</w:t>
+            </w:r>
+          </w:p>
+        </w:tc>
+        <w:tc>
+          <w:tcPr>
+            <w:tcW w:w="0" w:type="auto"/>
+            <w:vAlign w:val="center"/>
+          </w:tcPr>
+          <w:p>
+            <w:pPr>
+              <w:jc w:val="center"/>
+            </w:pPr>
+            <w:r>
+              <w:rPr>
+                <w:rFonts w:hint="eastAsia"/>
+              </w:rPr>
+              <w:t>(</w:t>
+            </w:r>
+            <w:r>
+              <w:rPr>
+                <w:rFonts w:hint="eastAsia"/>
+              </w:rPr>
+              <w:t>五</w:t>
+            </w:r>
+            <w:r>
+              <w:rPr>
+                <w:rFonts w:hint="eastAsia"/>
+              </w:rPr>
+              <w:t>)</w:t>
+            </w:r>
+          </w:p>
+        </w:tc>
+        <w:tc>
+          <w:tcPr>
+            <w:tcW w:w="0" w:type="auto"/>
+          </w:tcPr>
+          <w:p>
+            <w:pPr>
+              <w:pStyle w:val="ListParagraph"/>
+              <w:numPr>
+                <w:ilvl w:val="0"/>
+                <w:numId w:val="1"/>
+              </w:numPr>
+              <w:ind w:left="360"/>
+            </w:pPr>
+            <w:r>
+              <w:t>Meeting</w:t>
+            </w:r>
+          </w:p>
+          <w:p>
+            <w:pPr>
+              <w:pStyle w:val="ListParagraph"/>
+              <w:numPr>
+                <w:ilvl w:val="0"/>
+                <w:numId w:val="1"/>
+              </w:numPr>
+              <w:ind w:left="360"/>
+            </w:pPr>
+            <w:r>
+              <w:t>Preparing data seeding plan</w:t>
+            </w:r>
+            <w:r>
+              <w:t xml:space="preserve"> </w:t>
+            </w:r>
+            <w:r>
+              <w:t>for</w:t>
+            </w:r>
+            <w:r>
+              <w:t xml:space="preserve"> the company project. </w:t>
+            </w:r>
+          </w:p>
+        </w:tc>
+      </w:tr>
+      <w:tr>
+        <w:tc>
+          <w:tcPr>
+            <w:tcW w:w="0" w:type="auto"/>
+            <w:vMerge w:val="restart"/>
+            <w:vAlign w:val="center"/>
+          </w:tcPr>
+          <w:p>
+            <w:pPr>
+              <w:jc w:val="center"/>
+            </w:pPr>
+            <w:r>
+              <w:rPr>
+                <w:rFonts w:hint="eastAsia"/>
+              </w:rPr>
+              <w:t>七</w:t>
+            </w:r>
+          </w:p>
+        </w:tc>
+        <w:tc>
+          <w:tcPr>
+            <w:tcW w:w="0" w:type="auto"/>
+            <w:vAlign w:val="center"/>
+          </w:tcPr>
+          <w:p>
+            <w:pPr>
+              <w:jc w:val="center"/>
+            </w:pPr>
+            <w:r>
+              <w:t>2026</w:t>
+            </w:r>
+            <w:r>
+              <w:rPr>
+                <w:rFonts w:hint="eastAsia"/>
+              </w:rPr>
+              <w:t>/</w:t>
+            </w:r>
+            <w:r>
+              <w:t>04</w:t>
+            </w:r>
+            <w:r>
+              <w:rPr>
+                <w:rFonts w:hint="eastAsia"/>
+              </w:rPr>
+              <w:t>/</w:t>
+            </w:r>
+            <w:r>
+              <w:t>13</w:t>
+            </w:r>
+          </w:p>
+        </w:tc>
+        <w:tc>
+          <w:tcPr>
+            <w:tcW w:w="0" w:type="auto"/>
+            <w:vAlign w:val="center"/>
+          </w:tcPr>
+          <w:p>
+            <w:pPr>
+              <w:jc w:val="center"/>
+            </w:pPr>
+            <w:r>
+              <w:t>(</w:t>
+            </w:r>
+            <w:r>
+              <w:rPr>
+                <w:rFonts w:hint="eastAsia"/>
+              </w:rPr>
+              <w:t>一</w:t>
+            </w:r>
+            <w:r>
+              <w:t>)</w:t>
+            </w:r>
+          </w:p>
+        </w:tc>
+        <w:tc>
+          <w:tcPr>
+            <w:tcW w:w="0" w:type="auto"/>
+          </w:tcPr>
+          <w:p>
+            <w:pPr>
+              <w:pStyle w:val="ListParagraph"/>
+              <w:numPr>
+                <w:ilvl w:val="0"/>
+                <w:numId w:val="1"/>
+              </w:numPr>
+              <w:ind w:left="360"/>
+            </w:pPr>
+            <w:r>
+              <w:t>Meeting</w:t>
+            </w:r>
+          </w:p>
+          <w:p>
+            <w:pPr>
+              <w:pStyle w:val="ListParagraph"/>
+              <w:numPr>
+                <w:ilvl w:val="0"/>
+                <w:numId w:val="1"/>
+              </w:numPr>
+              <w:ind w:left="360"/>
+            </w:pPr>
+            <w:r>
+              <w:t>Continue to preparing data seeding plan for the company project.</w:t>
+            </w:r>
+          </w:p>
+        </w:tc>
+      </w:tr>
+      <w:tr>
+        <w:tc>
+          <w:tcPr>
+            <w:tcW w:w="0" w:type="auto"/>
+            <w:vMerge/>
+            <w:vAlign w:val="center"/>
+          </w:tcPr>
+          <w:p>
+            <w:pPr>
+              <w:jc w:val="center"/>
+            </w:pPr>
+          </w:p>
+        </w:tc>
+        <w:tc>
+          <w:tcPr>
+            <w:tcW w:w="0" w:type="auto"/>
+            <w:vAlign w:val="center"/>
+          </w:tcPr>
+          <w:p>
+            <w:pPr>
+              <w:jc w:val="center"/>
+            </w:pPr>
+            <w:r>
+              <w:t>2026</w:t>
+            </w:r>
+            <w:r>
+              <w:rPr>
+                <w:rFonts w:hint="eastAsia"/>
+              </w:rPr>
+              <w:t>/</w:t>
+            </w:r>
+            <w:r>
+              <w:t>04</w:t>
+            </w:r>
+            <w:r>
+              <w:rPr>
+                <w:rFonts w:hint="eastAsia"/>
+              </w:rPr>
+              <w:t>/</w:t>
+            </w:r>
+            <w:r>
+              <w:t>14</w:t>
+            </w:r>
+          </w:p>
+        </w:tc>
+        <w:tc>
+          <w:tcPr>
+            <w:tcW w:w="0" w:type="auto"/>
+            <w:vAlign w:val="center"/>
+          </w:tcPr>
+          <w:p>
+            <w:pPr>
+              <w:jc w:val="center"/>
+            </w:pPr>
+            <w:r>
+              <w:rPr>
+                <w:rFonts w:hint="eastAsia"/>
+              </w:rPr>
+              <w:t>(</w:t>
+            </w:r>
+            <w:r>
+              <w:rPr>
+                <w:rFonts w:hint="eastAsia"/>
+              </w:rPr>
+              <w:t>二</w:t>
+            </w:r>
+            <w:r>
+              <w:rPr>
+                <w:rFonts w:hint="eastAsia"/>
+              </w:rPr>
+              <w:t>)</w:t>
+            </w:r>
+          </w:p>
+        </w:tc>
+        <w:tc>
+          <w:tcPr>
+            <w:tcW w:w="0" w:type="auto"/>
+          </w:tcPr>
+          <w:p>
+            <w:pPr>
+              <w:pStyle w:val="ListParagraph"/>
+              <w:numPr>
+                <w:ilvl w:val="0"/>
+                <w:numId w:val="1"/>
+              </w:numPr>
+              <w:ind w:left="360"/>
+            </w:pPr>
+            <w:r>
+              <w:t xml:space="preserve">Execute the data seeding </w:t>
+            </w:r>
+            <w:r>
+              <w:t>to the company project.</w:t>
+            </w:r>
+          </w:p>
+        </w:tc>
+      </w:tr>
+      <w:tr>
+        <w:tc>
+          <w:tcPr>
+            <w:tcW w:w="0" w:type="auto"/>
+            <w:vMerge/>
+            <w:vAlign w:val="center"/>
+          </w:tcPr>
+          <w:p>
+            <w:pPr>
+              <w:jc w:val="center"/>
+            </w:pPr>
+          </w:p>
+        </w:tc>
+        <w:tc>
+          <w:tcPr>
+            <w:tcW w:w="0" w:type="auto"/>
+            <w:vAlign w:val="center"/>
+          </w:tcPr>
+          <w:p>
+            <w:pPr>
+              <w:jc w:val="center"/>
+            </w:pPr>
+            <w:r>
+              <w:t>2026</w:t>
+            </w:r>
+            <w:r>
+              <w:rPr>
+                <w:rFonts w:hint="eastAsia"/>
+              </w:rPr>
+              <w:t>/</w:t>
+            </w:r>
+            <w:r>
+              <w:t>04</w:t>
+            </w:r>
+            <w:r>
+              <w:rPr>
+                <w:rFonts w:hint="eastAsia"/>
+              </w:rPr>
+              <w:t>/</w:t>
+            </w:r>
+            <w:r>
+              <w:t>15</w:t>
+            </w:r>
+          </w:p>
+        </w:tc>
+        <w:tc>
+          <w:tcPr>
+            <w:tcW w:w="0" w:type="auto"/>
+            <w:vAlign w:val="center"/>
+          </w:tcPr>
+          <w:p>
+            <w:pPr>
+              <w:jc w:val="center"/>
+            </w:pPr>
+            <w:r>
+              <w:rPr>
+                <w:rFonts w:hint="eastAsia"/>
+              </w:rPr>
+              <w:t>(</w:t>
+            </w:r>
+            <w:r>
+              <w:rPr>
+                <w:rFonts w:hint="eastAsia"/>
+              </w:rPr>
+              <w:t>三</w:t>
+            </w:r>
+            <w:r>
+              <w:rPr>
+                <w:rFonts w:hint="eastAsia"/>
+              </w:rPr>
+              <w:t>)</w:t>
+            </w:r>
+          </w:p>
+        </w:tc>
+        <w:tc>
+          <w:tcPr>
+            <w:tcW w:w="0" w:type="auto"/>
+          </w:tcPr>
+          <w:p>
+            <w:pPr>
+              <w:pStyle w:val="ListParagraph"/>
+              <w:numPr>
+                <w:ilvl w:val="0"/>
+                <w:numId w:val="1"/>
+              </w:numPr>
+              <w:ind w:left="360"/>
+            </w:pPr>
+          </w:p>
+        </w:tc>
+      </w:tr>
+      <w:tr>
+        <w:tc>
+          <w:tcPr>
+            <w:tcW w:w="0" w:type="auto"/>
+            <w:vMerge/>
+            <w:vAlign w:val="center"/>
+          </w:tcPr>
+          <w:p>
+            <w:pPr>
+              <w:jc w:val="center"/>
+            </w:pPr>
+          </w:p>
+        </w:tc>
+        <w:tc>
+          <w:tcPr>
+            <w:tcW w:w="0" w:type="auto"/>
+            <w:vAlign w:val="center"/>
+          </w:tcPr>
+          <w:p>
+            <w:pPr>
+              <w:jc w:val="center"/>
+            </w:pPr>
+            <w:r>
+              <w:t>2026</w:t>
+            </w:r>
+            <w:r>
+              <w:rPr>
+                <w:rFonts w:hint="eastAsia"/>
+              </w:rPr>
+              <w:t>/</w:t>
+            </w:r>
+            <w:r>
+              <w:t>04</w:t>
+            </w:r>
+            <w:r>
+              <w:rPr>
+                <w:rFonts w:hint="eastAsia"/>
+              </w:rPr>
+              <w:t>/</w:t>
+            </w:r>
+            <w:r>
+              <w:t>16</w:t>
+            </w:r>
+          </w:p>
+        </w:tc>
+        <w:tc>
+          <w:tcPr>
+            <w:tcW w:w="0" w:type="auto"/>
+            <w:vAlign w:val="center"/>
+          </w:tcPr>
+          <w:p>
+            <w:pPr>
+              <w:jc w:val="center"/>
+            </w:pPr>
+            <w:r>
+              <w:rPr>
+                <w:rFonts w:hint="eastAsia"/>
+              </w:rPr>
+              <w:t>(</w:t>
+            </w:r>
+            <w:r>
+              <w:rPr>
+                <w:rFonts w:hint="eastAsia"/>
+              </w:rPr>
+              <w:t>四</w:t>
+            </w:r>
+            <w:r>
+              <w:rPr>
+                <w:rFonts w:hint="eastAsia"/>
+              </w:rPr>
+              <w:t>)</w:t>
+            </w:r>
+          </w:p>
+        </w:tc>
+        <w:tc>
+          <w:tcPr>
+            <w:tcW w:w="0" w:type="auto"/>
+          </w:tcPr>
+          <w:p>
+            <w:pPr>
+              <w:pStyle w:val="ListParagraph"/>
+              <w:numPr>
+                <w:ilvl w:val="0"/>
+                <w:numId w:val="1"/>
+              </w:numPr>
+              <w:ind w:left="360"/>
+            </w:pPr>
+          </w:p>
+        </w:tc>
+      </w:tr>
+      <w:tr>
+        <w:tc>
+          <w:tcPr>
+            <w:tcW w:w="0" w:type="auto"/>
+            <w:vMerge/>
+            <w:vAlign w:val="center"/>
+          </w:tcPr>
+          <w:p>
+            <w:pPr>
+              <w:jc w:val="center"/>
+            </w:pPr>
+          </w:p>
+        </w:tc>
+        <w:tc>
+          <w:tcPr>
+            <w:tcW w:w="0" w:type="auto"/>
+            <w:vAlign w:val="center"/>
+          </w:tcPr>
+          <w:p>
+            <w:pPr>
+              <w:jc w:val="center"/>
+            </w:pPr>
+            <w:r>
+              <w:t>2026</w:t>
+            </w:r>
+            <w:r>
+              <w:rPr>
+                <w:rFonts w:hint="eastAsia"/>
+              </w:rPr>
+              <w:t>/</w:t>
+            </w:r>
+            <w:r>
+              <w:t>04</w:t>
+            </w:r>
+            <w:r>
+              <w:rPr>
+                <w:rFonts w:hint="eastAsia"/>
+              </w:rPr>
+              <w:t>/</w:t>
+            </w:r>
+            <w:r>
+              <w:t>17</w:t>
             </w:r>
           </w:p>
         </w:tc>

</xml_diff>

<commit_message>
add 20260415 Internship Report
</commit_message>
<xml_diff>
--- a/周子用-實習報告.docx
+++ b/周子用-實習報告.docx
@@ -4024,10 +4024,19 @@
               <w:ind w:left="360"/>
             </w:pPr>
             <w:r>
-              <w:t xml:space="preserve">Execute the data seeding </w:t>
-            </w:r>
-            <w:r>
-              <w:t>to the company project.</w:t>
+              <w:t>Continue to preparing</w:t>
+            </w:r>
+            <w:r>
+              <w:t xml:space="preserve"> the data seeding </w:t>
+            </w:r>
+            <w:r>
+              <w:t>to the company project</w:t>
+            </w:r>
+            <w:r>
+              <w:t xml:space="preserve"> for 2 tables</w:t>
+            </w:r>
+            <w:r>
+              <w:t>.</w:t>
             </w:r>
           </w:p>
         </w:tc>
@@ -4119,6 +4128,18 @@
               </w:numPr>
               <w:ind w:left="360"/>
             </w:pPr>
+            <w:r>
+              <w:t xml:space="preserve">Continue to preparing the data seeding to the company project for </w:t>
+            </w:r>
+            <w:r>
+              <w:t>3 basic</w:t>
+            </w:r>
+            <w:r>
+              <w:t xml:space="preserve"> data</w:t>
+            </w:r>
+            <w:r>
+              <w:t xml:space="preserve"> tables.</w:t>
+            </w:r>
           </w:p>
         </w:tc>
       </w:tr>

</xml_diff>

<commit_message>
add 20260416-20260423 Internship Report
</commit_message>
<xml_diff>
--- a/周子用-實習報告.docx
+++ b/周子用-實習報告.docx
@@ -4129,10 +4129,7 @@
               <w:ind w:left="360"/>
             </w:pPr>
             <w:r>
-              <w:t xml:space="preserve">Continue to preparing the data seeding to the company project for </w:t>
-            </w:r>
-            <w:r>
-              <w:t>3 basic</w:t>
+              <w:t>Continue to preparing the data seeding to the company project for 3 basic</w:t>
             </w:r>
             <w:r>
               <w:t xml:space="preserve"> data</w:t>
@@ -4228,8 +4225,40 @@
                 <w:ilvl w:val="0"/>
                 <w:numId w:val="1"/>
               </w:numPr>
-              <w:ind w:left="360"/>
-            </w:pPr>
+              <w:spacing w:after="160" w:line="259" w:lineRule="auto"/>
+              <w:ind w:left="360"/>
+            </w:pPr>
+            <w:r>
+              <w:t xml:space="preserve">Join the In-class session course, learning the </w:t>
+            </w:r>
+            <w:r>
+              <w:t>ASP.NET Study Case Project</w:t>
+            </w:r>
+            <w:r>
+              <w:t>.</w:t>
+            </w:r>
+          </w:p>
+          <w:p>
+            <w:pPr>
+              <w:pStyle w:val="ListParagraph"/>
+              <w:numPr>
+                <w:ilvl w:val="0"/>
+                <w:numId w:val="1"/>
+              </w:numPr>
+              <w:ind w:left="360"/>
+            </w:pPr>
+            <w:r>
+              <w:t>C</w:t>
+            </w:r>
+            <w:r>
+              <w:rPr>
+                <w:rFonts w:hint="eastAsia"/>
+              </w:rPr>
+              <w:t>ont</w:t>
+            </w:r>
+            <w:r>
+              <w:t>inue to preparing the data seeding to the company project for 1 join table.</w:t>
+            </w:r>
           </w:p>
         </w:tc>
       </w:tr>
@@ -4275,6 +4304,624 @@
             </w:r>
             <w:r>
               <w:t>17</w:t>
+            </w:r>
+          </w:p>
+        </w:tc>
+        <w:tc>
+          <w:tcPr>
+            <w:tcW w:w="0" w:type="auto"/>
+            <w:vAlign w:val="center"/>
+          </w:tcPr>
+          <w:p>
+            <w:pPr>
+              <w:jc w:val="center"/>
+            </w:pPr>
+            <w:r>
+              <w:rPr>
+                <w:rFonts w:hint="eastAsia"/>
+              </w:rPr>
+              <w:t>(</w:t>
+            </w:r>
+            <w:r>
+              <w:rPr>
+                <w:rFonts w:hint="eastAsia"/>
+              </w:rPr>
+              <w:t>五</w:t>
+            </w:r>
+            <w:r>
+              <w:rPr>
+                <w:rFonts w:hint="eastAsia"/>
+              </w:rPr>
+              <w:t>)</w:t>
+            </w:r>
+          </w:p>
+        </w:tc>
+        <w:tc>
+          <w:tcPr>
+            <w:tcW w:w="0" w:type="auto"/>
+          </w:tcPr>
+          <w:p>
+            <w:pPr>
+              <w:pStyle w:val="ListParagraph"/>
+              <w:numPr>
+                <w:ilvl w:val="0"/>
+                <w:numId w:val="1"/>
+              </w:numPr>
+              <w:ind w:left="360"/>
+            </w:pPr>
+            <w:r>
+              <w:t>Confirming the new data from the staff on the field and implement the data seeding.</w:t>
+            </w:r>
+          </w:p>
+          <w:p>
+            <w:pPr>
+              <w:pStyle w:val="ListParagraph"/>
+              <w:numPr>
+                <w:ilvl w:val="0"/>
+                <w:numId w:val="1"/>
+              </w:numPr>
+              <w:ind w:left="360"/>
+            </w:pPr>
+            <w:r>
+              <w:t>Put the pull request to GitHub repository.</w:t>
+            </w:r>
+          </w:p>
+          <w:p>
+            <w:pPr>
+              <w:pStyle w:val="ListParagraph"/>
+              <w:numPr>
+                <w:ilvl w:val="0"/>
+                <w:numId w:val="1"/>
+              </w:numPr>
+              <w:ind w:left="360"/>
+            </w:pPr>
+            <w:r>
+              <w:t>Checking the data seeding code with The Manager.</w:t>
+            </w:r>
+          </w:p>
+        </w:tc>
+      </w:tr>
+      <w:tr>
+        <w:tc>
+          <w:tcPr>
+            <w:tcW w:w="0" w:type="auto"/>
+            <w:vMerge w:val="restart"/>
+            <w:vAlign w:val="center"/>
+          </w:tcPr>
+          <w:p>
+            <w:pPr>
+              <w:jc w:val="center"/>
+            </w:pPr>
+            <w:r>
+              <w:rPr>
+                <w:rFonts w:hint="eastAsia"/>
+              </w:rPr>
+              <w:t>八</w:t>
+            </w:r>
+          </w:p>
+        </w:tc>
+        <w:tc>
+          <w:tcPr>
+            <w:tcW w:w="0" w:type="auto"/>
+            <w:vAlign w:val="center"/>
+          </w:tcPr>
+          <w:p>
+            <w:pPr>
+              <w:jc w:val="center"/>
+            </w:pPr>
+            <w:r>
+              <w:t>2026</w:t>
+            </w:r>
+            <w:r>
+              <w:rPr>
+                <w:rFonts w:hint="eastAsia"/>
+              </w:rPr>
+              <w:t>/</w:t>
+            </w:r>
+            <w:r>
+              <w:t>04</w:t>
+            </w:r>
+            <w:r>
+              <w:rPr>
+                <w:rFonts w:hint="eastAsia"/>
+              </w:rPr>
+              <w:t>/</w:t>
+            </w:r>
+            <w:r>
+              <w:t>20</w:t>
+            </w:r>
+          </w:p>
+        </w:tc>
+        <w:tc>
+          <w:tcPr>
+            <w:tcW w:w="0" w:type="auto"/>
+            <w:vAlign w:val="center"/>
+          </w:tcPr>
+          <w:p>
+            <w:pPr>
+              <w:jc w:val="center"/>
+            </w:pPr>
+            <w:r>
+              <w:t>(</w:t>
+            </w:r>
+            <w:r>
+              <w:rPr>
+                <w:rFonts w:hint="eastAsia"/>
+              </w:rPr>
+              <w:t>一</w:t>
+            </w:r>
+            <w:r>
+              <w:t>)</w:t>
+            </w:r>
+          </w:p>
+        </w:tc>
+        <w:tc>
+          <w:tcPr>
+            <w:tcW w:w="0" w:type="auto"/>
+          </w:tcPr>
+          <w:p>
+            <w:pPr>
+              <w:pStyle w:val="ListParagraph"/>
+              <w:numPr>
+                <w:ilvl w:val="0"/>
+                <w:numId w:val="1"/>
+              </w:numPr>
+              <w:ind w:left="360"/>
+            </w:pPr>
+            <w:r>
+              <w:t>Meeting</w:t>
+            </w:r>
+          </w:p>
+          <w:p>
+            <w:pPr>
+              <w:pStyle w:val="ListParagraph"/>
+              <w:numPr>
+                <w:ilvl w:val="0"/>
+                <w:numId w:val="1"/>
+              </w:numPr>
+              <w:ind w:left="360"/>
+            </w:pPr>
+            <w:r>
+              <w:t>Refactor the data seeding code.</w:t>
+            </w:r>
+          </w:p>
+          <w:p>
+            <w:pPr>
+              <w:pStyle w:val="ListParagraph"/>
+              <w:numPr>
+                <w:ilvl w:val="0"/>
+                <w:numId w:val="1"/>
+              </w:numPr>
+              <w:ind w:left="360"/>
+            </w:pPr>
+            <w:r>
+              <w:t>Anal</w:t>
+            </w:r>
+            <w:r>
+              <w:t>y</w:t>
+            </w:r>
+            <w:r>
+              <w:t>ze t</w:t>
+            </w:r>
+            <w:r>
+              <w:t xml:space="preserve">he data from the website for the other project that have developed by company. </w:t>
+            </w:r>
+          </w:p>
+        </w:tc>
+      </w:tr>
+      <w:tr>
+        <w:tc>
+          <w:tcPr>
+            <w:tcW w:w="0" w:type="auto"/>
+            <w:vMerge/>
+            <w:vAlign w:val="center"/>
+          </w:tcPr>
+          <w:p>
+            <w:pPr>
+              <w:jc w:val="center"/>
+            </w:pPr>
+          </w:p>
+        </w:tc>
+        <w:tc>
+          <w:tcPr>
+            <w:tcW w:w="0" w:type="auto"/>
+            <w:vAlign w:val="center"/>
+          </w:tcPr>
+          <w:p>
+            <w:pPr>
+              <w:jc w:val="center"/>
+            </w:pPr>
+            <w:r>
+              <w:t>2026</w:t>
+            </w:r>
+            <w:r>
+              <w:rPr>
+                <w:rFonts w:hint="eastAsia"/>
+              </w:rPr>
+              <w:t>/</w:t>
+            </w:r>
+            <w:r>
+              <w:t>04</w:t>
+            </w:r>
+            <w:r>
+              <w:rPr>
+                <w:rFonts w:hint="eastAsia"/>
+              </w:rPr>
+              <w:t>/</w:t>
+            </w:r>
+            <w:r>
+              <w:t>21</w:t>
+            </w:r>
+          </w:p>
+        </w:tc>
+        <w:tc>
+          <w:tcPr>
+            <w:tcW w:w="0" w:type="auto"/>
+            <w:vAlign w:val="center"/>
+          </w:tcPr>
+          <w:p>
+            <w:pPr>
+              <w:jc w:val="center"/>
+            </w:pPr>
+            <w:r>
+              <w:rPr>
+                <w:rFonts w:hint="eastAsia"/>
+              </w:rPr>
+              <w:t>(</w:t>
+            </w:r>
+            <w:r>
+              <w:rPr>
+                <w:rFonts w:hint="eastAsia"/>
+              </w:rPr>
+              <w:t>二</w:t>
+            </w:r>
+            <w:r>
+              <w:rPr>
+                <w:rFonts w:hint="eastAsia"/>
+              </w:rPr>
+              <w:t>)</w:t>
+            </w:r>
+          </w:p>
+        </w:tc>
+        <w:tc>
+          <w:tcPr>
+            <w:tcW w:w="0" w:type="auto"/>
+          </w:tcPr>
+          <w:p>
+            <w:pPr>
+              <w:pStyle w:val="ListParagraph"/>
+              <w:numPr>
+                <w:ilvl w:val="0"/>
+                <w:numId w:val="1"/>
+              </w:numPr>
+              <w:ind w:left="360"/>
+            </w:pPr>
+            <w:r>
+              <w:t>Meeting</w:t>
+            </w:r>
+          </w:p>
+          <w:p>
+            <w:pPr>
+              <w:pStyle w:val="ListParagraph"/>
+              <w:numPr>
+                <w:ilvl w:val="0"/>
+                <w:numId w:val="1"/>
+              </w:numPr>
+              <w:ind w:left="360"/>
+            </w:pPr>
+            <w:r>
+              <w:t>Continue to analyze the data from the website for the other project that have developed by company.</w:t>
+            </w:r>
+          </w:p>
+          <w:p>
+            <w:pPr>
+              <w:pStyle w:val="ListParagraph"/>
+              <w:numPr>
+                <w:ilvl w:val="0"/>
+                <w:numId w:val="1"/>
+              </w:numPr>
+              <w:spacing w:after="160" w:line="259" w:lineRule="auto"/>
+              <w:ind w:left="360"/>
+            </w:pPr>
+            <w:r>
+              <w:t>Continue to refactor the data seeding code.</w:t>
+            </w:r>
+          </w:p>
+          <w:p>
+            <w:pPr>
+              <w:pStyle w:val="ListParagraph"/>
+              <w:numPr>
+                <w:ilvl w:val="0"/>
+                <w:numId w:val="1"/>
+              </w:numPr>
+              <w:spacing w:after="160" w:line="259" w:lineRule="auto"/>
+              <w:ind w:left="360"/>
+            </w:pPr>
+            <w:r>
+              <w:t>Put the pull request to GitHub repository.</w:t>
+            </w:r>
+          </w:p>
+        </w:tc>
+      </w:tr>
+      <w:tr>
+        <w:tc>
+          <w:tcPr>
+            <w:tcW w:w="0" w:type="auto"/>
+            <w:vMerge/>
+            <w:vAlign w:val="center"/>
+          </w:tcPr>
+          <w:p>
+            <w:pPr>
+              <w:jc w:val="center"/>
+            </w:pPr>
+          </w:p>
+        </w:tc>
+        <w:tc>
+          <w:tcPr>
+            <w:tcW w:w="0" w:type="auto"/>
+            <w:vAlign w:val="center"/>
+          </w:tcPr>
+          <w:p>
+            <w:pPr>
+              <w:jc w:val="center"/>
+            </w:pPr>
+            <w:r>
+              <w:t>2026</w:t>
+            </w:r>
+            <w:r>
+              <w:rPr>
+                <w:rFonts w:hint="eastAsia"/>
+              </w:rPr>
+              <w:t>/</w:t>
+            </w:r>
+            <w:r>
+              <w:t>04</w:t>
+            </w:r>
+            <w:r>
+              <w:rPr>
+                <w:rFonts w:hint="eastAsia"/>
+              </w:rPr>
+              <w:t>/</w:t>
+            </w:r>
+            <w:r>
+              <w:t>22</w:t>
+            </w:r>
+          </w:p>
+        </w:tc>
+        <w:tc>
+          <w:tcPr>
+            <w:tcW w:w="0" w:type="auto"/>
+            <w:vAlign w:val="center"/>
+          </w:tcPr>
+          <w:p>
+            <w:pPr>
+              <w:jc w:val="center"/>
+            </w:pPr>
+            <w:r>
+              <w:rPr>
+                <w:rFonts w:hint="eastAsia"/>
+              </w:rPr>
+              <w:t>(</w:t>
+            </w:r>
+            <w:r>
+              <w:rPr>
+                <w:rFonts w:hint="eastAsia"/>
+              </w:rPr>
+              <w:t>三</w:t>
+            </w:r>
+            <w:r>
+              <w:rPr>
+                <w:rFonts w:hint="eastAsia"/>
+              </w:rPr>
+              <w:t>)</w:t>
+            </w:r>
+          </w:p>
+        </w:tc>
+        <w:tc>
+          <w:tcPr>
+            <w:tcW w:w="0" w:type="auto"/>
+          </w:tcPr>
+          <w:p>
+            <w:pPr>
+              <w:pStyle w:val="ListParagraph"/>
+              <w:numPr>
+                <w:ilvl w:val="0"/>
+                <w:numId w:val="1"/>
+              </w:numPr>
+              <w:ind w:left="360"/>
+            </w:pPr>
+            <w:r>
+              <w:t>Create and prepare the database seeding for another modu</w:t>
+            </w:r>
+            <w:r>
+              <w:t>le.</w:t>
+            </w:r>
+          </w:p>
+        </w:tc>
+      </w:tr>
+      <w:tr>
+        <w:tc>
+          <w:tcPr>
+            <w:tcW w:w="0" w:type="auto"/>
+            <w:vMerge/>
+            <w:vAlign w:val="center"/>
+          </w:tcPr>
+          <w:p>
+            <w:pPr>
+              <w:jc w:val="center"/>
+            </w:pPr>
+          </w:p>
+        </w:tc>
+        <w:tc>
+          <w:tcPr>
+            <w:tcW w:w="0" w:type="auto"/>
+            <w:vAlign w:val="center"/>
+          </w:tcPr>
+          <w:p>
+            <w:pPr>
+              <w:jc w:val="center"/>
+            </w:pPr>
+            <w:r>
+              <w:t>2026</w:t>
+            </w:r>
+            <w:r>
+              <w:rPr>
+                <w:rFonts w:hint="eastAsia"/>
+              </w:rPr>
+              <w:t>/</w:t>
+            </w:r>
+            <w:r>
+              <w:t>04</w:t>
+            </w:r>
+            <w:r>
+              <w:rPr>
+                <w:rFonts w:hint="eastAsia"/>
+              </w:rPr>
+              <w:t>/</w:t>
+            </w:r>
+            <w:r>
+              <w:t>23</w:t>
+            </w:r>
+          </w:p>
+        </w:tc>
+        <w:tc>
+          <w:tcPr>
+            <w:tcW w:w="0" w:type="auto"/>
+            <w:vAlign w:val="center"/>
+          </w:tcPr>
+          <w:p>
+            <w:pPr>
+              <w:jc w:val="center"/>
+            </w:pPr>
+            <w:r>
+              <w:rPr>
+                <w:rFonts w:hint="eastAsia"/>
+              </w:rPr>
+              <w:t>(</w:t>
+            </w:r>
+            <w:r>
+              <w:rPr>
+                <w:rFonts w:hint="eastAsia"/>
+              </w:rPr>
+              <w:t>四</w:t>
+            </w:r>
+            <w:r>
+              <w:rPr>
+                <w:rFonts w:hint="eastAsia"/>
+              </w:rPr>
+              <w:t>)</w:t>
+            </w:r>
+          </w:p>
+        </w:tc>
+        <w:tc>
+          <w:tcPr>
+            <w:tcW w:w="0" w:type="auto"/>
+          </w:tcPr>
+          <w:p>
+            <w:pPr>
+              <w:pStyle w:val="ListParagraph"/>
+              <w:numPr>
+                <w:ilvl w:val="0"/>
+                <w:numId w:val="1"/>
+              </w:numPr>
+              <w:spacing w:after="160" w:line="259" w:lineRule="auto"/>
+              <w:ind w:left="360"/>
+            </w:pPr>
+            <w:r>
+              <w:t>Join the In-class session course, learning the ASP.NET Study Case Project.</w:t>
+            </w:r>
+          </w:p>
+          <w:p>
+            <w:pPr>
+              <w:pStyle w:val="ListParagraph"/>
+              <w:numPr>
+                <w:ilvl w:val="0"/>
+                <w:numId w:val="1"/>
+              </w:numPr>
+              <w:spacing w:after="160" w:line="259" w:lineRule="auto"/>
+              <w:ind w:left="360"/>
+            </w:pPr>
+            <w:r>
+              <w:t>Continue to prepare the database seeding.</w:t>
+            </w:r>
+          </w:p>
+          <w:p>
+            <w:pPr>
+              <w:pStyle w:val="ListParagraph"/>
+              <w:numPr>
+                <w:ilvl w:val="0"/>
+                <w:numId w:val="1"/>
+              </w:numPr>
+              <w:spacing w:after="160" w:line="259" w:lineRule="auto"/>
+              <w:ind w:left="360"/>
+            </w:pPr>
+            <w:r>
+              <w:t xml:space="preserve">Edit </w:t>
+            </w:r>
+            <w:r>
+              <w:t xml:space="preserve">CSV </w:t>
+            </w:r>
+            <w:r>
+              <w:t>data and add the testing.</w:t>
+            </w:r>
+          </w:p>
+          <w:p>
+            <w:pPr>
+              <w:pStyle w:val="ListParagraph"/>
+              <w:numPr>
+                <w:ilvl w:val="0"/>
+                <w:numId w:val="1"/>
+              </w:numPr>
+              <w:ind w:left="360"/>
+            </w:pPr>
+            <w:r>
+              <w:t>Put the pull request to GitHub repository.</w:t>
+            </w:r>
+          </w:p>
+        </w:tc>
+      </w:tr>
+      <w:tr>
+        <w:tc>
+          <w:tcPr>
+            <w:tcW w:w="0" w:type="auto"/>
+            <w:vMerge/>
+            <w:vAlign w:val="center"/>
+          </w:tcPr>
+          <w:p>
+            <w:pPr>
+              <w:jc w:val="center"/>
+            </w:pPr>
+          </w:p>
+        </w:tc>
+        <w:tc>
+          <w:tcPr>
+            <w:tcW w:w="0" w:type="auto"/>
+            <w:vAlign w:val="center"/>
+          </w:tcPr>
+          <w:p>
+            <w:pPr>
+              <w:jc w:val="center"/>
+            </w:pPr>
+            <w:r>
+              <w:t>2026</w:t>
+            </w:r>
+            <w:r>
+              <w:rPr>
+                <w:rFonts w:hint="eastAsia"/>
+              </w:rPr>
+              <w:t>/</w:t>
+            </w:r>
+            <w:r>
+              <w:t>04</w:t>
+            </w:r>
+            <w:r>
+              <w:rPr>
+                <w:rFonts w:hint="eastAsia"/>
+              </w:rPr>
+              <w:t>/</w:t>
+            </w:r>
+            <w:r>
+              <w:t>24</w:t>
             </w:r>
           </w:p>
         </w:tc>

</xml_diff>

<commit_message>
add 20260424-20260430 Internship Report
</commit_message>
<xml_diff>
--- a/周子用-實習報告.docx
+++ b/周子用-實習報告.docx
@@ -67,8 +67,8 @@
       <w:tblGrid>
         <w:gridCol w:w="776"/>
         <w:gridCol w:w="1310"/>
-        <w:gridCol w:w="616"/>
-        <w:gridCol w:w="6314"/>
+        <w:gridCol w:w="936"/>
+        <w:gridCol w:w="5994"/>
       </w:tblGrid>
       <w:tr>
         <w:tc>
@@ -144,12 +144,14 @@
             <w:pPr>
               <w:jc w:val="center"/>
             </w:pPr>
+            <w:proofErr w:type="gramStart"/>
             <w:r>
               <w:rPr>
                 <w:rFonts w:hint="eastAsia"/>
               </w:rPr>
               <w:t>一</w:t>
             </w:r>
+            <w:proofErr w:type="gramEnd"/>
           </w:p>
         </w:tc>
         <w:tc>
@@ -863,6 +865,7 @@
               <w:br/>
               <w:t>(</w:t>
             </w:r>
+            <w:proofErr w:type="spellStart"/>
             <w:r>
               <w:rPr>
                 <w:rFonts w:hint="eastAsia"/>
@@ -870,7 +873,19 @@
               <w:t>T</w:t>
             </w:r>
             <w:r>
-              <w:t>oDo Application, BookStore Application</w:t>
+              <w:t>oDo</w:t>
+            </w:r>
+            <w:proofErr w:type="spellEnd"/>
+            <w:r>
+              <w:t xml:space="preserve"> Application, </w:t>
+            </w:r>
+            <w:proofErr w:type="spellStart"/>
+            <w:r>
+              <w:t>BookStore</w:t>
+            </w:r>
+            <w:proofErr w:type="spellEnd"/>
+            <w:r>
+              <w:t xml:space="preserve"> Application</w:t>
             </w:r>
             <w:r>
               <w:rPr>
@@ -2468,7 +2483,15 @@
               <w:t>JSON API</w:t>
             </w:r>
             <w:r>
-              <w:t xml:space="preserve">, how to use Stimulsoft </w:t>
+              <w:t xml:space="preserve">, how to use </w:t>
+            </w:r>
+            <w:proofErr w:type="spellStart"/>
+            <w:r>
+              <w:t>Stimulsoft</w:t>
+            </w:r>
+            <w:proofErr w:type="spellEnd"/>
+            <w:r>
+              <w:t xml:space="preserve"> </w:t>
             </w:r>
             <w:r>
               <w:t xml:space="preserve">Report </w:t>
@@ -2567,7 +2590,15 @@
               <w:ind w:left="360"/>
             </w:pPr>
             <w:r>
-              <w:t>Using Stimulsoft Report Designer to generate 2 reports.</w:t>
+              <w:t xml:space="preserve">Using </w:t>
+            </w:r>
+            <w:proofErr w:type="spellStart"/>
+            <w:r>
+              <w:t>Stimulsoft</w:t>
+            </w:r>
+            <w:proofErr w:type="spellEnd"/>
+            <w:r>
+              <w:t xml:space="preserve"> Report Designer to generate 2 reports.</w:t>
             </w:r>
           </w:p>
           <w:p>
@@ -2605,7 +2636,15 @@
               <w:ind w:left="360"/>
             </w:pPr>
             <w:r>
-              <w:t>Summary the online meeting and create powerpoint.</w:t>
+              <w:t xml:space="preserve">Summary the online meeting and create </w:t>
+            </w:r>
+            <w:proofErr w:type="spellStart"/>
+            <w:r>
+              <w:t>powerpoint</w:t>
+            </w:r>
+            <w:proofErr w:type="spellEnd"/>
+            <w:r>
+              <w:t>.</w:t>
             </w:r>
           </w:p>
         </w:tc>
@@ -2698,7 +2737,15 @@
               <w:ind w:left="360"/>
             </w:pPr>
             <w:r>
-              <w:t>Using Stimulsoft Report Designer to generate 8 reports</w:t>
+              <w:t xml:space="preserve">Using </w:t>
+            </w:r>
+            <w:proofErr w:type="spellStart"/>
+            <w:r>
+              <w:t>Stimulsoft</w:t>
+            </w:r>
+            <w:proofErr w:type="spellEnd"/>
+            <w:r>
+              <w:t xml:space="preserve"> Report Designer to generate 8 reports</w:t>
             </w:r>
             <w:r>
               <w:t xml:space="preserve"> </w:t>
@@ -2943,7 +2990,15 @@
               <w:ind w:left="360"/>
             </w:pPr>
             <w:r>
-              <w:t>Generate 2 reports with Stimulsoft Report Designer.</w:t>
+              <w:t xml:space="preserve">Generate 2 reports with </w:t>
+            </w:r>
+            <w:proofErr w:type="spellStart"/>
+            <w:r>
+              <w:t>Stimulsoft</w:t>
+            </w:r>
+            <w:proofErr w:type="spellEnd"/>
+            <w:r>
+              <w:t xml:space="preserve"> Report Designer.</w:t>
             </w:r>
           </w:p>
         </w:tc>
@@ -4229,13 +4284,7 @@
               <w:ind w:left="360"/>
             </w:pPr>
             <w:r>
-              <w:t xml:space="preserve">Join the In-class session course, learning the </w:t>
-            </w:r>
-            <w:r>
-              <w:t>ASP.NET Study Case Project</w:t>
-            </w:r>
-            <w:r>
-              <w:t>.</w:t>
+              <w:t>Join the In-class session course, learning the ASP.NET Study Case Project.</w:t>
             </w:r>
           </w:p>
           <w:p>
@@ -4634,7 +4683,7 @@
                 <w:ilvl w:val="0"/>
                 <w:numId w:val="1"/>
               </w:numPr>
-              <w:spacing w:after="160" w:line="259" w:lineRule="auto"/>
+              <w:spacing w:line="259" w:lineRule="auto"/>
               <w:ind w:left="360"/>
             </w:pPr>
             <w:r>
@@ -4951,6 +5000,529 @@
                 <w:rFonts w:hint="eastAsia"/>
               </w:rPr>
               <w:t>)</w:t>
+            </w:r>
+          </w:p>
+        </w:tc>
+        <w:tc>
+          <w:tcPr>
+            <w:tcW w:w="0" w:type="auto"/>
+          </w:tcPr>
+          <w:p>
+            <w:pPr>
+              <w:pStyle w:val="ListParagraph"/>
+              <w:numPr>
+                <w:ilvl w:val="0"/>
+                <w:numId w:val="1"/>
+              </w:numPr>
+              <w:ind w:left="360"/>
+            </w:pPr>
+            <w:r>
+              <w:t>M</w:t>
+            </w:r>
+            <w:r>
+              <w:rPr>
+                <w:rFonts w:hint="eastAsia"/>
+              </w:rPr>
+              <w:t>eet</w:t>
+            </w:r>
+            <w:r>
+              <w:t>ing</w:t>
+            </w:r>
+          </w:p>
+          <w:p>
+            <w:pPr>
+              <w:pStyle w:val="ListParagraph"/>
+              <w:numPr>
+                <w:ilvl w:val="0"/>
+                <w:numId w:val="1"/>
+              </w:numPr>
+              <w:spacing w:after="160" w:line="259" w:lineRule="auto"/>
+              <w:ind w:left="360"/>
+            </w:pPr>
+            <w:r>
+              <w:lastRenderedPageBreak/>
+              <w:t>Continue to prepare the database seeding.</w:t>
+            </w:r>
+          </w:p>
+          <w:p>
+            <w:pPr>
+              <w:pStyle w:val="ListParagraph"/>
+              <w:numPr>
+                <w:ilvl w:val="0"/>
+                <w:numId w:val="1"/>
+              </w:numPr>
+              <w:ind w:left="360"/>
+            </w:pPr>
+            <w:r>
+              <w:t>Testing and Searching Bug.</w:t>
+            </w:r>
+          </w:p>
+        </w:tc>
+      </w:tr>
+      <w:tr>
+        <w:tc>
+          <w:tcPr>
+            <w:tcW w:w="0" w:type="auto"/>
+            <w:vMerge w:val="restart"/>
+            <w:vAlign w:val="center"/>
+          </w:tcPr>
+          <w:p>
+            <w:pPr>
+              <w:jc w:val="center"/>
+            </w:pPr>
+            <w:r>
+              <w:rPr>
+                <w:rFonts w:hint="eastAsia"/>
+              </w:rPr>
+              <w:lastRenderedPageBreak/>
+              <w:t>九</w:t>
+            </w:r>
+          </w:p>
+        </w:tc>
+        <w:tc>
+          <w:tcPr>
+            <w:tcW w:w="0" w:type="auto"/>
+            <w:vAlign w:val="center"/>
+          </w:tcPr>
+          <w:p>
+            <w:pPr>
+              <w:jc w:val="center"/>
+            </w:pPr>
+            <w:r>
+              <w:t>2026</w:t>
+            </w:r>
+            <w:r>
+              <w:rPr>
+                <w:rFonts w:hint="eastAsia"/>
+              </w:rPr>
+              <w:t>/</w:t>
+            </w:r>
+            <w:r>
+              <w:t>04</w:t>
+            </w:r>
+            <w:r>
+              <w:rPr>
+                <w:rFonts w:hint="eastAsia"/>
+              </w:rPr>
+              <w:t>/</w:t>
+            </w:r>
+            <w:r>
+              <w:t>27</w:t>
+            </w:r>
+          </w:p>
+        </w:tc>
+        <w:tc>
+          <w:tcPr>
+            <w:tcW w:w="0" w:type="auto"/>
+            <w:vAlign w:val="center"/>
+          </w:tcPr>
+          <w:p>
+            <w:pPr>
+              <w:jc w:val="center"/>
+            </w:pPr>
+            <w:r>
+              <w:t>(</w:t>
+            </w:r>
+            <w:r>
+              <w:rPr>
+                <w:rFonts w:hint="eastAsia"/>
+              </w:rPr>
+              <w:t>一</w:t>
+            </w:r>
+            <w:r>
+              <w:t>)</w:t>
+            </w:r>
+          </w:p>
+        </w:tc>
+        <w:tc>
+          <w:tcPr>
+            <w:tcW w:w="0" w:type="auto"/>
+          </w:tcPr>
+          <w:p>
+            <w:pPr>
+              <w:pStyle w:val="ListParagraph"/>
+              <w:numPr>
+                <w:ilvl w:val="0"/>
+                <w:numId w:val="1"/>
+              </w:numPr>
+              <w:ind w:left="360"/>
+            </w:pPr>
+            <w:r>
+              <w:t>Meeting</w:t>
+            </w:r>
+          </w:p>
+          <w:p>
+            <w:pPr>
+              <w:pStyle w:val="ListParagraph"/>
+              <w:numPr>
+                <w:ilvl w:val="0"/>
+                <w:numId w:val="1"/>
+              </w:numPr>
+              <w:ind w:left="360"/>
+            </w:pPr>
+            <w:r>
+              <w:t>Setup Front End Project.</w:t>
+            </w:r>
+          </w:p>
+        </w:tc>
+      </w:tr>
+      <w:tr>
+        <w:tc>
+          <w:tcPr>
+            <w:tcW w:w="0" w:type="auto"/>
+            <w:vMerge/>
+            <w:vAlign w:val="center"/>
+          </w:tcPr>
+          <w:p>
+            <w:pPr>
+              <w:jc w:val="center"/>
+            </w:pPr>
+          </w:p>
+        </w:tc>
+        <w:tc>
+          <w:tcPr>
+            <w:tcW w:w="0" w:type="auto"/>
+            <w:vAlign w:val="center"/>
+          </w:tcPr>
+          <w:p>
+            <w:pPr>
+              <w:jc w:val="center"/>
+            </w:pPr>
+            <w:r>
+              <w:t>2026</w:t>
+            </w:r>
+            <w:r>
+              <w:rPr>
+                <w:rFonts w:hint="eastAsia"/>
+              </w:rPr>
+              <w:t>/</w:t>
+            </w:r>
+            <w:r>
+              <w:t>04</w:t>
+            </w:r>
+            <w:r>
+              <w:rPr>
+                <w:rFonts w:hint="eastAsia"/>
+              </w:rPr>
+              <w:t>/</w:t>
+            </w:r>
+            <w:r>
+              <w:t>28</w:t>
+            </w:r>
+          </w:p>
+        </w:tc>
+        <w:tc>
+          <w:tcPr>
+            <w:tcW w:w="0" w:type="auto"/>
+            <w:vAlign w:val="center"/>
+          </w:tcPr>
+          <w:p>
+            <w:pPr>
+              <w:jc w:val="center"/>
+            </w:pPr>
+            <w:r>
+              <w:rPr>
+                <w:rFonts w:hint="eastAsia"/>
+              </w:rPr>
+              <w:t>(</w:t>
+            </w:r>
+            <w:r>
+              <w:rPr>
+                <w:rFonts w:hint="eastAsia"/>
+              </w:rPr>
+              <w:t>二</w:t>
+            </w:r>
+            <w:r>
+              <w:rPr>
+                <w:rFonts w:hint="eastAsia"/>
+              </w:rPr>
+              <w:t>)</w:t>
+            </w:r>
+          </w:p>
+        </w:tc>
+        <w:tc>
+          <w:tcPr>
+            <w:tcW w:w="0" w:type="auto"/>
+          </w:tcPr>
+          <w:p>
+            <w:pPr>
+              <w:pStyle w:val="ListParagraph"/>
+              <w:numPr>
+                <w:ilvl w:val="0"/>
+                <w:numId w:val="1"/>
+              </w:numPr>
+              <w:ind w:left="360"/>
+            </w:pPr>
+            <w:r>
+              <w:t>Meeting</w:t>
+            </w:r>
+            <w:r>
+              <w:t>.</w:t>
+            </w:r>
+          </w:p>
+          <w:p>
+            <w:pPr>
+              <w:pStyle w:val="ListParagraph"/>
+              <w:numPr>
+                <w:ilvl w:val="0"/>
+                <w:numId w:val="1"/>
+              </w:numPr>
+              <w:ind w:left="360"/>
+            </w:pPr>
+            <w:r>
+              <w:t>Input data</w:t>
+            </w:r>
+            <w:r>
+              <w:t xml:space="preserve"> to Company Project.</w:t>
+            </w:r>
+          </w:p>
+        </w:tc>
+      </w:tr>
+      <w:tr>
+        <w:tc>
+          <w:tcPr>
+            <w:tcW w:w="0" w:type="auto"/>
+            <w:vMerge/>
+            <w:vAlign w:val="center"/>
+          </w:tcPr>
+          <w:p>
+            <w:pPr>
+              <w:jc w:val="center"/>
+            </w:pPr>
+          </w:p>
+        </w:tc>
+        <w:tc>
+          <w:tcPr>
+            <w:tcW w:w="0" w:type="auto"/>
+            <w:vAlign w:val="center"/>
+          </w:tcPr>
+          <w:p>
+            <w:pPr>
+              <w:jc w:val="center"/>
+            </w:pPr>
+            <w:r>
+              <w:t>2026</w:t>
+            </w:r>
+            <w:r>
+              <w:rPr>
+                <w:rFonts w:hint="eastAsia"/>
+              </w:rPr>
+              <w:t>/</w:t>
+            </w:r>
+            <w:r>
+              <w:t>04</w:t>
+            </w:r>
+            <w:r>
+              <w:rPr>
+                <w:rFonts w:hint="eastAsia"/>
+              </w:rPr>
+              <w:t>/</w:t>
+            </w:r>
+            <w:r>
+              <w:t>29</w:t>
+            </w:r>
+          </w:p>
+        </w:tc>
+        <w:tc>
+          <w:tcPr>
+            <w:tcW w:w="0" w:type="auto"/>
+            <w:vAlign w:val="center"/>
+          </w:tcPr>
+          <w:p>
+            <w:pPr>
+              <w:jc w:val="center"/>
+            </w:pPr>
+            <w:r>
+              <w:rPr>
+                <w:rFonts w:hint="eastAsia"/>
+              </w:rPr>
+              <w:t>(</w:t>
+            </w:r>
+            <w:r>
+              <w:rPr>
+                <w:rFonts w:hint="eastAsia"/>
+              </w:rPr>
+              <w:t>三</w:t>
+            </w:r>
+            <w:r>
+              <w:rPr>
+                <w:rFonts w:hint="eastAsia"/>
+              </w:rPr>
+              <w:t>)</w:t>
+            </w:r>
+          </w:p>
+        </w:tc>
+        <w:tc>
+          <w:tcPr>
+            <w:tcW w:w="0" w:type="auto"/>
+          </w:tcPr>
+          <w:p>
+            <w:pPr>
+              <w:pStyle w:val="ListParagraph"/>
+              <w:numPr>
+                <w:ilvl w:val="0"/>
+                <w:numId w:val="1"/>
+              </w:numPr>
+              <w:ind w:left="360"/>
+            </w:pPr>
+            <w:r>
+              <w:t>Continue to input data and searching bugs.</w:t>
+            </w:r>
+          </w:p>
+        </w:tc>
+      </w:tr>
+      <w:tr>
+        <w:tc>
+          <w:tcPr>
+            <w:tcW w:w="0" w:type="auto"/>
+            <w:vMerge/>
+            <w:vAlign w:val="center"/>
+          </w:tcPr>
+          <w:p>
+            <w:pPr>
+              <w:jc w:val="center"/>
+            </w:pPr>
+          </w:p>
+        </w:tc>
+        <w:tc>
+          <w:tcPr>
+            <w:tcW w:w="0" w:type="auto"/>
+            <w:vAlign w:val="center"/>
+          </w:tcPr>
+          <w:p>
+            <w:pPr>
+              <w:jc w:val="center"/>
+            </w:pPr>
+            <w:r>
+              <w:t>2026</w:t>
+            </w:r>
+            <w:r>
+              <w:rPr>
+                <w:rFonts w:hint="eastAsia"/>
+              </w:rPr>
+              <w:t>/</w:t>
+            </w:r>
+            <w:r>
+              <w:t>04</w:t>
+            </w:r>
+            <w:r>
+              <w:rPr>
+                <w:rFonts w:hint="eastAsia"/>
+              </w:rPr>
+              <w:t>/</w:t>
+            </w:r>
+            <w:r>
+              <w:t>30</w:t>
+            </w:r>
+          </w:p>
+        </w:tc>
+        <w:tc>
+          <w:tcPr>
+            <w:tcW w:w="0" w:type="auto"/>
+            <w:vAlign w:val="center"/>
+          </w:tcPr>
+          <w:p>
+            <w:pPr>
+              <w:jc w:val="center"/>
+            </w:pPr>
+            <w:r>
+              <w:rPr>
+                <w:rFonts w:hint="eastAsia"/>
+              </w:rPr>
+              <w:t>(</w:t>
+            </w:r>
+            <w:r>
+              <w:rPr>
+                <w:rFonts w:hint="eastAsia"/>
+              </w:rPr>
+              <w:t>四</w:t>
+            </w:r>
+            <w:r>
+              <w:rPr>
+                <w:rFonts w:hint="eastAsia"/>
+              </w:rPr>
+              <w:t>)</w:t>
+            </w:r>
+          </w:p>
+        </w:tc>
+        <w:tc>
+          <w:tcPr>
+            <w:tcW w:w="0" w:type="auto"/>
+          </w:tcPr>
+          <w:p>
+            <w:pPr>
+              <w:pStyle w:val="ListParagraph"/>
+              <w:numPr>
+                <w:ilvl w:val="0"/>
+                <w:numId w:val="1"/>
+              </w:numPr>
+              <w:ind w:left="360"/>
+            </w:pPr>
+            <w:r>
+              <w:t>Continue to input data and searching bugs.</w:t>
+            </w:r>
+          </w:p>
+        </w:tc>
+      </w:tr>
+      <w:tr>
+        <w:tc>
+          <w:tcPr>
+            <w:tcW w:w="0" w:type="auto"/>
+            <w:vMerge/>
+            <w:vAlign w:val="center"/>
+          </w:tcPr>
+          <w:p>
+            <w:pPr>
+              <w:jc w:val="center"/>
+            </w:pPr>
+          </w:p>
+        </w:tc>
+        <w:tc>
+          <w:tcPr>
+            <w:tcW w:w="0" w:type="auto"/>
+            <w:vAlign w:val="center"/>
+          </w:tcPr>
+          <w:p>
+            <w:pPr>
+              <w:jc w:val="center"/>
+            </w:pPr>
+            <w:r>
+              <w:t>2026</w:t>
+            </w:r>
+            <w:r>
+              <w:rPr>
+                <w:rFonts w:hint="eastAsia"/>
+              </w:rPr>
+              <w:t>/</w:t>
+            </w:r>
+            <w:r>
+              <w:t>05</w:t>
+            </w:r>
+            <w:r>
+              <w:rPr>
+                <w:rFonts w:hint="eastAsia"/>
+              </w:rPr>
+              <w:t>/</w:t>
+            </w:r>
+            <w:r>
+              <w:t>01</w:t>
+            </w:r>
+          </w:p>
+        </w:tc>
+        <w:tc>
+          <w:tcPr>
+            <w:tcW w:w="0" w:type="auto"/>
+            <w:vAlign w:val="center"/>
+          </w:tcPr>
+          <w:p>
+            <w:pPr>
+              <w:jc w:val="center"/>
+            </w:pPr>
+            <w:r>
+              <w:rPr>
+                <w:rFonts w:hint="eastAsia"/>
+              </w:rPr>
+              <w:t>（五）</w:t>
             </w:r>
           </w:p>
         </w:tc>

</xml_diff>

<commit_message>
add 20260504-20260522 Internship Report
</commit_message>
<xml_diff>
--- a/周子用-實習報告.docx
+++ b/周子用-實習報告.docx
@@ -144,14 +144,12 @@
             <w:pPr>
               <w:jc w:val="center"/>
             </w:pPr>
-            <w:proofErr w:type="gramStart"/>
             <w:r>
               <w:rPr>
                 <w:rFonts w:hint="eastAsia"/>
               </w:rPr>
               <w:t>一</w:t>
             </w:r>
-            <w:proofErr w:type="gramEnd"/>
           </w:p>
         </w:tc>
         <w:tc>
@@ -865,7 +863,6 @@
               <w:br/>
               <w:t>(</w:t>
             </w:r>
-            <w:proofErr w:type="spellStart"/>
             <w:r>
               <w:rPr>
                 <w:rFonts w:hint="eastAsia"/>
@@ -873,19 +870,7 @@
               <w:t>T</w:t>
             </w:r>
             <w:r>
-              <w:t>oDo</w:t>
-            </w:r>
-            <w:proofErr w:type="spellEnd"/>
-            <w:r>
-              <w:t xml:space="preserve"> Application, </w:t>
-            </w:r>
-            <w:proofErr w:type="spellStart"/>
-            <w:r>
-              <w:t>BookStore</w:t>
-            </w:r>
-            <w:proofErr w:type="spellEnd"/>
-            <w:r>
-              <w:t xml:space="preserve"> Application</w:t>
+              <w:t>oDo Application, BookStore Application</w:t>
             </w:r>
             <w:r>
               <w:rPr>
@@ -2483,15 +2468,7 @@
               <w:t>JSON API</w:t>
             </w:r>
             <w:r>
-              <w:t xml:space="preserve">, how to use </w:t>
-            </w:r>
-            <w:proofErr w:type="spellStart"/>
-            <w:r>
-              <w:t>Stimulsoft</w:t>
-            </w:r>
-            <w:proofErr w:type="spellEnd"/>
-            <w:r>
-              <w:t xml:space="preserve"> </w:t>
+              <w:t xml:space="preserve">, how to use Stimulsoft </w:t>
             </w:r>
             <w:r>
               <w:t xml:space="preserve">Report </w:t>
@@ -2590,15 +2567,7 @@
               <w:ind w:left="360"/>
             </w:pPr>
             <w:r>
-              <w:t xml:space="preserve">Using </w:t>
-            </w:r>
-            <w:proofErr w:type="spellStart"/>
-            <w:r>
-              <w:t>Stimulsoft</w:t>
-            </w:r>
-            <w:proofErr w:type="spellEnd"/>
-            <w:r>
-              <w:t xml:space="preserve"> Report Designer to generate 2 reports.</w:t>
+              <w:t>Using Stimulsoft Report Designer to generate 2 reports.</w:t>
             </w:r>
           </w:p>
           <w:p>
@@ -2636,15 +2605,7 @@
               <w:ind w:left="360"/>
             </w:pPr>
             <w:r>
-              <w:t xml:space="preserve">Summary the online meeting and create </w:t>
-            </w:r>
-            <w:proofErr w:type="spellStart"/>
-            <w:r>
-              <w:t>powerpoint</w:t>
-            </w:r>
-            <w:proofErr w:type="spellEnd"/>
-            <w:r>
-              <w:t>.</w:t>
+              <w:t>Summary the online meeting and create powerpoint.</w:t>
             </w:r>
           </w:p>
         </w:tc>
@@ -2737,15 +2698,7 @@
               <w:ind w:left="360"/>
             </w:pPr>
             <w:r>
-              <w:t xml:space="preserve">Using </w:t>
-            </w:r>
-            <w:proofErr w:type="spellStart"/>
-            <w:r>
-              <w:t>Stimulsoft</w:t>
-            </w:r>
-            <w:proofErr w:type="spellEnd"/>
-            <w:r>
-              <w:t xml:space="preserve"> Report Designer to generate 8 reports</w:t>
+              <w:t>Using Stimulsoft Report Designer to generate 8 reports</w:t>
             </w:r>
             <w:r>
               <w:t xml:space="preserve"> </w:t>
@@ -2990,15 +2943,7 @@
               <w:ind w:left="360"/>
             </w:pPr>
             <w:r>
-              <w:t xml:space="preserve">Generate 2 reports with </w:t>
-            </w:r>
-            <w:proofErr w:type="spellStart"/>
-            <w:r>
-              <w:t>Stimulsoft</w:t>
-            </w:r>
-            <w:proofErr w:type="spellEnd"/>
-            <w:r>
-              <w:t xml:space="preserve"> Report Designer.</w:t>
+              <w:t>Generate 2 reports with Stimulsoft Report Designer.</w:t>
             </w:r>
           </w:p>
         </w:tc>
@@ -5506,6 +5451,2155 @@
             </w:r>
             <w:r>
               <w:t>01</w:t>
+            </w:r>
+          </w:p>
+        </w:tc>
+        <w:tc>
+          <w:tcPr>
+            <w:tcW w:w="0" w:type="auto"/>
+            <w:vAlign w:val="center"/>
+          </w:tcPr>
+          <w:p>
+            <w:pPr>
+              <w:jc w:val="center"/>
+            </w:pPr>
+            <w:r>
+              <w:rPr>
+                <w:rFonts w:hint="eastAsia"/>
+              </w:rPr>
+              <w:t>（五）</w:t>
+            </w:r>
+          </w:p>
+        </w:tc>
+        <w:tc>
+          <w:tcPr>
+            <w:tcW w:w="0" w:type="auto"/>
+          </w:tcPr>
+          <w:p>
+            <w:pPr>
+              <w:pStyle w:val="ListParagraph"/>
+              <w:numPr>
+                <w:ilvl w:val="0"/>
+                <w:numId w:val="1"/>
+              </w:numPr>
+              <w:ind w:left="360"/>
+            </w:pPr>
+            <w:r>
+              <w:t>-</w:t>
+            </w:r>
+          </w:p>
+        </w:tc>
+      </w:tr>
+      <w:tr>
+        <w:tc>
+          <w:tcPr>
+            <w:tcW w:w="0" w:type="auto"/>
+            <w:vMerge w:val="restart"/>
+            <w:vAlign w:val="center"/>
+          </w:tcPr>
+          <w:p>
+            <w:pPr>
+              <w:jc w:val="center"/>
+            </w:pPr>
+            <w:r>
+              <w:rPr>
+                <w:rFonts w:hint="eastAsia"/>
+              </w:rPr>
+              <w:t>十</w:t>
+            </w:r>
+          </w:p>
+        </w:tc>
+        <w:tc>
+          <w:tcPr>
+            <w:tcW w:w="0" w:type="auto"/>
+            <w:vAlign w:val="center"/>
+          </w:tcPr>
+          <w:p>
+            <w:pPr>
+              <w:jc w:val="center"/>
+            </w:pPr>
+            <w:r>
+              <w:t>2026</w:t>
+            </w:r>
+            <w:r>
+              <w:rPr>
+                <w:rFonts w:hint="eastAsia"/>
+              </w:rPr>
+              <w:t>/</w:t>
+            </w:r>
+            <w:r>
+              <w:t>05</w:t>
+            </w:r>
+            <w:r>
+              <w:rPr>
+                <w:rFonts w:hint="eastAsia"/>
+              </w:rPr>
+              <w:t>/</w:t>
+            </w:r>
+            <w:r>
+              <w:t>04</w:t>
+            </w:r>
+          </w:p>
+        </w:tc>
+        <w:tc>
+          <w:tcPr>
+            <w:tcW w:w="0" w:type="auto"/>
+            <w:vAlign w:val="center"/>
+          </w:tcPr>
+          <w:p>
+            <w:pPr>
+              <w:jc w:val="center"/>
+            </w:pPr>
+            <w:r>
+              <w:t>(</w:t>
+            </w:r>
+            <w:r>
+              <w:rPr>
+                <w:rFonts w:hint="eastAsia"/>
+              </w:rPr>
+              <w:t>一</w:t>
+            </w:r>
+            <w:r>
+              <w:t>)</w:t>
+            </w:r>
+          </w:p>
+        </w:tc>
+        <w:tc>
+          <w:tcPr>
+            <w:tcW w:w="0" w:type="auto"/>
+          </w:tcPr>
+          <w:p>
+            <w:pPr>
+              <w:pStyle w:val="ListParagraph"/>
+              <w:numPr>
+                <w:ilvl w:val="0"/>
+                <w:numId w:val="1"/>
+              </w:numPr>
+              <w:ind w:left="360"/>
+            </w:pPr>
+            <w:r>
+              <w:t>Meeting</w:t>
+            </w:r>
+            <w:r>
+              <w:t>.</w:t>
+            </w:r>
+          </w:p>
+          <w:p>
+            <w:pPr>
+              <w:pStyle w:val="ListParagraph"/>
+              <w:numPr>
+                <w:ilvl w:val="0"/>
+                <w:numId w:val="1"/>
+              </w:numPr>
+              <w:ind w:left="360"/>
+            </w:pPr>
+            <w:r>
+              <w:t xml:space="preserve">Reorganize company </w:t>
+            </w:r>
+            <w:r>
+              <w:t>inventory</w:t>
+            </w:r>
+            <w:r>
+              <w:t>.</w:t>
+            </w:r>
+          </w:p>
+        </w:tc>
+      </w:tr>
+      <w:tr>
+        <w:tc>
+          <w:tcPr>
+            <w:tcW w:w="0" w:type="auto"/>
+            <w:vMerge/>
+            <w:vAlign w:val="center"/>
+          </w:tcPr>
+          <w:p>
+            <w:pPr>
+              <w:jc w:val="center"/>
+            </w:pPr>
+          </w:p>
+        </w:tc>
+        <w:tc>
+          <w:tcPr>
+            <w:tcW w:w="0" w:type="auto"/>
+            <w:vAlign w:val="center"/>
+          </w:tcPr>
+          <w:p>
+            <w:pPr>
+              <w:jc w:val="center"/>
+            </w:pPr>
+            <w:r>
+              <w:t>2026</w:t>
+            </w:r>
+            <w:r>
+              <w:rPr>
+                <w:rFonts w:hint="eastAsia"/>
+              </w:rPr>
+              <w:t>/</w:t>
+            </w:r>
+            <w:r>
+              <w:t>05</w:t>
+            </w:r>
+            <w:r>
+              <w:rPr>
+                <w:rFonts w:hint="eastAsia"/>
+              </w:rPr>
+              <w:t>/</w:t>
+            </w:r>
+            <w:r>
+              <w:t>05</w:t>
+            </w:r>
+          </w:p>
+        </w:tc>
+        <w:tc>
+          <w:tcPr>
+            <w:tcW w:w="0" w:type="auto"/>
+            <w:vAlign w:val="center"/>
+          </w:tcPr>
+          <w:p>
+            <w:pPr>
+              <w:jc w:val="center"/>
+            </w:pPr>
+            <w:r>
+              <w:rPr>
+                <w:rFonts w:hint="eastAsia"/>
+              </w:rPr>
+              <w:t>(</w:t>
+            </w:r>
+            <w:r>
+              <w:rPr>
+                <w:rFonts w:hint="eastAsia"/>
+              </w:rPr>
+              <w:t>二</w:t>
+            </w:r>
+            <w:r>
+              <w:rPr>
+                <w:rFonts w:hint="eastAsia"/>
+              </w:rPr>
+              <w:t>)</w:t>
+            </w:r>
+          </w:p>
+        </w:tc>
+        <w:tc>
+          <w:tcPr>
+            <w:tcW w:w="0" w:type="auto"/>
+          </w:tcPr>
+          <w:p>
+            <w:pPr>
+              <w:pStyle w:val="ListParagraph"/>
+              <w:numPr>
+                <w:ilvl w:val="0"/>
+                <w:numId w:val="1"/>
+              </w:numPr>
+              <w:ind w:left="360"/>
+            </w:pPr>
+            <w:r>
+              <w:t>Meeting</w:t>
+            </w:r>
+            <w:r>
+              <w:t>.</w:t>
+            </w:r>
+          </w:p>
+          <w:p>
+            <w:pPr>
+              <w:pStyle w:val="ListParagraph"/>
+              <w:numPr>
+                <w:ilvl w:val="0"/>
+                <w:numId w:val="1"/>
+              </w:numPr>
+              <w:ind w:left="360"/>
+            </w:pPr>
+            <w:r>
+              <w:t>Search Storybook Bugs</w:t>
+            </w:r>
+            <w:r>
+              <w:t>.</w:t>
+            </w:r>
+          </w:p>
+        </w:tc>
+      </w:tr>
+      <w:tr>
+        <w:tc>
+          <w:tcPr>
+            <w:tcW w:w="0" w:type="auto"/>
+            <w:vMerge/>
+            <w:vAlign w:val="center"/>
+          </w:tcPr>
+          <w:p>
+            <w:pPr>
+              <w:jc w:val="center"/>
+            </w:pPr>
+          </w:p>
+        </w:tc>
+        <w:tc>
+          <w:tcPr>
+            <w:tcW w:w="0" w:type="auto"/>
+            <w:vAlign w:val="center"/>
+          </w:tcPr>
+          <w:p>
+            <w:pPr>
+              <w:jc w:val="center"/>
+            </w:pPr>
+            <w:r>
+              <w:t>2026</w:t>
+            </w:r>
+            <w:r>
+              <w:rPr>
+                <w:rFonts w:hint="eastAsia"/>
+              </w:rPr>
+              <w:t>/</w:t>
+            </w:r>
+            <w:r>
+              <w:t>05</w:t>
+            </w:r>
+            <w:r>
+              <w:rPr>
+                <w:rFonts w:hint="eastAsia"/>
+              </w:rPr>
+              <w:t>/</w:t>
+            </w:r>
+            <w:r>
+              <w:t>06</w:t>
+            </w:r>
+          </w:p>
+        </w:tc>
+        <w:tc>
+          <w:tcPr>
+            <w:tcW w:w="0" w:type="auto"/>
+            <w:vAlign w:val="center"/>
+          </w:tcPr>
+          <w:p>
+            <w:pPr>
+              <w:jc w:val="center"/>
+            </w:pPr>
+            <w:r>
+              <w:rPr>
+                <w:rFonts w:hint="eastAsia"/>
+              </w:rPr>
+              <w:t>(</w:t>
+            </w:r>
+            <w:r>
+              <w:rPr>
+                <w:rFonts w:hint="eastAsia"/>
+              </w:rPr>
+              <w:t>三</w:t>
+            </w:r>
+            <w:r>
+              <w:rPr>
+                <w:rFonts w:hint="eastAsia"/>
+              </w:rPr>
+              <w:t>)</w:t>
+            </w:r>
+          </w:p>
+        </w:tc>
+        <w:tc>
+          <w:tcPr>
+            <w:tcW w:w="0" w:type="auto"/>
+          </w:tcPr>
+          <w:p>
+            <w:pPr>
+              <w:pStyle w:val="ListParagraph"/>
+              <w:numPr>
+                <w:ilvl w:val="0"/>
+                <w:numId w:val="1"/>
+              </w:numPr>
+              <w:ind w:left="360"/>
+            </w:pPr>
+            <w:r>
+              <w:t>Meeting</w:t>
+            </w:r>
+            <w:r>
+              <w:t>.</w:t>
+            </w:r>
+          </w:p>
+          <w:p>
+            <w:pPr>
+              <w:pStyle w:val="ListParagraph"/>
+              <w:numPr>
+                <w:ilvl w:val="0"/>
+                <w:numId w:val="1"/>
+              </w:numPr>
+              <w:ind w:left="360"/>
+            </w:pPr>
+            <w:r>
+              <w:t>Verify the bug fixes</w:t>
+            </w:r>
+            <w:r>
+              <w:t>.</w:t>
+            </w:r>
+          </w:p>
+        </w:tc>
+      </w:tr>
+      <w:tr>
+        <w:tc>
+          <w:tcPr>
+            <w:tcW w:w="0" w:type="auto"/>
+            <w:vMerge/>
+            <w:vAlign w:val="center"/>
+          </w:tcPr>
+          <w:p>
+            <w:pPr>
+              <w:jc w:val="center"/>
+            </w:pPr>
+          </w:p>
+        </w:tc>
+        <w:tc>
+          <w:tcPr>
+            <w:tcW w:w="0" w:type="auto"/>
+            <w:vAlign w:val="center"/>
+          </w:tcPr>
+          <w:p>
+            <w:pPr>
+              <w:jc w:val="center"/>
+            </w:pPr>
+            <w:r>
+              <w:t>2026</w:t>
+            </w:r>
+            <w:r>
+              <w:rPr>
+                <w:rFonts w:hint="eastAsia"/>
+              </w:rPr>
+              <w:t>/</w:t>
+            </w:r>
+            <w:r>
+              <w:t>05</w:t>
+            </w:r>
+            <w:r>
+              <w:rPr>
+                <w:rFonts w:hint="eastAsia"/>
+              </w:rPr>
+              <w:t>/</w:t>
+            </w:r>
+            <w:r>
+              <w:t>07</w:t>
+            </w:r>
+          </w:p>
+        </w:tc>
+        <w:tc>
+          <w:tcPr>
+            <w:tcW w:w="0" w:type="auto"/>
+            <w:vAlign w:val="center"/>
+          </w:tcPr>
+          <w:p>
+            <w:pPr>
+              <w:jc w:val="center"/>
+            </w:pPr>
+            <w:r>
+              <w:rPr>
+                <w:rFonts w:hint="eastAsia"/>
+              </w:rPr>
+              <w:t>(</w:t>
+            </w:r>
+            <w:r>
+              <w:rPr>
+                <w:rFonts w:hint="eastAsia"/>
+              </w:rPr>
+              <w:t>四</w:t>
+            </w:r>
+            <w:r>
+              <w:rPr>
+                <w:rFonts w:hint="eastAsia"/>
+              </w:rPr>
+              <w:t>)</w:t>
+            </w:r>
+          </w:p>
+        </w:tc>
+        <w:tc>
+          <w:tcPr>
+            <w:tcW w:w="0" w:type="auto"/>
+          </w:tcPr>
+          <w:p>
+            <w:pPr>
+              <w:pStyle w:val="ListParagraph"/>
+              <w:numPr>
+                <w:ilvl w:val="0"/>
+                <w:numId w:val="1"/>
+              </w:numPr>
+              <w:spacing w:after="160" w:line="259" w:lineRule="auto"/>
+              <w:ind w:left="360"/>
+            </w:pPr>
+            <w:r>
+              <w:t>Join the In-class session course, AI Implementation to help develop the project</w:t>
+            </w:r>
+            <w:r>
+              <w:t>.</w:t>
+            </w:r>
+          </w:p>
+          <w:p>
+            <w:pPr>
+              <w:pStyle w:val="ListParagraph"/>
+              <w:numPr>
+                <w:ilvl w:val="0"/>
+                <w:numId w:val="1"/>
+              </w:numPr>
+              <w:ind w:left="360"/>
+            </w:pPr>
+            <w:r>
+              <w:t>Verify the bug fixes.</w:t>
+            </w:r>
+          </w:p>
+          <w:p>
+            <w:pPr>
+              <w:pStyle w:val="ListParagraph"/>
+              <w:numPr>
+                <w:ilvl w:val="0"/>
+                <w:numId w:val="1"/>
+              </w:numPr>
+              <w:ind w:left="360"/>
+            </w:pPr>
+            <w:r>
+              <w:t>Develop Company Inventory Management App.</w:t>
+            </w:r>
+          </w:p>
+        </w:tc>
+      </w:tr>
+      <w:tr>
+        <w:tc>
+          <w:tcPr>
+            <w:tcW w:w="0" w:type="auto"/>
+            <w:vMerge/>
+            <w:vAlign w:val="center"/>
+          </w:tcPr>
+          <w:p>
+            <w:pPr>
+              <w:jc w:val="center"/>
+            </w:pPr>
+          </w:p>
+        </w:tc>
+        <w:tc>
+          <w:tcPr>
+            <w:tcW w:w="0" w:type="auto"/>
+            <w:vAlign w:val="center"/>
+          </w:tcPr>
+          <w:p>
+            <w:pPr>
+              <w:jc w:val="center"/>
+            </w:pPr>
+            <w:r>
+              <w:t>2026</w:t>
+            </w:r>
+            <w:r>
+              <w:rPr>
+                <w:rFonts w:hint="eastAsia"/>
+              </w:rPr>
+              <w:t>/</w:t>
+            </w:r>
+            <w:r>
+              <w:t>05</w:t>
+            </w:r>
+            <w:r>
+              <w:rPr>
+                <w:rFonts w:hint="eastAsia"/>
+              </w:rPr>
+              <w:t>/</w:t>
+            </w:r>
+            <w:r>
+              <w:t>08</w:t>
+            </w:r>
+          </w:p>
+        </w:tc>
+        <w:tc>
+          <w:tcPr>
+            <w:tcW w:w="0" w:type="auto"/>
+            <w:vAlign w:val="center"/>
+          </w:tcPr>
+          <w:p>
+            <w:pPr>
+              <w:jc w:val="center"/>
+            </w:pPr>
+            <w:r>
+              <w:rPr>
+                <w:rFonts w:hint="eastAsia"/>
+              </w:rPr>
+              <w:t>（五）</w:t>
+            </w:r>
+          </w:p>
+        </w:tc>
+        <w:tc>
+          <w:tcPr>
+            <w:tcW w:w="0" w:type="auto"/>
+          </w:tcPr>
+          <w:p>
+            <w:pPr>
+              <w:pStyle w:val="ListParagraph"/>
+              <w:numPr>
+                <w:ilvl w:val="0"/>
+                <w:numId w:val="1"/>
+              </w:numPr>
+              <w:spacing w:after="160" w:line="259" w:lineRule="auto"/>
+              <w:ind w:left="360"/>
+            </w:pPr>
+            <w:r>
+              <w:t>Meeting.</w:t>
+            </w:r>
+          </w:p>
+          <w:p>
+            <w:pPr>
+              <w:pStyle w:val="ListParagraph"/>
+              <w:numPr>
+                <w:ilvl w:val="0"/>
+                <w:numId w:val="1"/>
+              </w:numPr>
+              <w:spacing w:after="160" w:line="259" w:lineRule="auto"/>
+              <w:ind w:left="360"/>
+            </w:pPr>
+            <w:r>
+              <w:t>Verify the bug fixes.</w:t>
+            </w:r>
+          </w:p>
+          <w:p>
+            <w:pPr>
+              <w:pStyle w:val="ListParagraph"/>
+              <w:numPr>
+                <w:ilvl w:val="0"/>
+                <w:numId w:val="1"/>
+              </w:numPr>
+              <w:ind w:left="360"/>
+            </w:pPr>
+            <w:r>
+              <w:t>Continue to develop Company Inventory Management App.</w:t>
+            </w:r>
+          </w:p>
+        </w:tc>
+      </w:tr>
+      <w:tr>
+        <w:tc>
+          <w:tcPr>
+            <w:tcW w:w="0" w:type="auto"/>
+            <w:vMerge w:val="restart"/>
+            <w:vAlign w:val="center"/>
+          </w:tcPr>
+          <w:p>
+            <w:pPr>
+              <w:jc w:val="center"/>
+            </w:pPr>
+            <w:r>
+              <w:rPr>
+                <w:rFonts w:hint="eastAsia"/>
+              </w:rPr>
+              <w:t>十一</w:t>
+            </w:r>
+          </w:p>
+        </w:tc>
+        <w:tc>
+          <w:tcPr>
+            <w:tcW w:w="0" w:type="auto"/>
+            <w:vAlign w:val="center"/>
+          </w:tcPr>
+          <w:p>
+            <w:pPr>
+              <w:jc w:val="center"/>
+            </w:pPr>
+            <w:r>
+              <w:t>2026</w:t>
+            </w:r>
+            <w:r>
+              <w:rPr>
+                <w:rFonts w:hint="eastAsia"/>
+              </w:rPr>
+              <w:t>/</w:t>
+            </w:r>
+            <w:r>
+              <w:t>05</w:t>
+            </w:r>
+            <w:r>
+              <w:rPr>
+                <w:rFonts w:hint="eastAsia"/>
+              </w:rPr>
+              <w:t>/</w:t>
+            </w:r>
+            <w:r>
+              <w:t>11</w:t>
+            </w:r>
+          </w:p>
+        </w:tc>
+        <w:tc>
+          <w:tcPr>
+            <w:tcW w:w="0" w:type="auto"/>
+            <w:vAlign w:val="center"/>
+          </w:tcPr>
+          <w:p>
+            <w:pPr>
+              <w:jc w:val="center"/>
+            </w:pPr>
+            <w:r>
+              <w:t>(</w:t>
+            </w:r>
+            <w:r>
+              <w:rPr>
+                <w:rFonts w:hint="eastAsia"/>
+              </w:rPr>
+              <w:t>一</w:t>
+            </w:r>
+            <w:r>
+              <w:t>)</w:t>
+            </w:r>
+          </w:p>
+        </w:tc>
+        <w:tc>
+          <w:tcPr>
+            <w:tcW w:w="0" w:type="auto"/>
+          </w:tcPr>
+          <w:p>
+            <w:pPr>
+              <w:pStyle w:val="ListParagraph"/>
+              <w:numPr>
+                <w:ilvl w:val="0"/>
+                <w:numId w:val="1"/>
+              </w:numPr>
+              <w:ind w:left="360"/>
+            </w:pPr>
+            <w:r>
+              <w:t>M</w:t>
+            </w:r>
+            <w:r>
+              <w:rPr>
+                <w:rFonts w:hint="eastAsia"/>
+              </w:rPr>
+              <w:t>ee</w:t>
+            </w:r>
+            <w:r>
+              <w:t>ting</w:t>
+            </w:r>
+            <w:r>
+              <w:t>.</w:t>
+            </w:r>
+          </w:p>
+          <w:p>
+            <w:pPr>
+              <w:pStyle w:val="ListParagraph"/>
+              <w:numPr>
+                <w:ilvl w:val="0"/>
+                <w:numId w:val="1"/>
+              </w:numPr>
+              <w:ind w:left="360"/>
+            </w:pPr>
+            <w:r>
+              <w:t>Storybook Bug Inspection</w:t>
+            </w:r>
+            <w:r>
+              <w:t>.</w:t>
+            </w:r>
+          </w:p>
+        </w:tc>
+      </w:tr>
+      <w:tr>
+        <w:tc>
+          <w:tcPr>
+            <w:tcW w:w="0" w:type="auto"/>
+            <w:vMerge/>
+            <w:vAlign w:val="center"/>
+          </w:tcPr>
+          <w:p>
+            <w:pPr>
+              <w:jc w:val="center"/>
+            </w:pPr>
+          </w:p>
+        </w:tc>
+        <w:tc>
+          <w:tcPr>
+            <w:tcW w:w="0" w:type="auto"/>
+            <w:vAlign w:val="center"/>
+          </w:tcPr>
+          <w:p>
+            <w:pPr>
+              <w:jc w:val="center"/>
+            </w:pPr>
+            <w:r>
+              <w:t>2026</w:t>
+            </w:r>
+            <w:r>
+              <w:rPr>
+                <w:rFonts w:hint="eastAsia"/>
+              </w:rPr>
+              <w:t>/</w:t>
+            </w:r>
+            <w:r>
+              <w:t>05</w:t>
+            </w:r>
+            <w:r>
+              <w:rPr>
+                <w:rFonts w:hint="eastAsia"/>
+              </w:rPr>
+              <w:t>/</w:t>
+            </w:r>
+            <w:r>
+              <w:t>12</w:t>
+            </w:r>
+          </w:p>
+        </w:tc>
+        <w:tc>
+          <w:tcPr>
+            <w:tcW w:w="0" w:type="auto"/>
+            <w:vAlign w:val="center"/>
+          </w:tcPr>
+          <w:p>
+            <w:pPr>
+              <w:jc w:val="center"/>
+            </w:pPr>
+            <w:r>
+              <w:rPr>
+                <w:rFonts w:hint="eastAsia"/>
+              </w:rPr>
+              <w:t>(</w:t>
+            </w:r>
+            <w:r>
+              <w:rPr>
+                <w:rFonts w:hint="eastAsia"/>
+              </w:rPr>
+              <w:t>二</w:t>
+            </w:r>
+            <w:r>
+              <w:rPr>
+                <w:rFonts w:hint="eastAsia"/>
+              </w:rPr>
+              <w:t>)</w:t>
+            </w:r>
+          </w:p>
+        </w:tc>
+        <w:tc>
+          <w:tcPr>
+            <w:tcW w:w="0" w:type="auto"/>
+          </w:tcPr>
+          <w:p>
+            <w:pPr>
+              <w:pStyle w:val="ListParagraph"/>
+              <w:numPr>
+                <w:ilvl w:val="0"/>
+                <w:numId w:val="1"/>
+              </w:numPr>
+              <w:ind w:left="360"/>
+            </w:pPr>
+            <w:r>
+              <w:t>Meeting</w:t>
+            </w:r>
+            <w:r>
+              <w:t>.</w:t>
+            </w:r>
+          </w:p>
+          <w:p>
+            <w:pPr>
+              <w:pStyle w:val="ListParagraph"/>
+              <w:numPr>
+                <w:ilvl w:val="0"/>
+                <w:numId w:val="1"/>
+              </w:numPr>
+              <w:ind w:left="360"/>
+            </w:pPr>
+            <w:r>
+              <w:t>Create e2e Test</w:t>
+            </w:r>
+            <w:r>
+              <w:t>.</w:t>
+            </w:r>
+          </w:p>
+          <w:p>
+            <w:pPr>
+              <w:pStyle w:val="ListParagraph"/>
+              <w:numPr>
+                <w:ilvl w:val="0"/>
+                <w:numId w:val="1"/>
+              </w:numPr>
+              <w:ind w:left="360"/>
+            </w:pPr>
+            <w:r>
+              <w:t>Continue to develop Company Inventory Management App.</w:t>
+            </w:r>
+          </w:p>
+        </w:tc>
+      </w:tr>
+      <w:tr>
+        <w:tc>
+          <w:tcPr>
+            <w:tcW w:w="0" w:type="auto"/>
+            <w:vMerge/>
+            <w:vAlign w:val="center"/>
+          </w:tcPr>
+          <w:p>
+            <w:pPr>
+              <w:jc w:val="center"/>
+            </w:pPr>
+          </w:p>
+        </w:tc>
+        <w:tc>
+          <w:tcPr>
+            <w:tcW w:w="0" w:type="auto"/>
+            <w:vAlign w:val="center"/>
+          </w:tcPr>
+          <w:p>
+            <w:pPr>
+              <w:jc w:val="center"/>
+            </w:pPr>
+            <w:r>
+              <w:t>2026</w:t>
+            </w:r>
+            <w:r>
+              <w:rPr>
+                <w:rFonts w:hint="eastAsia"/>
+              </w:rPr>
+              <w:t>/</w:t>
+            </w:r>
+            <w:r>
+              <w:t>05</w:t>
+            </w:r>
+            <w:r>
+              <w:rPr>
+                <w:rFonts w:hint="eastAsia"/>
+              </w:rPr>
+              <w:t>/</w:t>
+            </w:r>
+            <w:r>
+              <w:t>13</w:t>
+            </w:r>
+          </w:p>
+        </w:tc>
+        <w:tc>
+          <w:tcPr>
+            <w:tcW w:w="0" w:type="auto"/>
+            <w:vAlign w:val="center"/>
+          </w:tcPr>
+          <w:p>
+            <w:pPr>
+              <w:jc w:val="center"/>
+            </w:pPr>
+            <w:r>
+              <w:rPr>
+                <w:rFonts w:hint="eastAsia"/>
+              </w:rPr>
+              <w:t>(</w:t>
+            </w:r>
+            <w:r>
+              <w:rPr>
+                <w:rFonts w:hint="eastAsia"/>
+              </w:rPr>
+              <w:t>三</w:t>
+            </w:r>
+            <w:r>
+              <w:rPr>
+                <w:rFonts w:hint="eastAsia"/>
+              </w:rPr>
+              <w:t>)</w:t>
+            </w:r>
+          </w:p>
+        </w:tc>
+        <w:tc>
+          <w:tcPr>
+            <w:tcW w:w="0" w:type="auto"/>
+          </w:tcPr>
+          <w:p>
+            <w:pPr>
+              <w:pStyle w:val="ListParagraph"/>
+              <w:numPr>
+                <w:ilvl w:val="0"/>
+                <w:numId w:val="1"/>
+              </w:numPr>
+              <w:ind w:left="360"/>
+            </w:pPr>
+            <w:r>
+              <w:t>Meeting</w:t>
+            </w:r>
+            <w:r>
+              <w:t>.</w:t>
+            </w:r>
+          </w:p>
+          <w:p>
+            <w:pPr>
+              <w:pStyle w:val="ListParagraph"/>
+              <w:numPr>
+                <w:ilvl w:val="0"/>
+                <w:numId w:val="1"/>
+              </w:numPr>
+              <w:ind w:left="360"/>
+            </w:pPr>
+            <w:r>
+              <w:t>Continue to develop Company Inventory Management App.</w:t>
+            </w:r>
+          </w:p>
+        </w:tc>
+      </w:tr>
+      <w:tr>
+        <w:tc>
+          <w:tcPr>
+            <w:tcW w:w="0" w:type="auto"/>
+            <w:vMerge/>
+            <w:vAlign w:val="center"/>
+          </w:tcPr>
+          <w:p>
+            <w:pPr>
+              <w:jc w:val="center"/>
+            </w:pPr>
+          </w:p>
+        </w:tc>
+        <w:tc>
+          <w:tcPr>
+            <w:tcW w:w="0" w:type="auto"/>
+            <w:vAlign w:val="center"/>
+          </w:tcPr>
+          <w:p>
+            <w:pPr>
+              <w:jc w:val="center"/>
+            </w:pPr>
+            <w:r>
+              <w:t>2026</w:t>
+            </w:r>
+            <w:r>
+              <w:rPr>
+                <w:rFonts w:hint="eastAsia"/>
+              </w:rPr>
+              <w:t>/</w:t>
+            </w:r>
+            <w:r>
+              <w:t>05</w:t>
+            </w:r>
+            <w:r>
+              <w:rPr>
+                <w:rFonts w:hint="eastAsia"/>
+              </w:rPr>
+              <w:t>/</w:t>
+            </w:r>
+            <w:r>
+              <w:t>14</w:t>
+            </w:r>
+          </w:p>
+        </w:tc>
+        <w:tc>
+          <w:tcPr>
+            <w:tcW w:w="0" w:type="auto"/>
+            <w:vAlign w:val="center"/>
+          </w:tcPr>
+          <w:p>
+            <w:pPr>
+              <w:jc w:val="center"/>
+            </w:pPr>
+            <w:r>
+              <w:rPr>
+                <w:rFonts w:hint="eastAsia"/>
+              </w:rPr>
+              <w:t>(</w:t>
+            </w:r>
+            <w:r>
+              <w:rPr>
+                <w:rFonts w:hint="eastAsia"/>
+              </w:rPr>
+              <w:t>四</w:t>
+            </w:r>
+            <w:r>
+              <w:rPr>
+                <w:rFonts w:hint="eastAsia"/>
+              </w:rPr>
+              <w:t>)</w:t>
+            </w:r>
+          </w:p>
+        </w:tc>
+        <w:tc>
+          <w:tcPr>
+            <w:tcW w:w="0" w:type="auto"/>
+          </w:tcPr>
+          <w:p>
+            <w:pPr>
+              <w:pStyle w:val="ListParagraph"/>
+              <w:numPr>
+                <w:ilvl w:val="0"/>
+                <w:numId w:val="1"/>
+              </w:numPr>
+              <w:spacing w:after="160" w:line="259" w:lineRule="auto"/>
+              <w:ind w:left="360"/>
+            </w:pPr>
+            <w:r>
+              <w:t>Join the In-class session course, AI Implementation to help develop the project.</w:t>
+            </w:r>
+          </w:p>
+          <w:p>
+            <w:pPr>
+              <w:pStyle w:val="ListParagraph"/>
+              <w:numPr>
+                <w:ilvl w:val="0"/>
+                <w:numId w:val="1"/>
+              </w:numPr>
+              <w:ind w:left="360"/>
+            </w:pPr>
+            <w:r>
+              <w:t>Fixing Bug for Company Inventory Management App.</w:t>
+            </w:r>
+          </w:p>
+          <w:p>
+            <w:pPr>
+              <w:pStyle w:val="ListParagraph"/>
+              <w:numPr>
+                <w:ilvl w:val="0"/>
+                <w:numId w:val="1"/>
+              </w:numPr>
+              <w:ind w:left="360"/>
+            </w:pPr>
+            <w:r>
+              <w:t xml:space="preserve">Reporting </w:t>
+            </w:r>
+            <w:r>
+              <w:t xml:space="preserve">Project </w:t>
+            </w:r>
+            <w:r>
+              <w:t>Issues</w:t>
+            </w:r>
+            <w:r>
+              <w:t>.</w:t>
+            </w:r>
+          </w:p>
+        </w:tc>
+      </w:tr>
+      <w:tr>
+        <w:tc>
+          <w:tcPr>
+            <w:tcW w:w="0" w:type="auto"/>
+            <w:vMerge/>
+            <w:vAlign w:val="center"/>
+          </w:tcPr>
+          <w:p>
+            <w:pPr>
+              <w:jc w:val="center"/>
+            </w:pPr>
+          </w:p>
+        </w:tc>
+        <w:tc>
+          <w:tcPr>
+            <w:tcW w:w="0" w:type="auto"/>
+            <w:vAlign w:val="center"/>
+          </w:tcPr>
+          <w:p>
+            <w:pPr>
+              <w:jc w:val="center"/>
+            </w:pPr>
+            <w:r>
+              <w:t>2026</w:t>
+            </w:r>
+            <w:r>
+              <w:rPr>
+                <w:rFonts w:hint="eastAsia"/>
+              </w:rPr>
+              <w:t>/</w:t>
+            </w:r>
+            <w:r>
+              <w:t>05</w:t>
+            </w:r>
+            <w:r>
+              <w:rPr>
+                <w:rFonts w:hint="eastAsia"/>
+              </w:rPr>
+              <w:t>/</w:t>
+            </w:r>
+            <w:r>
+              <w:t>15</w:t>
+            </w:r>
+          </w:p>
+        </w:tc>
+        <w:tc>
+          <w:tcPr>
+            <w:tcW w:w="0" w:type="auto"/>
+            <w:vAlign w:val="center"/>
+          </w:tcPr>
+          <w:p>
+            <w:pPr>
+              <w:jc w:val="center"/>
+            </w:pPr>
+            <w:r>
+              <w:rPr>
+                <w:rFonts w:hint="eastAsia"/>
+              </w:rPr>
+              <w:t>（五）</w:t>
+            </w:r>
+          </w:p>
+        </w:tc>
+        <w:tc>
+          <w:tcPr>
+            <w:tcW w:w="0" w:type="auto"/>
+          </w:tcPr>
+          <w:p>
+            <w:pPr>
+              <w:pStyle w:val="ListParagraph"/>
+              <w:numPr>
+                <w:ilvl w:val="0"/>
+                <w:numId w:val="1"/>
+              </w:numPr>
+              <w:ind w:left="360"/>
+            </w:pPr>
+            <w:r>
+              <w:t>Meeting</w:t>
+            </w:r>
+            <w:r>
+              <w:t>.</w:t>
+            </w:r>
+          </w:p>
+          <w:p>
+            <w:pPr>
+              <w:pStyle w:val="ListParagraph"/>
+              <w:numPr>
+                <w:ilvl w:val="0"/>
+                <w:numId w:val="1"/>
+              </w:numPr>
+              <w:ind w:left="360"/>
+            </w:pPr>
+            <w:r>
+              <w:t>P</w:t>
+            </w:r>
+            <w:r>
+              <w:rPr>
+                <w:rFonts w:hint="eastAsia"/>
+              </w:rPr>
+              <w:t>re</w:t>
+            </w:r>
+            <w:r>
+              <w:t>sent the Company Inventory Management App.</w:t>
+            </w:r>
+          </w:p>
+          <w:p>
+            <w:pPr>
+              <w:pStyle w:val="ListParagraph"/>
+              <w:numPr>
+                <w:ilvl w:val="0"/>
+                <w:numId w:val="1"/>
+              </w:numPr>
+              <w:spacing w:line="259" w:lineRule="auto"/>
+              <w:ind w:left="360"/>
+            </w:pPr>
+            <w:r>
+              <w:t>Fixing Bug for Company Inventory Management App.</w:t>
+            </w:r>
+          </w:p>
+        </w:tc>
+      </w:tr>
+      <w:tr>
+        <w:tc>
+          <w:tcPr>
+            <w:tcW w:w="0" w:type="auto"/>
+            <w:vMerge w:val="restart"/>
+            <w:vAlign w:val="center"/>
+          </w:tcPr>
+          <w:p>
+            <w:pPr>
+              <w:jc w:val="center"/>
+            </w:pPr>
+            <w:r>
+              <w:rPr>
+                <w:rFonts w:hint="eastAsia"/>
+              </w:rPr>
+              <w:t>十二</w:t>
+            </w:r>
+          </w:p>
+        </w:tc>
+        <w:tc>
+          <w:tcPr>
+            <w:tcW w:w="0" w:type="auto"/>
+            <w:vAlign w:val="center"/>
+          </w:tcPr>
+          <w:p>
+            <w:pPr>
+              <w:jc w:val="center"/>
+            </w:pPr>
+            <w:r>
+              <w:t>2026</w:t>
+            </w:r>
+            <w:r>
+              <w:rPr>
+                <w:rFonts w:hint="eastAsia"/>
+              </w:rPr>
+              <w:t>/</w:t>
+            </w:r>
+            <w:r>
+              <w:t>05</w:t>
+            </w:r>
+            <w:r>
+              <w:rPr>
+                <w:rFonts w:hint="eastAsia"/>
+              </w:rPr>
+              <w:t>/</w:t>
+            </w:r>
+            <w:r>
+              <w:t>18</w:t>
+            </w:r>
+          </w:p>
+        </w:tc>
+        <w:tc>
+          <w:tcPr>
+            <w:tcW w:w="0" w:type="auto"/>
+            <w:vAlign w:val="center"/>
+          </w:tcPr>
+          <w:p>
+            <w:pPr>
+              <w:jc w:val="center"/>
+            </w:pPr>
+            <w:r>
+              <w:t>(</w:t>
+            </w:r>
+            <w:r>
+              <w:rPr>
+                <w:rFonts w:hint="eastAsia"/>
+              </w:rPr>
+              <w:t>一</w:t>
+            </w:r>
+            <w:r>
+              <w:t>)</w:t>
+            </w:r>
+          </w:p>
+        </w:tc>
+        <w:tc>
+          <w:tcPr>
+            <w:tcW w:w="0" w:type="auto"/>
+          </w:tcPr>
+          <w:p>
+            <w:pPr>
+              <w:pStyle w:val="ListParagraph"/>
+              <w:numPr>
+                <w:ilvl w:val="0"/>
+                <w:numId w:val="1"/>
+              </w:numPr>
+              <w:ind w:left="360"/>
+            </w:pPr>
+            <w:r>
+              <w:t>Meeting</w:t>
+            </w:r>
+            <w:r>
+              <w:t>.</w:t>
+            </w:r>
+          </w:p>
+          <w:p>
+            <w:pPr>
+              <w:pStyle w:val="ListParagraph"/>
+              <w:numPr>
+                <w:ilvl w:val="0"/>
+                <w:numId w:val="1"/>
+              </w:numPr>
+              <w:ind w:left="360"/>
+            </w:pPr>
+            <w:r>
+              <w:t>Trying to use CLI Test</w:t>
+            </w:r>
+            <w:r>
+              <w:t>.</w:t>
+            </w:r>
+          </w:p>
+        </w:tc>
+      </w:tr>
+      <w:tr>
+        <w:tc>
+          <w:tcPr>
+            <w:tcW w:w="0" w:type="auto"/>
+            <w:vMerge/>
+            <w:vAlign w:val="center"/>
+          </w:tcPr>
+          <w:p>
+            <w:pPr>
+              <w:jc w:val="center"/>
+            </w:pPr>
+          </w:p>
+        </w:tc>
+        <w:tc>
+          <w:tcPr>
+            <w:tcW w:w="0" w:type="auto"/>
+            <w:vAlign w:val="center"/>
+          </w:tcPr>
+          <w:p>
+            <w:pPr>
+              <w:jc w:val="center"/>
+            </w:pPr>
+            <w:r>
+              <w:t>2026</w:t>
+            </w:r>
+            <w:r>
+              <w:rPr>
+                <w:rFonts w:hint="eastAsia"/>
+              </w:rPr>
+              <w:t>/</w:t>
+            </w:r>
+            <w:r>
+              <w:t>05</w:t>
+            </w:r>
+            <w:r>
+              <w:rPr>
+                <w:rFonts w:hint="eastAsia"/>
+              </w:rPr>
+              <w:t>/</w:t>
+            </w:r>
+            <w:r>
+              <w:t>19</w:t>
+            </w:r>
+          </w:p>
+        </w:tc>
+        <w:tc>
+          <w:tcPr>
+            <w:tcW w:w="0" w:type="auto"/>
+            <w:vAlign w:val="center"/>
+          </w:tcPr>
+          <w:p>
+            <w:pPr>
+              <w:jc w:val="center"/>
+            </w:pPr>
+            <w:r>
+              <w:rPr>
+                <w:rFonts w:hint="eastAsia"/>
+              </w:rPr>
+              <w:t>(</w:t>
+            </w:r>
+            <w:r>
+              <w:rPr>
+                <w:rFonts w:hint="eastAsia"/>
+              </w:rPr>
+              <w:t>二</w:t>
+            </w:r>
+            <w:r>
+              <w:rPr>
+                <w:rFonts w:hint="eastAsia"/>
+              </w:rPr>
+              <w:t>)</w:t>
+            </w:r>
+          </w:p>
+        </w:tc>
+        <w:tc>
+          <w:tcPr>
+            <w:tcW w:w="0" w:type="auto"/>
+          </w:tcPr>
+          <w:p>
+            <w:pPr>
+              <w:pStyle w:val="ListParagraph"/>
+              <w:numPr>
+                <w:ilvl w:val="0"/>
+                <w:numId w:val="1"/>
+              </w:numPr>
+              <w:ind w:left="360"/>
+            </w:pPr>
+            <w:r>
+              <w:t>Meeting.</w:t>
+            </w:r>
+          </w:p>
+          <w:p>
+            <w:pPr>
+              <w:pStyle w:val="ListParagraph"/>
+              <w:numPr>
+                <w:ilvl w:val="0"/>
+                <w:numId w:val="1"/>
+              </w:numPr>
+              <w:ind w:left="360"/>
+            </w:pPr>
+            <w:r>
+              <w:t>Prepare seeding data.</w:t>
+            </w:r>
+          </w:p>
+        </w:tc>
+      </w:tr>
+      <w:tr>
+        <w:tc>
+          <w:tcPr>
+            <w:tcW w:w="0" w:type="auto"/>
+            <w:vMerge/>
+            <w:vAlign w:val="center"/>
+          </w:tcPr>
+          <w:p>
+            <w:pPr>
+              <w:jc w:val="center"/>
+            </w:pPr>
+          </w:p>
+        </w:tc>
+        <w:tc>
+          <w:tcPr>
+            <w:tcW w:w="0" w:type="auto"/>
+            <w:vAlign w:val="center"/>
+          </w:tcPr>
+          <w:p>
+            <w:pPr>
+              <w:jc w:val="center"/>
+            </w:pPr>
+            <w:r>
+              <w:t>2026</w:t>
+            </w:r>
+            <w:r>
+              <w:rPr>
+                <w:rFonts w:hint="eastAsia"/>
+              </w:rPr>
+              <w:t>/</w:t>
+            </w:r>
+            <w:r>
+              <w:t>05</w:t>
+            </w:r>
+            <w:r>
+              <w:rPr>
+                <w:rFonts w:hint="eastAsia"/>
+              </w:rPr>
+              <w:t>/</w:t>
+            </w:r>
+            <w:r>
+              <w:t>20</w:t>
+            </w:r>
+          </w:p>
+        </w:tc>
+        <w:tc>
+          <w:tcPr>
+            <w:tcW w:w="0" w:type="auto"/>
+            <w:vAlign w:val="center"/>
+          </w:tcPr>
+          <w:p>
+            <w:pPr>
+              <w:jc w:val="center"/>
+            </w:pPr>
+            <w:r>
+              <w:rPr>
+                <w:rFonts w:hint="eastAsia"/>
+              </w:rPr>
+              <w:t>(</w:t>
+            </w:r>
+            <w:r>
+              <w:rPr>
+                <w:rFonts w:hint="eastAsia"/>
+              </w:rPr>
+              <w:t>三</w:t>
+            </w:r>
+            <w:r>
+              <w:rPr>
+                <w:rFonts w:hint="eastAsia"/>
+              </w:rPr>
+              <w:t>)</w:t>
+            </w:r>
+          </w:p>
+        </w:tc>
+        <w:tc>
+          <w:tcPr>
+            <w:tcW w:w="0" w:type="auto"/>
+          </w:tcPr>
+          <w:p>
+            <w:pPr>
+              <w:pStyle w:val="ListParagraph"/>
+              <w:numPr>
+                <w:ilvl w:val="0"/>
+                <w:numId w:val="1"/>
+              </w:numPr>
+              <w:ind w:left="360"/>
+            </w:pPr>
+            <w:r>
+              <w:t>Self-</w:t>
+            </w:r>
+            <w:r>
+              <w:t>Learning Company Project</w:t>
+            </w:r>
+            <w:r>
+              <w:t xml:space="preserve"> Sy</w:t>
+            </w:r>
+            <w:r>
+              <w:t>s</w:t>
+            </w:r>
+            <w:r>
+              <w:t>tem</w:t>
+            </w:r>
+            <w:r>
+              <w:rPr>
+                <w:rFonts w:hint="eastAsia"/>
+              </w:rPr>
+              <w:t>.</w:t>
+            </w:r>
+          </w:p>
+        </w:tc>
+      </w:tr>
+      <w:tr>
+        <w:tc>
+          <w:tcPr>
+            <w:tcW w:w="0" w:type="auto"/>
+            <w:vMerge/>
+            <w:vAlign w:val="center"/>
+          </w:tcPr>
+          <w:p>
+            <w:pPr>
+              <w:jc w:val="center"/>
+            </w:pPr>
+          </w:p>
+        </w:tc>
+        <w:tc>
+          <w:tcPr>
+            <w:tcW w:w="0" w:type="auto"/>
+            <w:vAlign w:val="center"/>
+          </w:tcPr>
+          <w:p>
+            <w:pPr>
+              <w:jc w:val="center"/>
+            </w:pPr>
+            <w:r>
+              <w:t>2026</w:t>
+            </w:r>
+            <w:r>
+              <w:rPr>
+                <w:rFonts w:hint="eastAsia"/>
+              </w:rPr>
+              <w:t>/</w:t>
+            </w:r>
+            <w:r>
+              <w:t>05</w:t>
+            </w:r>
+            <w:r>
+              <w:rPr>
+                <w:rFonts w:hint="eastAsia"/>
+              </w:rPr>
+              <w:t>/</w:t>
+            </w:r>
+            <w:r>
+              <w:t>21</w:t>
+            </w:r>
+          </w:p>
+        </w:tc>
+        <w:tc>
+          <w:tcPr>
+            <w:tcW w:w="0" w:type="auto"/>
+            <w:vAlign w:val="center"/>
+          </w:tcPr>
+          <w:p>
+            <w:pPr>
+              <w:jc w:val="center"/>
+            </w:pPr>
+            <w:r>
+              <w:rPr>
+                <w:rFonts w:hint="eastAsia"/>
+              </w:rPr>
+              <w:t>(</w:t>
+            </w:r>
+            <w:r>
+              <w:rPr>
+                <w:rFonts w:hint="eastAsia"/>
+              </w:rPr>
+              <w:t>四</w:t>
+            </w:r>
+            <w:r>
+              <w:rPr>
+                <w:rFonts w:hint="eastAsia"/>
+              </w:rPr>
+              <w:t>)</w:t>
+            </w:r>
+          </w:p>
+        </w:tc>
+        <w:tc>
+          <w:tcPr>
+            <w:tcW w:w="0" w:type="auto"/>
+          </w:tcPr>
+          <w:p>
+            <w:pPr>
+              <w:pStyle w:val="ListParagraph"/>
+              <w:numPr>
+                <w:ilvl w:val="0"/>
+                <w:numId w:val="1"/>
+              </w:numPr>
+              <w:spacing w:after="160" w:line="259" w:lineRule="auto"/>
+              <w:ind w:left="360"/>
+            </w:pPr>
+            <w:r>
+              <w:t>Join the In-class session course</w:t>
+            </w:r>
+            <w:r>
+              <w:t>.</w:t>
+            </w:r>
+          </w:p>
+          <w:p>
+            <w:pPr>
+              <w:pStyle w:val="ListParagraph"/>
+              <w:numPr>
+                <w:ilvl w:val="0"/>
+                <w:numId w:val="1"/>
+              </w:numPr>
+              <w:ind w:left="360"/>
+            </w:pPr>
+            <w:r>
+              <w:t>Searching bugs.</w:t>
+            </w:r>
+          </w:p>
+        </w:tc>
+      </w:tr>
+      <w:tr>
+        <w:tc>
+          <w:tcPr>
+            <w:tcW w:w="0" w:type="auto"/>
+            <w:vMerge/>
+            <w:vAlign w:val="center"/>
+          </w:tcPr>
+          <w:p>
+            <w:pPr>
+              <w:jc w:val="center"/>
+            </w:pPr>
+          </w:p>
+        </w:tc>
+        <w:tc>
+          <w:tcPr>
+            <w:tcW w:w="0" w:type="auto"/>
+            <w:vAlign w:val="center"/>
+          </w:tcPr>
+          <w:p>
+            <w:pPr>
+              <w:jc w:val="center"/>
+            </w:pPr>
+            <w:r>
+              <w:t>2026</w:t>
+            </w:r>
+            <w:r>
+              <w:rPr>
+                <w:rFonts w:hint="eastAsia"/>
+              </w:rPr>
+              <w:t>/</w:t>
+            </w:r>
+            <w:r>
+              <w:t>05</w:t>
+            </w:r>
+            <w:r>
+              <w:rPr>
+                <w:rFonts w:hint="eastAsia"/>
+              </w:rPr>
+              <w:t>/</w:t>
+            </w:r>
+            <w:r>
+              <w:t>22</w:t>
+            </w:r>
+          </w:p>
+        </w:tc>
+        <w:tc>
+          <w:tcPr>
+            <w:tcW w:w="0" w:type="auto"/>
+            <w:vAlign w:val="center"/>
+          </w:tcPr>
+          <w:p>
+            <w:pPr>
+              <w:jc w:val="center"/>
+            </w:pPr>
+            <w:r>
+              <w:rPr>
+                <w:rFonts w:hint="eastAsia"/>
+              </w:rPr>
+              <w:t>（五）</w:t>
+            </w:r>
+          </w:p>
+        </w:tc>
+        <w:tc>
+          <w:tcPr>
+            <w:tcW w:w="0" w:type="auto"/>
+          </w:tcPr>
+          <w:p>
+            <w:pPr>
+              <w:pStyle w:val="ListParagraph"/>
+              <w:numPr>
+                <w:ilvl w:val="0"/>
+                <w:numId w:val="1"/>
+              </w:numPr>
+              <w:ind w:left="360"/>
+            </w:pPr>
+            <w:r>
+              <w:t>Self-</w:t>
+            </w:r>
+            <w:r>
+              <w:t>Learning Company Project</w:t>
+            </w:r>
+            <w:r>
+              <w:t xml:space="preserve"> System</w:t>
+            </w:r>
+            <w:r>
+              <w:rPr>
+                <w:rFonts w:hint="eastAsia"/>
+              </w:rPr>
+              <w:t>.</w:t>
+            </w:r>
+          </w:p>
+        </w:tc>
+      </w:tr>
+      <w:tr>
+        <w:tc>
+          <w:tcPr>
+            <w:tcW w:w="0" w:type="auto"/>
+            <w:vMerge w:val="restart"/>
+            <w:vAlign w:val="center"/>
+          </w:tcPr>
+          <w:p>
+            <w:pPr>
+              <w:jc w:val="center"/>
+            </w:pPr>
+            <w:r>
+              <w:rPr>
+                <w:rFonts w:hint="eastAsia"/>
+              </w:rPr>
+              <w:lastRenderedPageBreak/>
+              <w:t>十三</w:t>
+            </w:r>
+          </w:p>
+        </w:tc>
+        <w:tc>
+          <w:tcPr>
+            <w:tcW w:w="0" w:type="auto"/>
+            <w:vAlign w:val="center"/>
+          </w:tcPr>
+          <w:p>
+            <w:pPr>
+              <w:jc w:val="center"/>
+            </w:pPr>
+            <w:r>
+              <w:t>2026</w:t>
+            </w:r>
+            <w:r>
+              <w:rPr>
+                <w:rFonts w:hint="eastAsia"/>
+              </w:rPr>
+              <w:t>/</w:t>
+            </w:r>
+            <w:r>
+              <w:t>05</w:t>
+            </w:r>
+            <w:r>
+              <w:rPr>
+                <w:rFonts w:hint="eastAsia"/>
+              </w:rPr>
+              <w:t>/</w:t>
+            </w:r>
+            <w:r>
+              <w:t>25</w:t>
+            </w:r>
+          </w:p>
+        </w:tc>
+        <w:tc>
+          <w:tcPr>
+            <w:tcW w:w="0" w:type="auto"/>
+            <w:vAlign w:val="center"/>
+          </w:tcPr>
+          <w:p>
+            <w:pPr>
+              <w:jc w:val="center"/>
+            </w:pPr>
+            <w:r>
+              <w:t>(</w:t>
+            </w:r>
+            <w:r>
+              <w:rPr>
+                <w:rFonts w:hint="eastAsia"/>
+              </w:rPr>
+              <w:t>一</w:t>
+            </w:r>
+            <w:r>
+              <w:t>)</w:t>
+            </w:r>
+          </w:p>
+        </w:tc>
+        <w:tc>
+          <w:tcPr>
+            <w:tcW w:w="0" w:type="auto"/>
+          </w:tcPr>
+          <w:p>
+            <w:pPr>
+              <w:pStyle w:val="ListParagraph"/>
+              <w:numPr>
+                <w:ilvl w:val="0"/>
+                <w:numId w:val="1"/>
+              </w:numPr>
+              <w:ind w:left="360"/>
+            </w:pPr>
+          </w:p>
+        </w:tc>
+      </w:tr>
+      <w:tr>
+        <w:tc>
+          <w:tcPr>
+            <w:tcW w:w="0" w:type="auto"/>
+            <w:vMerge/>
+            <w:vAlign w:val="center"/>
+          </w:tcPr>
+          <w:p>
+            <w:pPr>
+              <w:jc w:val="center"/>
+            </w:pPr>
+          </w:p>
+        </w:tc>
+        <w:tc>
+          <w:tcPr>
+            <w:tcW w:w="0" w:type="auto"/>
+            <w:vAlign w:val="center"/>
+          </w:tcPr>
+          <w:p>
+            <w:pPr>
+              <w:jc w:val="center"/>
+            </w:pPr>
+            <w:r>
+              <w:t>2026</w:t>
+            </w:r>
+            <w:r>
+              <w:rPr>
+                <w:rFonts w:hint="eastAsia"/>
+              </w:rPr>
+              <w:t>/</w:t>
+            </w:r>
+            <w:r>
+              <w:t>05</w:t>
+            </w:r>
+            <w:r>
+              <w:rPr>
+                <w:rFonts w:hint="eastAsia"/>
+              </w:rPr>
+              <w:t>/</w:t>
+            </w:r>
+            <w:r>
+              <w:t>26</w:t>
+            </w:r>
+          </w:p>
+        </w:tc>
+        <w:tc>
+          <w:tcPr>
+            <w:tcW w:w="0" w:type="auto"/>
+            <w:vAlign w:val="center"/>
+          </w:tcPr>
+          <w:p>
+            <w:pPr>
+              <w:jc w:val="center"/>
+            </w:pPr>
+            <w:r>
+              <w:rPr>
+                <w:rFonts w:hint="eastAsia"/>
+              </w:rPr>
+              <w:t>(</w:t>
+            </w:r>
+            <w:r>
+              <w:rPr>
+                <w:rFonts w:hint="eastAsia"/>
+              </w:rPr>
+              <w:t>二</w:t>
+            </w:r>
+            <w:r>
+              <w:rPr>
+                <w:rFonts w:hint="eastAsia"/>
+              </w:rPr>
+              <w:t>)</w:t>
+            </w:r>
+          </w:p>
+        </w:tc>
+        <w:tc>
+          <w:tcPr>
+            <w:tcW w:w="0" w:type="auto"/>
+          </w:tcPr>
+          <w:p>
+            <w:pPr>
+              <w:pStyle w:val="ListParagraph"/>
+              <w:numPr>
+                <w:ilvl w:val="0"/>
+                <w:numId w:val="1"/>
+              </w:numPr>
+              <w:ind w:left="360"/>
+            </w:pPr>
+          </w:p>
+        </w:tc>
+      </w:tr>
+      <w:tr>
+        <w:tc>
+          <w:tcPr>
+            <w:tcW w:w="0" w:type="auto"/>
+            <w:vMerge/>
+            <w:vAlign w:val="center"/>
+          </w:tcPr>
+          <w:p>
+            <w:pPr>
+              <w:jc w:val="center"/>
+            </w:pPr>
+          </w:p>
+        </w:tc>
+        <w:tc>
+          <w:tcPr>
+            <w:tcW w:w="0" w:type="auto"/>
+            <w:vAlign w:val="center"/>
+          </w:tcPr>
+          <w:p>
+            <w:pPr>
+              <w:jc w:val="center"/>
+            </w:pPr>
+            <w:r>
+              <w:t>2026</w:t>
+            </w:r>
+            <w:r>
+              <w:rPr>
+                <w:rFonts w:hint="eastAsia"/>
+              </w:rPr>
+              <w:t>/</w:t>
+            </w:r>
+            <w:r>
+              <w:t>05</w:t>
+            </w:r>
+            <w:r>
+              <w:rPr>
+                <w:rFonts w:hint="eastAsia"/>
+              </w:rPr>
+              <w:t>/</w:t>
+            </w:r>
+            <w:r>
+              <w:t>27</w:t>
+            </w:r>
+          </w:p>
+        </w:tc>
+        <w:tc>
+          <w:tcPr>
+            <w:tcW w:w="0" w:type="auto"/>
+            <w:vAlign w:val="center"/>
+          </w:tcPr>
+          <w:p>
+            <w:pPr>
+              <w:jc w:val="center"/>
+            </w:pPr>
+            <w:r>
+              <w:rPr>
+                <w:rFonts w:hint="eastAsia"/>
+              </w:rPr>
+              <w:t>(</w:t>
+            </w:r>
+            <w:r>
+              <w:rPr>
+                <w:rFonts w:hint="eastAsia"/>
+              </w:rPr>
+              <w:t>三</w:t>
+            </w:r>
+            <w:r>
+              <w:rPr>
+                <w:rFonts w:hint="eastAsia"/>
+              </w:rPr>
+              <w:t>)</w:t>
+            </w:r>
+          </w:p>
+        </w:tc>
+        <w:tc>
+          <w:tcPr>
+            <w:tcW w:w="0" w:type="auto"/>
+          </w:tcPr>
+          <w:p>
+            <w:pPr>
+              <w:pStyle w:val="ListParagraph"/>
+              <w:numPr>
+                <w:ilvl w:val="0"/>
+                <w:numId w:val="1"/>
+              </w:numPr>
+              <w:ind w:left="360"/>
+            </w:pPr>
+          </w:p>
+        </w:tc>
+      </w:tr>
+      <w:tr>
+        <w:tc>
+          <w:tcPr>
+            <w:tcW w:w="0" w:type="auto"/>
+            <w:vMerge/>
+            <w:vAlign w:val="center"/>
+          </w:tcPr>
+          <w:p>
+            <w:pPr>
+              <w:jc w:val="center"/>
+            </w:pPr>
+          </w:p>
+        </w:tc>
+        <w:tc>
+          <w:tcPr>
+            <w:tcW w:w="0" w:type="auto"/>
+            <w:vAlign w:val="center"/>
+          </w:tcPr>
+          <w:p>
+            <w:pPr>
+              <w:jc w:val="center"/>
+            </w:pPr>
+            <w:r>
+              <w:t>2026</w:t>
+            </w:r>
+            <w:r>
+              <w:rPr>
+                <w:rFonts w:hint="eastAsia"/>
+              </w:rPr>
+              <w:t>/</w:t>
+            </w:r>
+            <w:r>
+              <w:t>05</w:t>
+            </w:r>
+            <w:r>
+              <w:rPr>
+                <w:rFonts w:hint="eastAsia"/>
+              </w:rPr>
+              <w:t>/</w:t>
+            </w:r>
+            <w:r>
+              <w:t>28</w:t>
+            </w:r>
+          </w:p>
+        </w:tc>
+        <w:tc>
+          <w:tcPr>
+            <w:tcW w:w="0" w:type="auto"/>
+            <w:vAlign w:val="center"/>
+          </w:tcPr>
+          <w:p>
+            <w:pPr>
+              <w:jc w:val="center"/>
+            </w:pPr>
+            <w:r>
+              <w:rPr>
+                <w:rFonts w:hint="eastAsia"/>
+              </w:rPr>
+              <w:t>(</w:t>
+            </w:r>
+            <w:r>
+              <w:rPr>
+                <w:rFonts w:hint="eastAsia"/>
+              </w:rPr>
+              <w:t>四</w:t>
+            </w:r>
+            <w:r>
+              <w:rPr>
+                <w:rFonts w:hint="eastAsia"/>
+              </w:rPr>
+              <w:t>)</w:t>
+            </w:r>
+          </w:p>
+        </w:tc>
+        <w:tc>
+          <w:tcPr>
+            <w:tcW w:w="0" w:type="auto"/>
+          </w:tcPr>
+          <w:p>
+            <w:pPr>
+              <w:pStyle w:val="ListParagraph"/>
+              <w:numPr>
+                <w:ilvl w:val="0"/>
+                <w:numId w:val="1"/>
+              </w:numPr>
+              <w:ind w:left="360"/>
+            </w:pPr>
+          </w:p>
+        </w:tc>
+      </w:tr>
+      <w:tr>
+        <w:tc>
+          <w:tcPr>
+            <w:tcW w:w="0" w:type="auto"/>
+            <w:vMerge/>
+            <w:vAlign w:val="center"/>
+          </w:tcPr>
+          <w:p>
+            <w:pPr>
+              <w:jc w:val="center"/>
+            </w:pPr>
+          </w:p>
+        </w:tc>
+        <w:tc>
+          <w:tcPr>
+            <w:tcW w:w="0" w:type="auto"/>
+            <w:vAlign w:val="center"/>
+          </w:tcPr>
+          <w:p>
+            <w:pPr>
+              <w:jc w:val="center"/>
+            </w:pPr>
+            <w:r>
+              <w:t>2026</w:t>
+            </w:r>
+            <w:r>
+              <w:rPr>
+                <w:rFonts w:hint="eastAsia"/>
+              </w:rPr>
+              <w:t>/</w:t>
+            </w:r>
+            <w:r>
+              <w:t>05</w:t>
+            </w:r>
+            <w:r>
+              <w:rPr>
+                <w:rFonts w:hint="eastAsia"/>
+              </w:rPr>
+              <w:t>/</w:t>
+            </w:r>
+            <w:r>
+              <w:t>29</w:t>
             </w:r>
           </w:p>
         </w:tc>

</xml_diff>

<commit_message>
add 20260525-20260529 Internship Report
</commit_message>
<xml_diff>
--- a/周子用-實習報告.docx
+++ b/周子用-實習報告.docx
@@ -7285,6 +7285,31 @@
               </w:numPr>
               <w:ind w:left="360"/>
             </w:pPr>
+            <w:r>
+              <w:t>Meeting</w:t>
+            </w:r>
+            <w:r>
+              <w:t>.</w:t>
+            </w:r>
+          </w:p>
+          <w:p>
+            <w:pPr>
+              <w:pStyle w:val="ListParagraph"/>
+              <w:numPr>
+                <w:ilvl w:val="0"/>
+                <w:numId w:val="1"/>
+              </w:numPr>
+              <w:ind w:left="360"/>
+            </w:pPr>
+            <w:r>
+              <w:t>Self-Learning Company Project System</w:t>
+            </w:r>
+            <w:r>
+              <w:rPr>
+                <w:rFonts w:hint="eastAsia"/>
+              </w:rPr>
+              <w:t>.</w:t>
+            </w:r>
           </w:p>
         </w:tc>
       </w:tr>
@@ -7375,6 +7400,15 @@
               </w:numPr>
               <w:ind w:left="360"/>
             </w:pPr>
+            <w:r>
+              <w:t>Self-Learning Company Project System</w:t>
+            </w:r>
+            <w:r>
+              <w:rPr>
+                <w:rFonts w:hint="eastAsia"/>
+              </w:rPr>
+              <w:t>.</w:t>
+            </w:r>
           </w:p>
         </w:tc>
       </w:tr>
@@ -7465,6 +7499,22 @@
               </w:numPr>
               <w:ind w:left="360"/>
             </w:pPr>
+            <w:r>
+              <w:t>Meeting.</w:t>
+            </w:r>
+          </w:p>
+          <w:p>
+            <w:pPr>
+              <w:pStyle w:val="ListParagraph"/>
+              <w:numPr>
+                <w:ilvl w:val="0"/>
+                <w:numId w:val="1"/>
+              </w:numPr>
+              <w:ind w:left="360"/>
+            </w:pPr>
+            <w:r>
+              <w:t>Test the Tourmap payment.</w:t>
+            </w:r>
           </w:p>
         </w:tc>
       </w:tr>
@@ -7553,8 +7603,56 @@
                 <w:ilvl w:val="0"/>
                 <w:numId w:val="1"/>
               </w:numPr>
-              <w:ind w:left="360"/>
-            </w:pPr>
+              <w:spacing w:after="160" w:line="259" w:lineRule="auto"/>
+              <w:ind w:left="360"/>
+            </w:pPr>
+            <w:r>
+              <w:t>Join the In-class session course.</w:t>
+            </w:r>
+          </w:p>
+          <w:p>
+            <w:pPr>
+              <w:pStyle w:val="ListParagraph"/>
+              <w:numPr>
+                <w:ilvl w:val="0"/>
+                <w:numId w:val="1"/>
+              </w:numPr>
+              <w:ind w:left="360"/>
+            </w:pPr>
+            <w:r>
+              <w:t xml:space="preserve">Run the </w:t>
+            </w:r>
+            <w:r>
+              <w:t>E</w:t>
+            </w:r>
+            <w:r>
+              <w:t>2</w:t>
+            </w:r>
+            <w:r>
+              <w:t>E</w:t>
+            </w:r>
+            <w:r>
+              <w:t xml:space="preserve"> test</w:t>
+            </w:r>
+            <w:r>
+              <w:t>ing</w:t>
+            </w:r>
+            <w:r>
+              <w:t>.</w:t>
+            </w:r>
+          </w:p>
+          <w:p>
+            <w:pPr>
+              <w:pStyle w:val="ListParagraph"/>
+              <w:numPr>
+                <w:ilvl w:val="0"/>
+                <w:numId w:val="1"/>
+              </w:numPr>
+              <w:ind w:left="360"/>
+            </w:pPr>
+            <w:r>
+              <w:t>Test the Tourmap payment.</w:t>
+            </w:r>
           </w:p>
         </w:tc>
       </w:tr>
@@ -7631,8 +7729,44 @@
                 <w:ilvl w:val="0"/>
                 <w:numId w:val="1"/>
               </w:numPr>
-              <w:ind w:left="360"/>
-            </w:pPr>
+              <w:spacing w:after="160" w:line="259" w:lineRule="auto"/>
+              <w:ind w:left="360"/>
+            </w:pPr>
+            <w:r>
+              <w:t>Run the E2E testing.</w:t>
+            </w:r>
+          </w:p>
+          <w:p>
+            <w:pPr>
+              <w:pStyle w:val="ListParagraph"/>
+              <w:numPr>
+                <w:ilvl w:val="0"/>
+                <w:numId w:val="1"/>
+              </w:numPr>
+              <w:ind w:left="360"/>
+            </w:pPr>
+            <w:r>
+              <w:t>Test the Tourmap payment.</w:t>
+            </w:r>
+          </w:p>
+          <w:p>
+            <w:pPr>
+              <w:pStyle w:val="ListParagraph"/>
+              <w:numPr>
+                <w:ilvl w:val="0"/>
+                <w:numId w:val="1"/>
+              </w:numPr>
+              <w:ind w:left="360"/>
+            </w:pPr>
+            <w:r>
+              <w:t>Self-Learning Company Project System</w:t>
+            </w:r>
+            <w:r>
+              <w:rPr>
+                <w:rFonts w:hint="eastAsia"/>
+              </w:rPr>
+              <w:t>.</w:t>
+            </w:r>
           </w:p>
         </w:tc>
       </w:tr>

</xml_diff>

<commit_message>
add 20260601-20260612 Internship Report
</commit_message>
<xml_diff>
--- a/周子用-實習報告.docx
+++ b/周子用-實習報告.docx
@@ -859,8 +859,13 @@
             <w:r>
               <w:t>ls.</w:t>
             </w:r>
-            <w:r>
-              <w:br/>
+          </w:p>
+          <w:p>
+            <w:pPr>
+              <w:pStyle w:val="ListParagraph"/>
+              <w:ind w:left="1080"/>
+            </w:pPr>
+            <w:r>
               <w:t>(</w:t>
             </w:r>
             <w:r>
@@ -7766,6 +7771,1096 @@
                 <w:rFonts w:hint="eastAsia"/>
               </w:rPr>
               <w:t>.</w:t>
+            </w:r>
+          </w:p>
+        </w:tc>
+      </w:tr>
+      <w:tr>
+        <w:tc>
+          <w:tcPr>
+            <w:tcW w:w="0" w:type="auto"/>
+            <w:vMerge w:val="restart"/>
+            <w:vAlign w:val="center"/>
+          </w:tcPr>
+          <w:p>
+            <w:pPr>
+              <w:jc w:val="center"/>
+            </w:pPr>
+            <w:r>
+              <w:rPr>
+                <w:rFonts w:hint="eastAsia"/>
+              </w:rPr>
+              <w:t>十四</w:t>
+            </w:r>
+          </w:p>
+        </w:tc>
+        <w:tc>
+          <w:tcPr>
+            <w:tcW w:w="0" w:type="auto"/>
+            <w:vAlign w:val="center"/>
+          </w:tcPr>
+          <w:p>
+            <w:pPr>
+              <w:jc w:val="center"/>
+            </w:pPr>
+            <w:r>
+              <w:t>2026</w:t>
+            </w:r>
+            <w:r>
+              <w:rPr>
+                <w:rFonts w:hint="eastAsia"/>
+              </w:rPr>
+              <w:t>/</w:t>
+            </w:r>
+            <w:r>
+              <w:t>06</w:t>
+            </w:r>
+            <w:r>
+              <w:rPr>
+                <w:rFonts w:hint="eastAsia"/>
+              </w:rPr>
+              <w:t>/</w:t>
+            </w:r>
+            <w:r>
+              <w:t>01</w:t>
+            </w:r>
+          </w:p>
+        </w:tc>
+        <w:tc>
+          <w:tcPr>
+            <w:tcW w:w="0" w:type="auto"/>
+            <w:vAlign w:val="center"/>
+          </w:tcPr>
+          <w:p>
+            <w:pPr>
+              <w:jc w:val="center"/>
+            </w:pPr>
+            <w:r>
+              <w:t>(</w:t>
+            </w:r>
+            <w:r>
+              <w:rPr>
+                <w:rFonts w:hint="eastAsia"/>
+              </w:rPr>
+              <w:t>一</w:t>
+            </w:r>
+            <w:r>
+              <w:t>)</w:t>
+            </w:r>
+          </w:p>
+        </w:tc>
+        <w:tc>
+          <w:tcPr>
+            <w:tcW w:w="0" w:type="auto"/>
+          </w:tcPr>
+          <w:p>
+            <w:pPr>
+              <w:pStyle w:val="ListParagraph"/>
+              <w:numPr>
+                <w:ilvl w:val="0"/>
+                <w:numId w:val="1"/>
+              </w:numPr>
+              <w:spacing w:after="160" w:line="259" w:lineRule="auto"/>
+              <w:ind w:left="360"/>
+            </w:pPr>
+            <w:r>
+              <w:t>Test the Tourmap payment.</w:t>
+            </w:r>
+          </w:p>
+          <w:p>
+            <w:pPr>
+              <w:pStyle w:val="ListParagraph"/>
+              <w:numPr>
+                <w:ilvl w:val="0"/>
+                <w:numId w:val="1"/>
+              </w:numPr>
+              <w:spacing w:after="160" w:line="259" w:lineRule="auto"/>
+              <w:ind w:left="360"/>
+            </w:pPr>
+            <w:r>
+              <w:t>Run the E2E testing.</w:t>
+            </w:r>
+          </w:p>
+          <w:p>
+            <w:pPr>
+              <w:pStyle w:val="ListParagraph"/>
+              <w:numPr>
+                <w:ilvl w:val="0"/>
+                <w:numId w:val="1"/>
+              </w:numPr>
+              <w:ind w:left="360"/>
+            </w:pPr>
+            <w:r>
+              <w:t>List the Github Issues.</w:t>
+            </w:r>
+          </w:p>
+        </w:tc>
+      </w:tr>
+      <w:tr>
+        <w:tc>
+          <w:tcPr>
+            <w:tcW w:w="0" w:type="auto"/>
+            <w:vMerge/>
+            <w:vAlign w:val="center"/>
+          </w:tcPr>
+          <w:p>
+            <w:pPr>
+              <w:jc w:val="center"/>
+            </w:pPr>
+          </w:p>
+        </w:tc>
+        <w:tc>
+          <w:tcPr>
+            <w:tcW w:w="0" w:type="auto"/>
+            <w:vAlign w:val="center"/>
+          </w:tcPr>
+          <w:p>
+            <w:pPr>
+              <w:jc w:val="center"/>
+            </w:pPr>
+            <w:r>
+              <w:t>2026</w:t>
+            </w:r>
+            <w:r>
+              <w:rPr>
+                <w:rFonts w:hint="eastAsia"/>
+              </w:rPr>
+              <w:t>/</w:t>
+            </w:r>
+            <w:r>
+              <w:t>06</w:t>
+            </w:r>
+            <w:r>
+              <w:rPr>
+                <w:rFonts w:hint="eastAsia"/>
+              </w:rPr>
+              <w:t>/</w:t>
+            </w:r>
+            <w:r>
+              <w:t>02</w:t>
+            </w:r>
+          </w:p>
+        </w:tc>
+        <w:tc>
+          <w:tcPr>
+            <w:tcW w:w="0" w:type="auto"/>
+            <w:vAlign w:val="center"/>
+          </w:tcPr>
+          <w:p>
+            <w:pPr>
+              <w:jc w:val="center"/>
+            </w:pPr>
+            <w:r>
+              <w:rPr>
+                <w:rFonts w:hint="eastAsia"/>
+              </w:rPr>
+              <w:t>(</w:t>
+            </w:r>
+            <w:r>
+              <w:rPr>
+                <w:rFonts w:hint="eastAsia"/>
+              </w:rPr>
+              <w:t>二</w:t>
+            </w:r>
+            <w:r>
+              <w:rPr>
+                <w:rFonts w:hint="eastAsia"/>
+              </w:rPr>
+              <w:t>)</w:t>
+            </w:r>
+          </w:p>
+        </w:tc>
+        <w:tc>
+          <w:tcPr>
+            <w:tcW w:w="0" w:type="auto"/>
+          </w:tcPr>
+          <w:p>
+            <w:pPr>
+              <w:pStyle w:val="ListParagraph"/>
+              <w:numPr>
+                <w:ilvl w:val="0"/>
+                <w:numId w:val="1"/>
+              </w:numPr>
+              <w:spacing w:after="160" w:line="259" w:lineRule="auto"/>
+              <w:ind w:left="360"/>
+            </w:pPr>
+            <w:r>
+              <w:t>Test the Tourmap payment.</w:t>
+            </w:r>
+          </w:p>
+          <w:p>
+            <w:pPr>
+              <w:pStyle w:val="ListParagraph"/>
+              <w:numPr>
+                <w:ilvl w:val="0"/>
+                <w:numId w:val="1"/>
+              </w:numPr>
+              <w:spacing w:line="259" w:lineRule="auto"/>
+              <w:ind w:left="360"/>
+            </w:pPr>
+            <w:r>
+              <w:t>Run the E2E testing.</w:t>
+            </w:r>
+          </w:p>
+        </w:tc>
+      </w:tr>
+      <w:tr>
+        <w:tc>
+          <w:tcPr>
+            <w:tcW w:w="0" w:type="auto"/>
+            <w:vMerge/>
+            <w:vAlign w:val="center"/>
+          </w:tcPr>
+          <w:p>
+            <w:pPr>
+              <w:jc w:val="center"/>
+            </w:pPr>
+          </w:p>
+        </w:tc>
+        <w:tc>
+          <w:tcPr>
+            <w:tcW w:w="0" w:type="auto"/>
+            <w:vAlign w:val="center"/>
+          </w:tcPr>
+          <w:p>
+            <w:pPr>
+              <w:jc w:val="center"/>
+            </w:pPr>
+            <w:r>
+              <w:t>2026</w:t>
+            </w:r>
+            <w:r>
+              <w:rPr>
+                <w:rFonts w:hint="eastAsia"/>
+              </w:rPr>
+              <w:t>/</w:t>
+            </w:r>
+            <w:r>
+              <w:t>06</w:t>
+            </w:r>
+            <w:r>
+              <w:rPr>
+                <w:rFonts w:hint="eastAsia"/>
+              </w:rPr>
+              <w:t>/</w:t>
+            </w:r>
+            <w:r>
+              <w:t>03</w:t>
+            </w:r>
+          </w:p>
+        </w:tc>
+        <w:tc>
+          <w:tcPr>
+            <w:tcW w:w="0" w:type="auto"/>
+            <w:vAlign w:val="center"/>
+          </w:tcPr>
+          <w:p>
+            <w:pPr>
+              <w:jc w:val="center"/>
+            </w:pPr>
+            <w:r>
+              <w:rPr>
+                <w:rFonts w:hint="eastAsia"/>
+              </w:rPr>
+              <w:t>(</w:t>
+            </w:r>
+            <w:r>
+              <w:rPr>
+                <w:rFonts w:hint="eastAsia"/>
+              </w:rPr>
+              <w:t>三</w:t>
+            </w:r>
+            <w:r>
+              <w:rPr>
+                <w:rFonts w:hint="eastAsia"/>
+              </w:rPr>
+              <w:t>)</w:t>
+            </w:r>
+          </w:p>
+        </w:tc>
+        <w:tc>
+          <w:tcPr>
+            <w:tcW w:w="0" w:type="auto"/>
+          </w:tcPr>
+          <w:p>
+            <w:pPr>
+              <w:pStyle w:val="ListParagraph"/>
+              <w:numPr>
+                <w:ilvl w:val="0"/>
+                <w:numId w:val="1"/>
+              </w:numPr>
+              <w:ind w:left="360"/>
+            </w:pPr>
+            <w:r>
+              <w:t>Self-Learning Company Project System</w:t>
+            </w:r>
+            <w:r>
+              <w:rPr>
+                <w:rFonts w:hint="eastAsia"/>
+              </w:rPr>
+              <w:t>.</w:t>
+            </w:r>
+          </w:p>
+          <w:p>
+            <w:pPr>
+              <w:pStyle w:val="ListParagraph"/>
+              <w:numPr>
+                <w:ilvl w:val="0"/>
+                <w:numId w:val="1"/>
+              </w:numPr>
+              <w:ind w:left="360"/>
+            </w:pPr>
+            <w:r>
+              <w:t>Maintain Tourmap web system data.</w:t>
+            </w:r>
+          </w:p>
+        </w:tc>
+      </w:tr>
+      <w:tr>
+        <w:tc>
+          <w:tcPr>
+            <w:tcW w:w="0" w:type="auto"/>
+            <w:vMerge/>
+            <w:vAlign w:val="center"/>
+          </w:tcPr>
+          <w:p>
+            <w:pPr>
+              <w:jc w:val="center"/>
+            </w:pPr>
+          </w:p>
+        </w:tc>
+        <w:tc>
+          <w:tcPr>
+            <w:tcW w:w="0" w:type="auto"/>
+            <w:vAlign w:val="center"/>
+          </w:tcPr>
+          <w:p>
+            <w:pPr>
+              <w:jc w:val="center"/>
+            </w:pPr>
+            <w:r>
+              <w:t>2026</w:t>
+            </w:r>
+            <w:r>
+              <w:rPr>
+                <w:rFonts w:hint="eastAsia"/>
+              </w:rPr>
+              <w:t>/</w:t>
+            </w:r>
+            <w:r>
+              <w:t>06</w:t>
+            </w:r>
+            <w:r>
+              <w:rPr>
+                <w:rFonts w:hint="eastAsia"/>
+              </w:rPr>
+              <w:t>/</w:t>
+            </w:r>
+            <w:r>
+              <w:t>04</w:t>
+            </w:r>
+          </w:p>
+        </w:tc>
+        <w:tc>
+          <w:tcPr>
+            <w:tcW w:w="0" w:type="auto"/>
+            <w:vAlign w:val="center"/>
+          </w:tcPr>
+          <w:p>
+            <w:pPr>
+              <w:jc w:val="center"/>
+            </w:pPr>
+            <w:r>
+              <w:rPr>
+                <w:rFonts w:hint="eastAsia"/>
+              </w:rPr>
+              <w:t>(</w:t>
+            </w:r>
+            <w:r>
+              <w:rPr>
+                <w:rFonts w:hint="eastAsia"/>
+              </w:rPr>
+              <w:t>四</w:t>
+            </w:r>
+            <w:r>
+              <w:rPr>
+                <w:rFonts w:hint="eastAsia"/>
+              </w:rPr>
+              <w:t>)</w:t>
+            </w:r>
+          </w:p>
+        </w:tc>
+        <w:tc>
+          <w:tcPr>
+            <w:tcW w:w="0" w:type="auto"/>
+          </w:tcPr>
+          <w:p>
+            <w:pPr>
+              <w:pStyle w:val="ListParagraph"/>
+              <w:numPr>
+                <w:ilvl w:val="0"/>
+                <w:numId w:val="1"/>
+              </w:numPr>
+              <w:spacing w:after="160" w:line="259" w:lineRule="auto"/>
+              <w:ind w:left="360"/>
+            </w:pPr>
+            <w:r>
+              <w:t>Join the In-class session course.</w:t>
+            </w:r>
+          </w:p>
+          <w:p>
+            <w:pPr>
+              <w:pStyle w:val="ListParagraph"/>
+              <w:numPr>
+                <w:ilvl w:val="0"/>
+                <w:numId w:val="1"/>
+              </w:numPr>
+              <w:spacing w:line="259" w:lineRule="auto"/>
+              <w:ind w:left="360"/>
+            </w:pPr>
+            <w:r>
+              <w:t>Run the E2E testing.</w:t>
+            </w:r>
+          </w:p>
+          <w:p>
+            <w:pPr>
+              <w:pStyle w:val="ListParagraph"/>
+              <w:numPr>
+                <w:ilvl w:val="0"/>
+                <w:numId w:val="1"/>
+              </w:numPr>
+              <w:spacing w:line="259" w:lineRule="auto"/>
+              <w:ind w:left="360"/>
+            </w:pPr>
+            <w:r>
+              <w:t>Maintain Tourmap web system data.</w:t>
+            </w:r>
+          </w:p>
+        </w:tc>
+      </w:tr>
+      <w:tr>
+        <w:tc>
+          <w:tcPr>
+            <w:tcW w:w="0" w:type="auto"/>
+            <w:vMerge/>
+            <w:vAlign w:val="center"/>
+          </w:tcPr>
+          <w:p>
+            <w:pPr>
+              <w:jc w:val="center"/>
+            </w:pPr>
+          </w:p>
+        </w:tc>
+        <w:tc>
+          <w:tcPr>
+            <w:tcW w:w="0" w:type="auto"/>
+            <w:vAlign w:val="center"/>
+          </w:tcPr>
+          <w:p>
+            <w:pPr>
+              <w:jc w:val="center"/>
+            </w:pPr>
+            <w:r>
+              <w:t>2026</w:t>
+            </w:r>
+            <w:r>
+              <w:rPr>
+                <w:rFonts w:hint="eastAsia"/>
+              </w:rPr>
+              <w:t>/</w:t>
+            </w:r>
+            <w:r>
+              <w:t>06</w:t>
+            </w:r>
+            <w:r>
+              <w:rPr>
+                <w:rFonts w:hint="eastAsia"/>
+              </w:rPr>
+              <w:t>/</w:t>
+            </w:r>
+            <w:r>
+              <w:t>05</w:t>
+            </w:r>
+          </w:p>
+        </w:tc>
+        <w:tc>
+          <w:tcPr>
+            <w:tcW w:w="0" w:type="auto"/>
+            <w:vAlign w:val="center"/>
+          </w:tcPr>
+          <w:p>
+            <w:pPr>
+              <w:jc w:val="center"/>
+            </w:pPr>
+            <w:r>
+              <w:rPr>
+                <w:rFonts w:hint="eastAsia"/>
+              </w:rPr>
+              <w:t>（五）</w:t>
+            </w:r>
+          </w:p>
+        </w:tc>
+        <w:tc>
+          <w:tcPr>
+            <w:tcW w:w="0" w:type="auto"/>
+          </w:tcPr>
+          <w:p>
+            <w:pPr>
+              <w:pStyle w:val="ListParagraph"/>
+              <w:numPr>
+                <w:ilvl w:val="0"/>
+                <w:numId w:val="1"/>
+              </w:numPr>
+              <w:ind w:left="360"/>
+            </w:pPr>
+            <w:r>
+              <w:t>Run the E2E testing.</w:t>
+            </w:r>
+          </w:p>
+          <w:p>
+            <w:pPr>
+              <w:pStyle w:val="ListParagraph"/>
+              <w:numPr>
+                <w:ilvl w:val="0"/>
+                <w:numId w:val="1"/>
+              </w:numPr>
+              <w:ind w:left="360"/>
+            </w:pPr>
+            <w:r>
+              <w:t>Maintain Tourmap web system data.</w:t>
+            </w:r>
+          </w:p>
+          <w:p>
+            <w:pPr>
+              <w:pStyle w:val="ListParagraph"/>
+              <w:numPr>
+                <w:ilvl w:val="0"/>
+                <w:numId w:val="1"/>
+              </w:numPr>
+              <w:ind w:left="360"/>
+            </w:pPr>
+            <w:r>
+              <w:t>Self-Learning Company Project System</w:t>
+            </w:r>
+            <w:r>
+              <w:rPr>
+                <w:rFonts w:hint="eastAsia"/>
+              </w:rPr>
+              <w:t>.</w:t>
+            </w:r>
+          </w:p>
+        </w:tc>
+      </w:tr>
+      <w:tr>
+        <w:tc>
+          <w:tcPr>
+            <w:tcW w:w="0" w:type="auto"/>
+            <w:vMerge w:val="restart"/>
+            <w:vAlign w:val="center"/>
+          </w:tcPr>
+          <w:p>
+            <w:pPr>
+              <w:jc w:val="center"/>
+            </w:pPr>
+            <w:r>
+              <w:rPr>
+                <w:rFonts w:hint="eastAsia"/>
+              </w:rPr>
+              <w:t>十</w:t>
+            </w:r>
+            <w:r>
+              <w:rPr>
+                <w:rFonts w:hint="eastAsia"/>
+              </w:rPr>
+              <w:t>伍</w:t>
+            </w:r>
+          </w:p>
+        </w:tc>
+        <w:tc>
+          <w:tcPr>
+            <w:tcW w:w="0" w:type="auto"/>
+            <w:vAlign w:val="center"/>
+          </w:tcPr>
+          <w:p>
+            <w:pPr>
+              <w:jc w:val="center"/>
+            </w:pPr>
+            <w:r>
+              <w:t>2026</w:t>
+            </w:r>
+            <w:r>
+              <w:rPr>
+                <w:rFonts w:hint="eastAsia"/>
+              </w:rPr>
+              <w:t>/</w:t>
+            </w:r>
+            <w:r>
+              <w:t>06</w:t>
+            </w:r>
+            <w:r>
+              <w:rPr>
+                <w:rFonts w:hint="eastAsia"/>
+              </w:rPr>
+              <w:t>/</w:t>
+            </w:r>
+            <w:r>
+              <w:t>08</w:t>
+            </w:r>
+          </w:p>
+        </w:tc>
+        <w:tc>
+          <w:tcPr>
+            <w:tcW w:w="0" w:type="auto"/>
+            <w:vAlign w:val="center"/>
+          </w:tcPr>
+          <w:p>
+            <w:pPr>
+              <w:jc w:val="center"/>
+            </w:pPr>
+            <w:r>
+              <w:t>(</w:t>
+            </w:r>
+            <w:r>
+              <w:rPr>
+                <w:rFonts w:hint="eastAsia"/>
+              </w:rPr>
+              <w:t>一</w:t>
+            </w:r>
+            <w:r>
+              <w:t>)</w:t>
+            </w:r>
+          </w:p>
+        </w:tc>
+        <w:tc>
+          <w:tcPr>
+            <w:tcW w:w="0" w:type="auto"/>
+          </w:tcPr>
+          <w:p>
+            <w:pPr>
+              <w:pStyle w:val="ListParagraph"/>
+              <w:numPr>
+                <w:ilvl w:val="0"/>
+                <w:numId w:val="1"/>
+              </w:numPr>
+              <w:ind w:left="360"/>
+            </w:pPr>
+            <w:r>
+              <w:t>Maintain Tourmap web system data.</w:t>
+            </w:r>
+          </w:p>
+        </w:tc>
+      </w:tr>
+      <w:tr>
+        <w:tc>
+          <w:tcPr>
+            <w:tcW w:w="0" w:type="auto"/>
+            <w:vMerge/>
+            <w:vAlign w:val="center"/>
+          </w:tcPr>
+          <w:p>
+            <w:pPr>
+              <w:jc w:val="center"/>
+            </w:pPr>
+          </w:p>
+        </w:tc>
+        <w:tc>
+          <w:tcPr>
+            <w:tcW w:w="0" w:type="auto"/>
+            <w:vAlign w:val="center"/>
+          </w:tcPr>
+          <w:p>
+            <w:pPr>
+              <w:jc w:val="center"/>
+            </w:pPr>
+            <w:r>
+              <w:t>2026</w:t>
+            </w:r>
+            <w:r>
+              <w:rPr>
+                <w:rFonts w:hint="eastAsia"/>
+              </w:rPr>
+              <w:t>/</w:t>
+            </w:r>
+            <w:r>
+              <w:t>06</w:t>
+            </w:r>
+            <w:r>
+              <w:rPr>
+                <w:rFonts w:hint="eastAsia"/>
+              </w:rPr>
+              <w:t>/</w:t>
+            </w:r>
+            <w:r>
+              <w:t>09</w:t>
+            </w:r>
+          </w:p>
+        </w:tc>
+        <w:tc>
+          <w:tcPr>
+            <w:tcW w:w="0" w:type="auto"/>
+            <w:vAlign w:val="center"/>
+          </w:tcPr>
+          <w:p>
+            <w:pPr>
+              <w:jc w:val="center"/>
+            </w:pPr>
+            <w:r>
+              <w:rPr>
+                <w:rFonts w:hint="eastAsia"/>
+              </w:rPr>
+              <w:t>(</w:t>
+            </w:r>
+            <w:r>
+              <w:rPr>
+                <w:rFonts w:hint="eastAsia"/>
+              </w:rPr>
+              <w:t>二</w:t>
+            </w:r>
+            <w:r>
+              <w:rPr>
+                <w:rFonts w:hint="eastAsia"/>
+              </w:rPr>
+              <w:t>)</w:t>
+            </w:r>
+          </w:p>
+        </w:tc>
+        <w:tc>
+          <w:tcPr>
+            <w:tcW w:w="0" w:type="auto"/>
+          </w:tcPr>
+          <w:p>
+            <w:pPr>
+              <w:pStyle w:val="ListParagraph"/>
+              <w:numPr>
+                <w:ilvl w:val="0"/>
+                <w:numId w:val="1"/>
+              </w:numPr>
+              <w:ind w:left="360"/>
+            </w:pPr>
+            <w:r>
+              <w:t>Meeting.</w:t>
+            </w:r>
+          </w:p>
+          <w:p>
+            <w:pPr>
+              <w:pStyle w:val="ListParagraph"/>
+              <w:numPr>
+                <w:ilvl w:val="0"/>
+                <w:numId w:val="1"/>
+              </w:numPr>
+              <w:ind w:left="360"/>
+            </w:pPr>
+            <w:r>
+              <w:t>Searching</w:t>
+            </w:r>
+            <w:r>
+              <w:t xml:space="preserve"> </w:t>
+            </w:r>
+            <w:r>
+              <w:t xml:space="preserve">related </w:t>
+            </w:r>
+            <w:r>
+              <w:t>papers.</w:t>
+            </w:r>
+          </w:p>
+        </w:tc>
+      </w:tr>
+      <w:tr>
+        <w:tc>
+          <w:tcPr>
+            <w:tcW w:w="0" w:type="auto"/>
+            <w:vMerge/>
+            <w:vAlign w:val="center"/>
+          </w:tcPr>
+          <w:p>
+            <w:pPr>
+              <w:jc w:val="center"/>
+            </w:pPr>
+          </w:p>
+        </w:tc>
+        <w:tc>
+          <w:tcPr>
+            <w:tcW w:w="0" w:type="auto"/>
+            <w:vAlign w:val="center"/>
+          </w:tcPr>
+          <w:p>
+            <w:pPr>
+              <w:jc w:val="center"/>
+            </w:pPr>
+            <w:r>
+              <w:t>2026</w:t>
+            </w:r>
+            <w:r>
+              <w:rPr>
+                <w:rFonts w:hint="eastAsia"/>
+              </w:rPr>
+              <w:t>/</w:t>
+            </w:r>
+            <w:r>
+              <w:t>06</w:t>
+            </w:r>
+            <w:r>
+              <w:rPr>
+                <w:rFonts w:hint="eastAsia"/>
+              </w:rPr>
+              <w:t>/</w:t>
+            </w:r>
+            <w:r>
+              <w:t>10</w:t>
+            </w:r>
+          </w:p>
+        </w:tc>
+        <w:tc>
+          <w:tcPr>
+            <w:tcW w:w="0" w:type="auto"/>
+            <w:vAlign w:val="center"/>
+          </w:tcPr>
+          <w:p>
+            <w:pPr>
+              <w:jc w:val="center"/>
+            </w:pPr>
+            <w:r>
+              <w:rPr>
+                <w:rFonts w:hint="eastAsia"/>
+              </w:rPr>
+              <w:t>(</w:t>
+            </w:r>
+            <w:r>
+              <w:rPr>
+                <w:rFonts w:hint="eastAsia"/>
+              </w:rPr>
+              <w:t>三</w:t>
+            </w:r>
+            <w:r>
+              <w:rPr>
+                <w:rFonts w:hint="eastAsia"/>
+              </w:rPr>
+              <w:t>)</w:t>
+            </w:r>
+          </w:p>
+        </w:tc>
+        <w:tc>
+          <w:tcPr>
+            <w:tcW w:w="0" w:type="auto"/>
+          </w:tcPr>
+          <w:p>
+            <w:pPr>
+              <w:pStyle w:val="ListParagraph"/>
+              <w:numPr>
+                <w:ilvl w:val="0"/>
+                <w:numId w:val="1"/>
+              </w:numPr>
+              <w:ind w:left="360"/>
+            </w:pPr>
+            <w:r>
+              <w:t>Search</w:t>
+            </w:r>
+            <w:r>
+              <w:t>, read,</w:t>
+            </w:r>
+            <w:r>
+              <w:t xml:space="preserve"> and list </w:t>
+            </w:r>
+            <w:r>
+              <w:t xml:space="preserve">related </w:t>
+            </w:r>
+            <w:r>
+              <w:t>papers.</w:t>
+            </w:r>
+          </w:p>
+        </w:tc>
+      </w:tr>
+      <w:tr>
+        <w:tc>
+          <w:tcPr>
+            <w:tcW w:w="0" w:type="auto"/>
+            <w:vMerge/>
+            <w:vAlign w:val="center"/>
+          </w:tcPr>
+          <w:p>
+            <w:pPr>
+              <w:jc w:val="center"/>
+            </w:pPr>
+          </w:p>
+        </w:tc>
+        <w:tc>
+          <w:tcPr>
+            <w:tcW w:w="0" w:type="auto"/>
+            <w:vAlign w:val="center"/>
+          </w:tcPr>
+          <w:p>
+            <w:pPr>
+              <w:jc w:val="center"/>
+            </w:pPr>
+            <w:r>
+              <w:t>2026</w:t>
+            </w:r>
+            <w:r>
+              <w:rPr>
+                <w:rFonts w:hint="eastAsia"/>
+              </w:rPr>
+              <w:t>/</w:t>
+            </w:r>
+            <w:r>
+              <w:t>06</w:t>
+            </w:r>
+            <w:r>
+              <w:rPr>
+                <w:rFonts w:hint="eastAsia"/>
+              </w:rPr>
+              <w:t>/</w:t>
+            </w:r>
+            <w:r>
+              <w:t>11</w:t>
+            </w:r>
+          </w:p>
+        </w:tc>
+        <w:tc>
+          <w:tcPr>
+            <w:tcW w:w="0" w:type="auto"/>
+            <w:vAlign w:val="center"/>
+          </w:tcPr>
+          <w:p>
+            <w:pPr>
+              <w:jc w:val="center"/>
+            </w:pPr>
+            <w:r>
+              <w:rPr>
+                <w:rFonts w:hint="eastAsia"/>
+              </w:rPr>
+              <w:t>(</w:t>
+            </w:r>
+            <w:r>
+              <w:rPr>
+                <w:rFonts w:hint="eastAsia"/>
+              </w:rPr>
+              <w:t>四</w:t>
+            </w:r>
+            <w:r>
+              <w:rPr>
+                <w:rFonts w:hint="eastAsia"/>
+              </w:rPr>
+              <w:t>)</w:t>
+            </w:r>
+          </w:p>
+        </w:tc>
+        <w:tc>
+          <w:tcPr>
+            <w:tcW w:w="0" w:type="auto"/>
+          </w:tcPr>
+          <w:p>
+            <w:pPr>
+              <w:pStyle w:val="ListParagraph"/>
+              <w:numPr>
+                <w:ilvl w:val="0"/>
+                <w:numId w:val="1"/>
+              </w:numPr>
+              <w:ind w:left="360"/>
+            </w:pPr>
+            <w:r>
+              <w:t>Take a leave to Taipei (</w:t>
+            </w:r>
+            <w:r>
+              <w:t xml:space="preserve">Intense </w:t>
+            </w:r>
+            <w:r>
+              <w:t xml:space="preserve">Graduation Ceremony). </w:t>
+            </w:r>
+          </w:p>
+        </w:tc>
+      </w:tr>
+      <w:tr>
+        <w:tc>
+          <w:tcPr>
+            <w:tcW w:w="0" w:type="auto"/>
+            <w:vMerge/>
+            <w:vAlign w:val="center"/>
+          </w:tcPr>
+          <w:p>
+            <w:pPr>
+              <w:jc w:val="center"/>
+            </w:pPr>
+          </w:p>
+        </w:tc>
+        <w:tc>
+          <w:tcPr>
+            <w:tcW w:w="0" w:type="auto"/>
+            <w:vAlign w:val="center"/>
+          </w:tcPr>
+          <w:p>
+            <w:pPr>
+              <w:jc w:val="center"/>
+            </w:pPr>
+            <w:r>
+              <w:t>2026</w:t>
+            </w:r>
+            <w:r>
+              <w:rPr>
+                <w:rFonts w:hint="eastAsia"/>
+              </w:rPr>
+              <w:t>/</w:t>
+            </w:r>
+            <w:r>
+              <w:t>06</w:t>
+            </w:r>
+            <w:r>
+              <w:rPr>
+                <w:rFonts w:hint="eastAsia"/>
+              </w:rPr>
+              <w:t>/</w:t>
+            </w:r>
+            <w:r>
+              <w:t>12</w:t>
+            </w:r>
+          </w:p>
+        </w:tc>
+        <w:tc>
+          <w:tcPr>
+            <w:tcW w:w="0" w:type="auto"/>
+            <w:vAlign w:val="center"/>
+          </w:tcPr>
+          <w:p>
+            <w:pPr>
+              <w:jc w:val="center"/>
+            </w:pPr>
+            <w:r>
+              <w:rPr>
+                <w:rFonts w:hint="eastAsia"/>
+              </w:rPr>
+              <w:t>（五）</w:t>
+            </w:r>
+          </w:p>
+        </w:tc>
+        <w:tc>
+          <w:tcPr>
+            <w:tcW w:w="0" w:type="auto"/>
+          </w:tcPr>
+          <w:p>
+            <w:pPr>
+              <w:pStyle w:val="ListParagraph"/>
+              <w:numPr>
+                <w:ilvl w:val="0"/>
+                <w:numId w:val="1"/>
+              </w:numPr>
+              <w:ind w:left="360"/>
+            </w:pPr>
+            <w:r>
+              <w:t>T</w:t>
+            </w:r>
+            <w:r>
+              <w:rPr>
+                <w:rFonts w:hint="eastAsia"/>
+              </w:rPr>
+              <w:t>ak</w:t>
+            </w:r>
+            <w:r>
+              <w:t xml:space="preserve">e </w:t>
+            </w:r>
+            <w:r>
+              <w:t xml:space="preserve">a </w:t>
+            </w:r>
+            <w:r>
+              <w:t>leave.</w:t>
             </w:r>
           </w:p>
         </w:tc>

</xml_diff>